<commit_message>
Sync for 2027 release
</commit_message>
<xml_diff>
--- a/docs/wizards/Sage300SDK_CodeGenerationWizard.docx
+++ b/docs/wizards/Sage300SDK_CodeGenerationWizard.docx
@@ -1,6 +1,6 @@
 
 <file path=word/document.xml><?xml version="1.0" encoding="utf-8"?>
-<w:document xmlns:wpc="http://schemas.microsoft.com/office/word/2010/wordprocessingCanvas" xmlns:cx="http://schemas.microsoft.com/office/drawing/2014/chartex" xmlns:cx1="http://schemas.microsoft.com/office/drawing/2015/9/8/chartex" xmlns:cx2="http://schemas.microsoft.com/office/drawing/2015/10/21/chartex" xmlns:cx3="http://schemas.microsoft.com/office/drawing/2016/5/9/chartex" xmlns:cx4="http://schemas.microsoft.com/office/drawing/2016/5/10/chartex" xmlns:cx5="http://schemas.microsoft.com/office/drawing/2016/5/11/chartex" xmlns:cx6="http://schemas.microsoft.com/office/drawing/2016/5/12/chartex" xmlns:cx7="http://schemas.microsoft.com/office/drawing/2016/5/13/chartex" xmlns:cx8="http://schemas.microsoft.com/office/drawing/2016/5/14/chartex" xmlns:mc="http://schemas.openxmlformats.org/markup-compatibility/2006" xmlns:aink="http://schemas.microsoft.com/office/drawing/2016/ink" xmlns:am3d="http://schemas.microsoft.com/office/drawing/2017/model3d" xmlns:o="urn:schemas-microsoft-com:office:office" xmlns:oel="http://schemas.microsoft.com/office/2019/extlst" xmlns:r="http://schemas.openxmlformats.org/officeDocument/2006/relationships" xmlns:m="http://schemas.openxmlformats.org/officeDocument/2006/math" xmlns:v="urn:schemas-microsoft-com:vml" xmlns:wp14="http://schemas.microsoft.com/office/word/2010/wordprocessingDrawing" xmlns:wp="http://schemas.openxmlformats.org/drawingml/2006/wordprocessingDrawing" xmlns:w10="urn:schemas-microsoft-com:office:word" xmlns:w="http://schemas.openxmlformats.org/wordprocessingml/2006/main" xmlns:w14="http://schemas.microsoft.com/office/word/2010/wordml" xmlns:w15="http://schemas.microsoft.com/office/word/2012/wordml" xmlns:w16cex="http://schemas.microsoft.com/office/word/2018/wordml/cex" xmlns:w16cid="http://schemas.microsoft.com/office/word/2016/wordml/cid" xmlns:w16="http://schemas.microsoft.com/office/word/2018/wordml" xmlns:w16du="http://schemas.microsoft.com/office/word/2023/wordml/word16du" xmlns:w16sdtdh="http://schemas.microsoft.com/office/word/2020/wordml/sdtdatahash" xmlns:w16se="http://schemas.microsoft.com/office/word/2015/wordml/symex" xmlns:wpg="http://schemas.microsoft.com/office/word/2010/wordprocessingGroup" xmlns:wpi="http://schemas.microsoft.com/office/word/2010/wordprocessingInk" xmlns:wne="http://schemas.microsoft.com/office/word/2006/wordml" xmlns:wps="http://schemas.microsoft.com/office/word/2010/wordprocessingShape" mc:Ignorable="w14 w15 w16se w16cid w16 w16cex w16sdtdh w16du wp14">
+<w:document xmlns:wpc="http://schemas.microsoft.com/office/word/2010/wordprocessingCanvas" xmlns:cx="http://schemas.microsoft.com/office/drawing/2014/chartex" xmlns:cx1="http://schemas.microsoft.com/office/drawing/2015/9/8/chartex" xmlns:cx2="http://schemas.microsoft.com/office/drawing/2015/10/21/chartex" xmlns:cx3="http://schemas.microsoft.com/office/drawing/2016/5/9/chartex" xmlns:cx4="http://schemas.microsoft.com/office/drawing/2016/5/10/chartex" xmlns:cx5="http://schemas.microsoft.com/office/drawing/2016/5/11/chartex" xmlns:cx6="http://schemas.microsoft.com/office/drawing/2016/5/12/chartex" xmlns:cx7="http://schemas.microsoft.com/office/drawing/2016/5/13/chartex" xmlns:cx8="http://schemas.microsoft.com/office/drawing/2016/5/14/chartex" xmlns:mc="http://schemas.openxmlformats.org/markup-compatibility/2006" xmlns:aink="http://schemas.microsoft.com/office/drawing/2016/ink" xmlns:am3d="http://schemas.microsoft.com/office/drawing/2017/model3d" xmlns:o="urn:schemas-microsoft-com:office:office" xmlns:oel="http://schemas.microsoft.com/office/2019/extlst" xmlns:r="http://schemas.openxmlformats.org/officeDocument/2006/relationships" xmlns:m="http://schemas.openxmlformats.org/officeDocument/2006/math" xmlns:v="urn:schemas-microsoft-com:vml" xmlns:wp14="http://schemas.microsoft.com/office/word/2010/wordprocessingDrawing" xmlns:wp="http://schemas.openxmlformats.org/drawingml/2006/wordprocessingDrawing" xmlns:w10="urn:schemas-microsoft-com:office:word" xmlns:w="http://schemas.openxmlformats.org/wordprocessingml/2006/main" xmlns:w14="http://schemas.microsoft.com/office/word/2010/wordml" xmlns:w15="http://schemas.microsoft.com/office/word/2012/wordml" xmlns:w16cex="http://schemas.microsoft.com/office/word/2018/wordml/cex" xmlns:w16cid="http://schemas.microsoft.com/office/word/2016/wordml/cid" xmlns:w16="http://schemas.microsoft.com/office/word/2018/wordml" xmlns:w16du="http://schemas.microsoft.com/office/word/2023/wordml/word16du" xmlns:w16sdtdh="http://schemas.microsoft.com/office/word/2020/wordml/sdtdatahash" xmlns:w16sdtfl="http://schemas.microsoft.com/office/word/2024/wordml/sdtformatlock" xmlns:w16se="http://schemas.microsoft.com/office/word/2015/wordml/symex" xmlns:wpg="http://schemas.microsoft.com/office/word/2010/wordprocessingGroup" xmlns:wpi="http://schemas.microsoft.com/office/word/2010/wordprocessingInk" xmlns:wne="http://schemas.microsoft.com/office/word/2006/wordml" xmlns:wps="http://schemas.microsoft.com/office/word/2010/wordprocessingShape" mc:Ignorable="w14 w15 w16se w16cid w16 w16cex w16sdtdh w16sdtfl w16du wp14">
   <w:body>
     <w:p>
       <w:pPr>
@@ -49,10 +49,13 @@
         </w:sectPr>
       </w:pPr>
       <w:r>
-        <w:t>October</w:t>
-      </w:r>
-      <w:r>
-        <w:t xml:space="preserve"> 2024</w:t>
+        <w:t>July</w:t>
+      </w:r>
+      <w:r>
+        <w:t xml:space="preserve"> 202</w:t>
+      </w:r>
+      <w:r>
+        <w:t>6</w:t>
       </w:r>
     </w:p>
     <w:p>
@@ -75,7 +78,7 @@
         <w:t>2</w:t>
       </w:r>
       <w:r>
-        <w:t>4</w:t>
+        <w:t>6</w:t>
       </w:r>
       <w:r>
         <w:t xml:space="preserve"> </w:t>
@@ -2884,6 +2887,9 @@
       </w:r>
       <w:r>
         <w:t>22</w:t>
+      </w:r>
+      <w:r>
+        <w:t xml:space="preserve"> and 2026</w:t>
       </w:r>
       <w:r>
         <w:t>.</w:t>
@@ -3164,13 +3170,7 @@
         <w:pStyle w:val="SAGEBodyText"/>
       </w:pPr>
       <w:r>
-        <w:t xml:space="preserve">The wizard will create code files in the following projects for Web </w:t>
-      </w:r>
-      <w:r>
-        <w:t>API</w:t>
-      </w:r>
-      <w:r>
-        <w:t>:</w:t>
+        <w:t>The wizard will create code files in the following projects for Web API:</w:t>
       </w:r>
     </w:p>
     <w:p>
@@ -3301,7 +3301,7 @@
         <w:framePr w:wrap="around"/>
         <w:numPr>
           <w:ilvl w:val="0"/>
-          <w:numId w:val="51"/>
+          <w:numId w:val="25"/>
         </w:numPr>
       </w:pPr>
       <w:bookmarkStart w:id="2" w:name="_Toc80359095"/>
@@ -3321,7 +3321,13 @@
         <w:pStyle w:val="SAGEBodyText"/>
       </w:pPr>
       <w:r>
-        <w:t>The Code Generation Wizard is a Visual Studio Plugin and is compatible with Visual Studio 2022. The Sage 300 Code Generation Wizard tool is bundled with the Sage 300 Wizard Package (</w:t>
+        <w:t>The Code Generation Wizard is a Visual Studio Plugin and is compatible with Visual Studio 2022</w:t>
+      </w:r>
+      <w:r>
+        <w:t xml:space="preserve"> and 2026</w:t>
+      </w:r>
+      <w:r>
+        <w:t>. The Sage 300 Code Generation Wizard tool is bundled with the Sage 300 Wizard Package (</w:t>
       </w:r>
       <w:r>
         <w:t>Code Generation Wizard, Finder Generator, Upgrade Wizard, Language Wizard, and Sync Assemblies Wizard</w:t>
@@ -3347,15 +3353,7 @@
         <w:t>Note:</w:t>
       </w:r>
       <w:r>
-        <w:t xml:space="preserve"> If the previous Sage 300 Wizard Package is installed, it must be uninstalled first (Visual Studio - Tools, Extensions, </w:t>
-      </w:r>
-      <w:proofErr w:type="gramStart"/>
-      <w:r>
-        <w:t>Uninstall</w:t>
-      </w:r>
-      <w:proofErr w:type="gramEnd"/>
-      <w:r>
-        <w:t xml:space="preserve"> option, select the Sage 300 Wizard Package to uninstall).</w:t>
+        <w:t xml:space="preserve"> If the previous Sage 300 Wizard Package is installed, it must be uninstalled first (Visual Studio - Tools, Extensions, Uninstall option, select the Sage 300 Wizard Package to uninstall).</w:t>
       </w:r>
     </w:p>
     <w:bookmarkEnd w:id="4"/>
@@ -3377,7 +3375,7 @@
         <w:pStyle w:val="SAGENumberedList"/>
         <w:numPr>
           <w:ilvl w:val="0"/>
-          <w:numId w:val="37"/>
+          <w:numId w:val="21"/>
         </w:numPr>
         <w:ind w:left="484"/>
       </w:pPr>
@@ -3502,7 +3500,13 @@
         <w:t xml:space="preserve">d in Visual Studio </w:t>
       </w:r>
       <w:r>
-        <w:t xml:space="preserve">2022 </w:t>
+        <w:t>2022</w:t>
+      </w:r>
+      <w:r>
+        <w:t xml:space="preserve"> and 2026</w:t>
+      </w:r>
+      <w:r>
+        <w:t xml:space="preserve"> </w:t>
       </w:r>
       <w:r>
         <w:t xml:space="preserve">as a plugin. To open it, click </w:t>
@@ -3663,13 +3667,7 @@
       <w:bookmarkStart w:id="7" w:name="_Toc180178624"/>
       <w:r>
         <w:lastRenderedPageBreak/>
-        <w:t>Using the Wizard</w:t>
-      </w:r>
-      <w:r>
-        <w:t xml:space="preserve"> - </w:t>
-      </w:r>
-      <w:r>
-        <w:t>Web Solution Type Path</w:t>
+        <w:t>Using the Wizard - Web Solution Type Path</w:t>
       </w:r>
       <w:bookmarkEnd w:id="7"/>
     </w:p>
@@ -3934,7 +3932,6 @@
       <w:r>
         <w:t xml:space="preserve">Will use the </w:t>
       </w:r>
-      <w:proofErr w:type="spellStart"/>
       <w:r>
         <w:rPr>
           <w:rStyle w:val="SAGETextCodeinline"/>
@@ -3947,7 +3944,6 @@
         </w:rPr>
         <w:t>Repository</w:t>
       </w:r>
-      <w:proofErr w:type="spellEnd"/>
       <w:r>
         <w:t xml:space="preserve"> base class</w:t>
       </w:r>
@@ -4395,14 +4391,12 @@
       <w:r>
         <w:t xml:space="preserve"> to proceed or </w:t>
       </w:r>
-      <w:proofErr w:type="gramStart"/>
       <w:r>
         <w:rPr>
           <w:rStyle w:val="SAGETextUI"/>
         </w:rPr>
         <w:t>Back</w:t>
       </w:r>
-      <w:proofErr w:type="gramEnd"/>
       <w:r>
         <w:t xml:space="preserve"> to go back to the previous step.</w:t>
       </w:r>
@@ -4734,15 +4728,7 @@
         <w:t xml:space="preserve">, </w:t>
       </w:r>
       <w:r>
-        <w:t xml:space="preserve">Report definitions for Sage 300 are in INI files. Click on the magnifying glass button to display an Open File dialog to search for an existing INI </w:t>
-      </w:r>
-      <w:proofErr w:type="gramStart"/>
-      <w:r>
-        <w:t>file, or</w:t>
-      </w:r>
-      <w:proofErr w:type="gramEnd"/>
-      <w:r>
-        <w:t xml:space="preserve"> enter the file name manually. </w:t>
+        <w:t xml:space="preserve">Report definitions for Sage 300 are in INI files. Click on the magnifying glass button to display an Open File dialog to search for an existing INI file, or enter the file name manually. </w:t>
       </w:r>
     </w:p>
     <w:p>
@@ -5054,14 +5040,12 @@
       <w:r>
         <w:t xml:space="preserve"> or </w:t>
       </w:r>
-      <w:proofErr w:type="gramStart"/>
       <w:r>
         <w:rPr>
           <w:b/>
         </w:rPr>
         <w:t>Cancel</w:t>
       </w:r>
-      <w:proofErr w:type="gramEnd"/>
       <w:r>
         <w:t xml:space="preserve"> to disregard any changes</w:t>
       </w:r>
@@ -5443,14 +5427,12 @@
       <w:r>
         <w:t xml:space="preserve"> to save the entity when finished or </w:t>
       </w:r>
-      <w:proofErr w:type="gramStart"/>
       <w:r>
         <w:rPr>
           <w:b/>
         </w:rPr>
         <w:t>Cancel</w:t>
       </w:r>
-      <w:proofErr w:type="gramEnd"/>
       <w:r>
         <w:t xml:space="preserve"> to disregard any changes. </w:t>
       </w:r>
@@ -5732,14 +5714,12 @@
       <w:r>
         <w:t xml:space="preserve"> to save the entity when finished or </w:t>
       </w:r>
-      <w:proofErr w:type="gramStart"/>
       <w:r>
         <w:rPr>
           <w:b/>
         </w:rPr>
         <w:t>Cancel</w:t>
       </w:r>
-      <w:proofErr w:type="gramEnd"/>
       <w:r>
         <w:t xml:space="preserve"> to disregard any changes. </w:t>
       </w:r>
@@ -5915,15 +5895,7 @@
         </w:tabs>
       </w:pPr>
       <w:r>
-        <w:t xml:space="preserve">The compositions are defaulted to be </w:t>
-      </w:r>
-      <w:proofErr w:type="gramStart"/>
-      <w:r>
-        <w:t>included</w:t>
-      </w:r>
-      <w:proofErr w:type="gramEnd"/>
-      <w:r>
-        <w:t xml:space="preserve"> and these should be included for any header entities. </w:t>
+        <w:t xml:space="preserve">The compositions are defaulted to be included and these should be included for any header entities. </w:t>
       </w:r>
     </w:p>
     <w:p>
@@ -6080,14 +6052,12 @@
       <w:r>
         <w:t xml:space="preserve"> to save the entity when finished or </w:t>
       </w:r>
-      <w:proofErr w:type="gramStart"/>
       <w:r>
         <w:rPr>
           <w:b/>
         </w:rPr>
         <w:t>Cancel</w:t>
       </w:r>
-      <w:proofErr w:type="gramEnd"/>
       <w:r>
         <w:t xml:space="preserve"> to disregard any changes. </w:t>
       </w:r>
@@ -6176,16 +6146,11 @@
         <w:pStyle w:val="SAGEBodyText"/>
       </w:pPr>
       <w:r>
-        <w:t xml:space="preserve">For the 2022.0 release, a new step has been added to the Code Generation Wizard. This step, entitled ‘Generate a UI layout’ is used to visually layout the controls that will make up the </w:t>
-      </w:r>
-      <w:proofErr w:type="gramStart"/>
-      <w:r>
-        <w:t>page.</w:t>
+        <w:t>For the 2022.0 release, a new step has been added to the Code Generation Wizard. This step, entitled ‘Generate a UI layout’ is used to visually layout the controls that will make up the page.</w:t>
       </w:r>
       <w:r>
         <w:t>.</w:t>
       </w:r>
-      <w:proofErr w:type="gramEnd"/>
     </w:p>
     <w:p>
       <w:pPr>
@@ -6208,14 +6173,12 @@
       <w:r>
         <w:t xml:space="preserve"> to proceed or </w:t>
       </w:r>
-      <w:proofErr w:type="gramStart"/>
       <w:r>
         <w:rPr>
           <w:rStyle w:val="SAGETextUI"/>
         </w:rPr>
         <w:t>Back</w:t>
       </w:r>
-      <w:proofErr w:type="gramEnd"/>
       <w:r>
         <w:t xml:space="preserve"> to go back to the previous step.</w:t>
       </w:r>
@@ -6999,14 +6962,12 @@
       <w:r>
         <w:t xml:space="preserve"> to proceed or </w:t>
       </w:r>
-      <w:proofErr w:type="gramStart"/>
       <w:r>
         <w:rPr>
           <w:rStyle w:val="SAGETextUI"/>
         </w:rPr>
         <w:t>Back</w:t>
       </w:r>
-      <w:proofErr w:type="gramEnd"/>
       <w:r>
         <w:t xml:space="preserve"> to go back to the previous step.</w:t>
       </w:r>
@@ -7138,14 +7099,12 @@
       <w:r>
         <w:t xml:space="preserve"> to proceed or </w:t>
       </w:r>
-      <w:proofErr w:type="gramStart"/>
       <w:r>
         <w:rPr>
           <w:rStyle w:val="SAGETextUI"/>
         </w:rPr>
         <w:t>Back</w:t>
       </w:r>
-      <w:proofErr w:type="gramEnd"/>
       <w:r>
         <w:t xml:space="preserve"> to go back to the previous step.</w:t>
       </w:r>
@@ -7264,14 +7223,12 @@
       <w:r>
         <w:t xml:space="preserve"> to exit the wizard or </w:t>
       </w:r>
-      <w:proofErr w:type="gramStart"/>
       <w:r>
         <w:rPr>
           <w:rStyle w:val="SAGETextUI"/>
         </w:rPr>
         <w:t>Back</w:t>
       </w:r>
-      <w:proofErr w:type="gramEnd"/>
       <w:r>
         <w:t xml:space="preserve"> to go back to the previous step.</w:t>
       </w:r>
@@ -7350,13 +7307,7 @@
       <w:bookmarkStart w:id="18" w:name="_Toc180178635"/>
       <w:r>
         <w:lastRenderedPageBreak/>
-        <w:t xml:space="preserve">Using the Wizard - Web </w:t>
-      </w:r>
-      <w:r>
-        <w:t xml:space="preserve">API </w:t>
-      </w:r>
-      <w:r>
-        <w:t>Solution Type Path</w:t>
+        <w:t>Using the Wizard - Web API Solution Type Path</w:t>
       </w:r>
       <w:bookmarkEnd w:id="18"/>
     </w:p>
@@ -7746,14 +7697,12 @@
       <w:r>
         <w:t xml:space="preserve"> to proceed or </w:t>
       </w:r>
-      <w:proofErr w:type="gramStart"/>
       <w:r>
         <w:rPr>
           <w:rStyle w:val="SAGETextUI"/>
         </w:rPr>
         <w:t>Back</w:t>
       </w:r>
-      <w:proofErr w:type="gramEnd"/>
       <w:r>
         <w:t xml:space="preserve"> to go back to the previous step.</w:t>
       </w:r>
@@ -8144,14 +8093,12 @@
       <w:r>
         <w:t xml:space="preserve"> to save the entity when finished or </w:t>
       </w:r>
-      <w:proofErr w:type="gramStart"/>
       <w:r>
         <w:rPr>
           <w:b/>
         </w:rPr>
         <w:t>Cancel</w:t>
       </w:r>
-      <w:proofErr w:type="gramEnd"/>
       <w:r>
         <w:t xml:space="preserve"> to disregard any changes. </w:t>
       </w:r>
@@ -8175,10 +8122,7 @@
       </w:pPr>
       <w:bookmarkStart w:id="22" w:name="_Toc180178639"/>
       <w:r>
-        <w:t>Properties</w:t>
-      </w:r>
-      <w:r>
-        <w:t xml:space="preserve"> Tab</w:t>
+        <w:t>Properties Tab</w:t>
       </w:r>
       <w:bookmarkEnd w:id="22"/>
     </w:p>
@@ -8319,14 +8263,12 @@
       <w:r>
         <w:t xml:space="preserve"> to save the entity when finished or </w:t>
       </w:r>
-      <w:proofErr w:type="gramStart"/>
       <w:r>
         <w:rPr>
           <w:b/>
         </w:rPr>
         <w:t>Cancel</w:t>
       </w:r>
-      <w:proofErr w:type="gramEnd"/>
       <w:r>
         <w:t xml:space="preserve"> to disregard any changes. </w:t>
       </w:r>
@@ -8494,14 +8436,12 @@
       <w:r>
         <w:t xml:space="preserve"> to save the entity when finished or </w:t>
       </w:r>
-      <w:proofErr w:type="gramStart"/>
       <w:r>
         <w:rPr>
           <w:b/>
         </w:rPr>
         <w:t>Cancel</w:t>
       </w:r>
-      <w:proofErr w:type="gramEnd"/>
       <w:r>
         <w:t xml:space="preserve"> to disregard any changes.</w:t>
       </w:r>
@@ -8527,15 +8467,7 @@
         <w:t xml:space="preserve">Step </w:t>
       </w:r>
       <w:r>
-        <w:t>2 (</w:t>
-      </w:r>
-      <w:proofErr w:type="spellStart"/>
-      <w:r>
-        <w:t>cont</w:t>
-      </w:r>
-      <w:proofErr w:type="spellEnd"/>
-      <w:r>
-        <w:t>)</w:t>
+        <w:t>2 (cont)</w:t>
       </w:r>
       <w:r>
         <w:t>: Generate Code</w:t>
@@ -8624,14 +8556,12 @@
       <w:r>
         <w:t xml:space="preserve"> to proceed or </w:t>
       </w:r>
-      <w:proofErr w:type="gramStart"/>
       <w:r>
         <w:rPr>
           <w:rStyle w:val="SAGETextUI"/>
         </w:rPr>
         <w:t>Back</w:t>
       </w:r>
-      <w:proofErr w:type="gramEnd"/>
       <w:r>
         <w:t xml:space="preserve"> to go back to the previous step.</w:t>
       </w:r>
@@ -8654,13 +8584,7 @@
       <w:bookmarkStart w:id="25" w:name="_Toc180178642"/>
       <w:r>
         <w:lastRenderedPageBreak/>
-        <w:t xml:space="preserve">Step </w:t>
-      </w:r>
-      <w:r>
-        <w:t>3</w:t>
-      </w:r>
-      <w:r>
-        <w:t>: Generated Code</w:t>
+        <w:t>Step 3: Generated Code</w:t>
       </w:r>
       <w:bookmarkEnd w:id="25"/>
     </w:p>
@@ -8754,14 +8678,12 @@
       <w:r>
         <w:t xml:space="preserve"> to exit the wizard or </w:t>
       </w:r>
-      <w:proofErr w:type="gramStart"/>
       <w:r>
         <w:rPr>
           <w:rStyle w:val="SAGETextUI"/>
         </w:rPr>
         <w:t>Back</w:t>
       </w:r>
-      <w:proofErr w:type="gramEnd"/>
       <w:r>
         <w:t xml:space="preserve"> to go back to the previous step.</w:t>
       </w:r>
@@ -9065,14 +8987,12 @@
       <w:r>
         <w:t xml:space="preserve">The </w:t>
       </w:r>
-      <w:proofErr w:type="spellStart"/>
       <w:r>
         <w:rPr>
           <w:rStyle w:val="SAGETextFilename"/>
         </w:rPr>
         <w:t>TUMenuModuleHelper.cs</w:t>
       </w:r>
-      <w:proofErr w:type="spellEnd"/>
       <w:r>
         <w:t xml:space="preserve"> file already has generated code for Menu Navigation.</w:t>
       </w:r>
@@ -9084,19 +9004,11 @@
       <w:r>
         <w:t xml:space="preserve">The </w:t>
       </w:r>
-      <w:proofErr w:type="spellStart"/>
       <w:r>
         <w:rPr>
           <w:rStyle w:val="SAGETextFilename"/>
         </w:rPr>
-        <w:t>Security.cs</w:t>
-      </w:r>
-      <w:proofErr w:type="spellEnd"/>
-      <w:r>
-        <w:rPr>
-          <w:rStyle w:val="SAGETextFilename"/>
-        </w:rPr>
-        <w:t xml:space="preserve"> </w:t>
+        <w:t xml:space="preserve">Security.cs </w:t>
       </w:r>
       <w:r>
         <w:t>file already has constants generated for the Import and Export constan</w:t>
@@ -9453,7 +9365,6 @@
       <w:pPr>
         <w:pStyle w:val="SAGEBullet1"/>
       </w:pPr>
-      <w:proofErr w:type="spellStart"/>
       <w:r>
         <w:rPr>
           <w:rStyle w:val="SAGETextFilename"/>
@@ -9461,7 +9372,6 @@
         <w:lastRenderedPageBreak/>
         <w:t>MenuResx.resx</w:t>
       </w:r>
-      <w:proofErr w:type="spellEnd"/>
       <w:r>
         <w:t xml:space="preserve"> is the English resource</w:t>
       </w:r>
@@ -9473,14 +9383,12 @@
       <w:pPr>
         <w:pStyle w:val="SAGEBullet1"/>
       </w:pPr>
-      <w:proofErr w:type="spellStart"/>
       <w:r>
         <w:rPr>
           <w:rStyle w:val="SAGETextFilename"/>
         </w:rPr>
         <w:t>MenuResx.es.resx</w:t>
       </w:r>
-      <w:proofErr w:type="spellEnd"/>
       <w:r>
         <w:t xml:space="preserve"> is the Spanish resource</w:t>
       </w:r>
@@ -9495,14 +9403,12 @@
       <w:pPr>
         <w:pStyle w:val="SAGEBullet1"/>
       </w:pPr>
-      <w:proofErr w:type="spellStart"/>
       <w:r>
         <w:rPr>
           <w:rStyle w:val="SAGETextFilename"/>
         </w:rPr>
         <w:t>MenuResx.fr.resx</w:t>
       </w:r>
-      <w:proofErr w:type="spellEnd"/>
       <w:r>
         <w:t xml:space="preserve"> is the French resource</w:t>
       </w:r>
@@ -9517,14 +9423,12 @@
       <w:pPr>
         <w:pStyle w:val="SAGEBullet1"/>
       </w:pPr>
-      <w:proofErr w:type="spellStart"/>
       <w:r>
         <w:rPr>
           <w:rStyle w:val="SAGETextFilename"/>
         </w:rPr>
         <w:t>MenuResx.zh-Hans.resx</w:t>
       </w:r>
-      <w:proofErr w:type="spellEnd"/>
       <w:r>
         <w:t xml:space="preserve"> is the Chinese Simplified resource</w:t>
       </w:r>
@@ -9539,14 +9443,12 @@
       <w:pPr>
         <w:pStyle w:val="SAGEBullet1"/>
       </w:pPr>
-      <w:proofErr w:type="spellStart"/>
       <w:r>
         <w:rPr>
           <w:rStyle w:val="SAGETextFilename"/>
         </w:rPr>
         <w:t>MenuResx.zh-Hant.resx</w:t>
       </w:r>
-      <w:proofErr w:type="spellEnd"/>
       <w:r>
         <w:t xml:space="preserve"> is t</w:t>
       </w:r>
@@ -9682,21 +9584,7 @@
         <w:rPr>
           <w:rStyle w:val="SAGETextFilename"/>
         </w:rPr>
-        <w:t xml:space="preserve"> </w:t>
-      </w:r>
-      <w:proofErr w:type="spellStart"/>
-      <w:r>
-        <w:rPr>
-          <w:rStyle w:val="SAGETextFilename"/>
-        </w:rPr>
-        <w:t>TUBootstrapper.cs</w:t>
-      </w:r>
-      <w:proofErr w:type="spellEnd"/>
-      <w:r>
-        <w:rPr>
-          <w:rStyle w:val="SAGETextFilename"/>
-        </w:rPr>
-        <w:t xml:space="preserve"> </w:t>
+        <w:t xml:space="preserve"> TUBootstrapper.cs </w:t>
       </w:r>
       <w:r>
         <w:t>file already has generated code for Unity Dependency Injection which will be added to</w:t>
@@ -9846,25 +9734,21 @@
         <w:lastRenderedPageBreak/>
         <w:t xml:space="preserve">The </w:t>
       </w:r>
-      <w:proofErr w:type="spellStart"/>
       <w:r>
         <w:rPr>
           <w:rStyle w:val="SAGETextFilename"/>
         </w:rPr>
         <w:t>TUBootstrapper.cs</w:t>
       </w:r>
-      <w:proofErr w:type="spellEnd"/>
       <w:r>
         <w:t xml:space="preserve">, </w:t>
       </w:r>
-      <w:proofErr w:type="spellStart"/>
       <w:r>
         <w:rPr>
           <w:rStyle w:val="SAGETextFilename"/>
         </w:rPr>
         <w:t>TUAreaRegistration.cs</w:t>
       </w:r>
-      <w:proofErr w:type="spellEnd"/>
       <w:r>
         <w:t xml:space="preserve">, </w:t>
       </w:r>
@@ -9877,14 +9761,12 @@
       <w:r>
         <w:t xml:space="preserve"> and </w:t>
       </w:r>
-      <w:proofErr w:type="spellStart"/>
       <w:r>
         <w:rPr>
           <w:rStyle w:val="SAGETextFilename"/>
         </w:rPr>
         <w:t>TUWebBootstrapper.cs</w:t>
       </w:r>
-      <w:proofErr w:type="spellEnd"/>
       <w:r>
         <w:t xml:space="preserve"> files already have generated code for Unity Dependency Injection</w:t>
       </w:r>
@@ -9913,13 +9795,7 @@
       <w:bookmarkStart w:id="34" w:name="_Toc180178651"/>
       <w:r>
         <w:lastRenderedPageBreak/>
-        <w:t xml:space="preserve">Web </w:t>
-      </w:r>
-      <w:r>
-        <w:t xml:space="preserve">API </w:t>
-      </w:r>
-      <w:r>
-        <w:t>Type Solution</w:t>
+        <w:t>Web API Type Solution</w:t>
       </w:r>
       <w:bookmarkEnd w:id="34"/>
     </w:p>
@@ -10094,10 +9970,7 @@
         <w:pStyle w:val="SAGEBodyText"/>
       </w:pPr>
       <w:r>
-        <w:t xml:space="preserve">The wizard </w:t>
-      </w:r>
-      <w:r>
-        <w:t>has created the endpoint (</w:t>
+        <w:t>The wizard has created the endpoint (</w:t>
       </w:r>
       <w:r>
         <w:rPr>
@@ -10148,7 +10021,7 @@
         <w:pStyle w:val="SAGEHeading3"/>
         <w:numPr>
           <w:ilvl w:val="2"/>
-          <w:numId w:val="53"/>
+          <w:numId w:val="26"/>
         </w:numPr>
         <w:ind w:left="0" w:firstLine="0"/>
       </w:pPr>
@@ -10224,10 +10097,7 @@
         <w:pStyle w:val="SAGEBodyText"/>
       </w:pPr>
       <w:r>
-        <w:t xml:space="preserve">The wizard has </w:t>
-      </w:r>
-      <w:r>
-        <w:t>created the models for the requested entity.</w:t>
+        <w:t>The wizard has created the models for the requested entity.</w:t>
       </w:r>
     </w:p>
     <w:p>
@@ -10265,7 +10135,7 @@
 </file>
 
 <file path=word/endnotes.xml><?xml version="1.0" encoding="utf-8"?>
-<w:endnotes xmlns:wpc="http://schemas.microsoft.com/office/word/2010/wordprocessingCanvas" xmlns:cx="http://schemas.microsoft.com/office/drawing/2014/chartex" xmlns:cx1="http://schemas.microsoft.com/office/drawing/2015/9/8/chartex" xmlns:cx2="http://schemas.microsoft.com/office/drawing/2015/10/21/chartex" xmlns:cx3="http://schemas.microsoft.com/office/drawing/2016/5/9/chartex" xmlns:cx4="http://schemas.microsoft.com/office/drawing/2016/5/10/chartex" xmlns:cx5="http://schemas.microsoft.com/office/drawing/2016/5/11/chartex" xmlns:cx6="http://schemas.microsoft.com/office/drawing/2016/5/12/chartex" xmlns:cx7="http://schemas.microsoft.com/office/drawing/2016/5/13/chartex" xmlns:cx8="http://schemas.microsoft.com/office/drawing/2016/5/14/chartex" xmlns:mc="http://schemas.openxmlformats.org/markup-compatibility/2006" xmlns:aink="http://schemas.microsoft.com/office/drawing/2016/ink" xmlns:am3d="http://schemas.microsoft.com/office/drawing/2017/model3d" xmlns:o="urn:schemas-microsoft-com:office:office" xmlns:oel="http://schemas.microsoft.com/office/2019/extlst" xmlns:r="http://schemas.openxmlformats.org/officeDocument/2006/relationships" xmlns:m="http://schemas.openxmlformats.org/officeDocument/2006/math" xmlns:v="urn:schemas-microsoft-com:vml" xmlns:wp14="http://schemas.microsoft.com/office/word/2010/wordprocessingDrawing" xmlns:wp="http://schemas.openxmlformats.org/drawingml/2006/wordprocessingDrawing" xmlns:w10="urn:schemas-microsoft-com:office:word" xmlns:w="http://schemas.openxmlformats.org/wordprocessingml/2006/main" xmlns:w14="http://schemas.microsoft.com/office/word/2010/wordml" xmlns:w15="http://schemas.microsoft.com/office/word/2012/wordml" xmlns:w16cex="http://schemas.microsoft.com/office/word/2018/wordml/cex" xmlns:w16cid="http://schemas.microsoft.com/office/word/2016/wordml/cid" xmlns:w16="http://schemas.microsoft.com/office/word/2018/wordml" xmlns:w16du="http://schemas.microsoft.com/office/word/2023/wordml/word16du" xmlns:w16sdtdh="http://schemas.microsoft.com/office/word/2020/wordml/sdtdatahash" xmlns:w16se="http://schemas.microsoft.com/office/word/2015/wordml/symex" xmlns:wpg="http://schemas.microsoft.com/office/word/2010/wordprocessingGroup" xmlns:wpi="http://schemas.microsoft.com/office/word/2010/wordprocessingInk" xmlns:wne="http://schemas.microsoft.com/office/word/2006/wordml" xmlns:wps="http://schemas.microsoft.com/office/word/2010/wordprocessingShape" mc:Ignorable="w14 w15 w16se w16cid w16 w16cex w16sdtdh w16du wp14">
+<w:endnotes xmlns:wpc="http://schemas.microsoft.com/office/word/2010/wordprocessingCanvas" xmlns:cx="http://schemas.microsoft.com/office/drawing/2014/chartex" xmlns:cx1="http://schemas.microsoft.com/office/drawing/2015/9/8/chartex" xmlns:cx2="http://schemas.microsoft.com/office/drawing/2015/10/21/chartex" xmlns:cx3="http://schemas.microsoft.com/office/drawing/2016/5/9/chartex" xmlns:cx4="http://schemas.microsoft.com/office/drawing/2016/5/10/chartex" xmlns:cx5="http://schemas.microsoft.com/office/drawing/2016/5/11/chartex" xmlns:cx6="http://schemas.microsoft.com/office/drawing/2016/5/12/chartex" xmlns:cx7="http://schemas.microsoft.com/office/drawing/2016/5/13/chartex" xmlns:cx8="http://schemas.microsoft.com/office/drawing/2016/5/14/chartex" xmlns:mc="http://schemas.openxmlformats.org/markup-compatibility/2006" xmlns:aink="http://schemas.microsoft.com/office/drawing/2016/ink" xmlns:am3d="http://schemas.microsoft.com/office/drawing/2017/model3d" xmlns:o="urn:schemas-microsoft-com:office:office" xmlns:oel="http://schemas.microsoft.com/office/2019/extlst" xmlns:r="http://schemas.openxmlformats.org/officeDocument/2006/relationships" xmlns:m="http://schemas.openxmlformats.org/officeDocument/2006/math" xmlns:v="urn:schemas-microsoft-com:vml" xmlns:wp14="http://schemas.microsoft.com/office/word/2010/wordprocessingDrawing" xmlns:wp="http://schemas.openxmlformats.org/drawingml/2006/wordprocessingDrawing" xmlns:w10="urn:schemas-microsoft-com:office:word" xmlns:w="http://schemas.openxmlformats.org/wordprocessingml/2006/main" xmlns:w14="http://schemas.microsoft.com/office/word/2010/wordml" xmlns:w15="http://schemas.microsoft.com/office/word/2012/wordml" xmlns:w16cex="http://schemas.microsoft.com/office/word/2018/wordml/cex" xmlns:w16cid="http://schemas.microsoft.com/office/word/2016/wordml/cid" xmlns:w16="http://schemas.microsoft.com/office/word/2018/wordml" xmlns:w16du="http://schemas.microsoft.com/office/word/2023/wordml/word16du" xmlns:w16sdtdh="http://schemas.microsoft.com/office/word/2020/wordml/sdtdatahash" xmlns:w16sdtfl="http://schemas.microsoft.com/office/word/2024/wordml/sdtformatlock" xmlns:w16se="http://schemas.microsoft.com/office/word/2015/wordml/symex" xmlns:wpg="http://schemas.microsoft.com/office/word/2010/wordprocessingGroup" xmlns:wpi="http://schemas.microsoft.com/office/word/2010/wordprocessingInk" xmlns:wne="http://schemas.microsoft.com/office/word/2006/wordml" xmlns:wps="http://schemas.microsoft.com/office/word/2010/wordprocessingShape" mc:Ignorable="w14 w15 w16se w16cid w16 w16cex w16sdtdh w16sdtfl w16du wp14">
   <w:endnote w:type="separator" w:id="-1">
     <w:p>
       <w:pPr>
@@ -10292,7 +10162,7 @@
 </file>
 
 <file path=word/footer1.xml><?xml version="1.0" encoding="utf-8"?>
-<w:ftr xmlns:wpc="http://schemas.microsoft.com/office/word/2010/wordprocessingCanvas" xmlns:cx="http://schemas.microsoft.com/office/drawing/2014/chartex" xmlns:cx1="http://schemas.microsoft.com/office/drawing/2015/9/8/chartex" xmlns:cx2="http://schemas.microsoft.com/office/drawing/2015/10/21/chartex" xmlns:cx3="http://schemas.microsoft.com/office/drawing/2016/5/9/chartex" xmlns:cx4="http://schemas.microsoft.com/office/drawing/2016/5/10/chartex" xmlns:cx5="http://schemas.microsoft.com/office/drawing/2016/5/11/chartex" xmlns:cx6="http://schemas.microsoft.com/office/drawing/2016/5/12/chartex" xmlns:cx7="http://schemas.microsoft.com/office/drawing/2016/5/13/chartex" xmlns:cx8="http://schemas.microsoft.com/office/drawing/2016/5/14/chartex" xmlns:mc="http://schemas.openxmlformats.org/markup-compatibility/2006" xmlns:aink="http://schemas.microsoft.com/office/drawing/2016/ink" xmlns:am3d="http://schemas.microsoft.com/office/drawing/2017/model3d" xmlns:o="urn:schemas-microsoft-com:office:office" xmlns:oel="http://schemas.microsoft.com/office/2019/extlst" xmlns:r="http://schemas.openxmlformats.org/officeDocument/2006/relationships" xmlns:m="http://schemas.openxmlformats.org/officeDocument/2006/math" xmlns:v="urn:schemas-microsoft-com:vml" xmlns:wp14="http://schemas.microsoft.com/office/word/2010/wordprocessingDrawing" xmlns:wp="http://schemas.openxmlformats.org/drawingml/2006/wordprocessingDrawing" xmlns:w10="urn:schemas-microsoft-com:office:word" xmlns:w="http://schemas.openxmlformats.org/wordprocessingml/2006/main" xmlns:w14="http://schemas.microsoft.com/office/word/2010/wordml" xmlns:w15="http://schemas.microsoft.com/office/word/2012/wordml" xmlns:w16cex="http://schemas.microsoft.com/office/word/2018/wordml/cex" xmlns:w16cid="http://schemas.microsoft.com/office/word/2016/wordml/cid" xmlns:w16="http://schemas.microsoft.com/office/word/2018/wordml" xmlns:w16du="http://schemas.microsoft.com/office/word/2023/wordml/word16du" xmlns:w16sdtdh="http://schemas.microsoft.com/office/word/2020/wordml/sdtdatahash" xmlns:w16se="http://schemas.microsoft.com/office/word/2015/wordml/symex" xmlns:wpg="http://schemas.microsoft.com/office/word/2010/wordprocessingGroup" xmlns:wpi="http://schemas.microsoft.com/office/word/2010/wordprocessingInk" xmlns:wne="http://schemas.microsoft.com/office/word/2006/wordml" xmlns:wps="http://schemas.microsoft.com/office/word/2010/wordprocessingShape" mc:Ignorable="w14 w15 w16se w16cid w16 w16cex w16sdtdh w16du wp14">
+<w:ftr xmlns:wpc="http://schemas.microsoft.com/office/word/2010/wordprocessingCanvas" xmlns:cx="http://schemas.microsoft.com/office/drawing/2014/chartex" xmlns:cx1="http://schemas.microsoft.com/office/drawing/2015/9/8/chartex" xmlns:cx2="http://schemas.microsoft.com/office/drawing/2015/10/21/chartex" xmlns:cx3="http://schemas.microsoft.com/office/drawing/2016/5/9/chartex" xmlns:cx4="http://schemas.microsoft.com/office/drawing/2016/5/10/chartex" xmlns:cx5="http://schemas.microsoft.com/office/drawing/2016/5/11/chartex" xmlns:cx6="http://schemas.microsoft.com/office/drawing/2016/5/12/chartex" xmlns:cx7="http://schemas.microsoft.com/office/drawing/2016/5/13/chartex" xmlns:cx8="http://schemas.microsoft.com/office/drawing/2016/5/14/chartex" xmlns:mc="http://schemas.openxmlformats.org/markup-compatibility/2006" xmlns:aink="http://schemas.microsoft.com/office/drawing/2016/ink" xmlns:am3d="http://schemas.microsoft.com/office/drawing/2017/model3d" xmlns:o="urn:schemas-microsoft-com:office:office" xmlns:oel="http://schemas.microsoft.com/office/2019/extlst" xmlns:r="http://schemas.openxmlformats.org/officeDocument/2006/relationships" xmlns:m="http://schemas.openxmlformats.org/officeDocument/2006/math" xmlns:v="urn:schemas-microsoft-com:vml" xmlns:wp14="http://schemas.microsoft.com/office/word/2010/wordprocessingDrawing" xmlns:wp="http://schemas.openxmlformats.org/drawingml/2006/wordprocessingDrawing" xmlns:w10="urn:schemas-microsoft-com:office:word" xmlns:w="http://schemas.openxmlformats.org/wordprocessingml/2006/main" xmlns:w14="http://schemas.microsoft.com/office/word/2010/wordml" xmlns:w15="http://schemas.microsoft.com/office/word/2012/wordml" xmlns:w16cex="http://schemas.microsoft.com/office/word/2018/wordml/cex" xmlns:w16cid="http://schemas.microsoft.com/office/word/2016/wordml/cid" xmlns:w16="http://schemas.microsoft.com/office/word/2018/wordml" xmlns:w16du="http://schemas.microsoft.com/office/word/2023/wordml/word16du" xmlns:w16sdtdh="http://schemas.microsoft.com/office/word/2020/wordml/sdtdatahash" xmlns:w16sdtfl="http://schemas.microsoft.com/office/word/2024/wordml/sdtformatlock" xmlns:w16se="http://schemas.microsoft.com/office/word/2015/wordml/symex" xmlns:wpg="http://schemas.microsoft.com/office/word/2010/wordprocessingGroup" xmlns:wpi="http://schemas.microsoft.com/office/word/2010/wordprocessingInk" xmlns:wne="http://schemas.microsoft.com/office/word/2006/wordml" xmlns:wps="http://schemas.microsoft.com/office/word/2010/wordprocessingShape" mc:Ignorable="w14 w15 w16se w16cid w16 w16cex w16sdtdh w16sdtfl w16du wp14">
   <w:p>
     <w:pPr>
       <w:pStyle w:val="Footer"/>
@@ -10302,7 +10172,7 @@
 </file>
 
 <file path=word/footer2.xml><?xml version="1.0" encoding="utf-8"?>
-<w:ftr xmlns:wpc="http://schemas.microsoft.com/office/word/2010/wordprocessingCanvas" xmlns:cx="http://schemas.microsoft.com/office/drawing/2014/chartex" xmlns:cx1="http://schemas.microsoft.com/office/drawing/2015/9/8/chartex" xmlns:cx2="http://schemas.microsoft.com/office/drawing/2015/10/21/chartex" xmlns:cx3="http://schemas.microsoft.com/office/drawing/2016/5/9/chartex" xmlns:cx4="http://schemas.microsoft.com/office/drawing/2016/5/10/chartex" xmlns:cx5="http://schemas.microsoft.com/office/drawing/2016/5/11/chartex" xmlns:cx6="http://schemas.microsoft.com/office/drawing/2016/5/12/chartex" xmlns:cx7="http://schemas.microsoft.com/office/drawing/2016/5/13/chartex" xmlns:cx8="http://schemas.microsoft.com/office/drawing/2016/5/14/chartex" xmlns:mc="http://schemas.openxmlformats.org/markup-compatibility/2006" xmlns:aink="http://schemas.microsoft.com/office/drawing/2016/ink" xmlns:am3d="http://schemas.microsoft.com/office/drawing/2017/model3d" xmlns:o="urn:schemas-microsoft-com:office:office" xmlns:oel="http://schemas.microsoft.com/office/2019/extlst" xmlns:r="http://schemas.openxmlformats.org/officeDocument/2006/relationships" xmlns:m="http://schemas.openxmlformats.org/officeDocument/2006/math" xmlns:v="urn:schemas-microsoft-com:vml" xmlns:wp14="http://schemas.microsoft.com/office/word/2010/wordprocessingDrawing" xmlns:wp="http://schemas.openxmlformats.org/drawingml/2006/wordprocessingDrawing" xmlns:w10="urn:schemas-microsoft-com:office:word" xmlns:w="http://schemas.openxmlformats.org/wordprocessingml/2006/main" xmlns:w14="http://schemas.microsoft.com/office/word/2010/wordml" xmlns:w15="http://schemas.microsoft.com/office/word/2012/wordml" xmlns:w16cex="http://schemas.microsoft.com/office/word/2018/wordml/cex" xmlns:w16cid="http://schemas.microsoft.com/office/word/2016/wordml/cid" xmlns:w16="http://schemas.microsoft.com/office/word/2018/wordml" xmlns:w16du="http://schemas.microsoft.com/office/word/2023/wordml/word16du" xmlns:w16sdtdh="http://schemas.microsoft.com/office/word/2020/wordml/sdtdatahash" xmlns:w16se="http://schemas.microsoft.com/office/word/2015/wordml/symex" xmlns:wpg="http://schemas.microsoft.com/office/word/2010/wordprocessingGroup" xmlns:wpi="http://schemas.microsoft.com/office/word/2010/wordprocessingInk" xmlns:wne="http://schemas.microsoft.com/office/word/2006/wordml" xmlns:wps="http://schemas.microsoft.com/office/word/2010/wordprocessingShape" mc:Ignorable="w14 w15 w16se w16cid w16 w16cex w16sdtdh w16du wp14">
+<w:ftr xmlns:wpc="http://schemas.microsoft.com/office/word/2010/wordprocessingCanvas" xmlns:cx="http://schemas.microsoft.com/office/drawing/2014/chartex" xmlns:cx1="http://schemas.microsoft.com/office/drawing/2015/9/8/chartex" xmlns:cx2="http://schemas.microsoft.com/office/drawing/2015/10/21/chartex" xmlns:cx3="http://schemas.microsoft.com/office/drawing/2016/5/9/chartex" xmlns:cx4="http://schemas.microsoft.com/office/drawing/2016/5/10/chartex" xmlns:cx5="http://schemas.microsoft.com/office/drawing/2016/5/11/chartex" xmlns:cx6="http://schemas.microsoft.com/office/drawing/2016/5/12/chartex" xmlns:cx7="http://schemas.microsoft.com/office/drawing/2016/5/13/chartex" xmlns:cx8="http://schemas.microsoft.com/office/drawing/2016/5/14/chartex" xmlns:mc="http://schemas.openxmlformats.org/markup-compatibility/2006" xmlns:aink="http://schemas.microsoft.com/office/drawing/2016/ink" xmlns:am3d="http://schemas.microsoft.com/office/drawing/2017/model3d" xmlns:o="urn:schemas-microsoft-com:office:office" xmlns:oel="http://schemas.microsoft.com/office/2019/extlst" xmlns:r="http://schemas.openxmlformats.org/officeDocument/2006/relationships" xmlns:m="http://schemas.openxmlformats.org/officeDocument/2006/math" xmlns:v="urn:schemas-microsoft-com:vml" xmlns:wp14="http://schemas.microsoft.com/office/word/2010/wordprocessingDrawing" xmlns:wp="http://schemas.openxmlformats.org/drawingml/2006/wordprocessingDrawing" xmlns:w10="urn:schemas-microsoft-com:office:word" xmlns:w="http://schemas.openxmlformats.org/wordprocessingml/2006/main" xmlns:w14="http://schemas.microsoft.com/office/word/2010/wordml" xmlns:w15="http://schemas.microsoft.com/office/word/2012/wordml" xmlns:w16cex="http://schemas.microsoft.com/office/word/2018/wordml/cex" xmlns:w16cid="http://schemas.microsoft.com/office/word/2016/wordml/cid" xmlns:w16="http://schemas.microsoft.com/office/word/2018/wordml" xmlns:w16du="http://schemas.microsoft.com/office/word/2023/wordml/word16du" xmlns:w16sdtdh="http://schemas.microsoft.com/office/word/2020/wordml/sdtdatahash" xmlns:w16sdtfl="http://schemas.microsoft.com/office/word/2024/wordml/sdtformatlock" xmlns:w16se="http://schemas.microsoft.com/office/word/2015/wordml/symex" xmlns:wpg="http://schemas.microsoft.com/office/word/2010/wordprocessingGroup" xmlns:wpi="http://schemas.microsoft.com/office/word/2010/wordprocessingInk" xmlns:wne="http://schemas.microsoft.com/office/word/2006/wordml" xmlns:wps="http://schemas.microsoft.com/office/word/2010/wordprocessingShape" mc:Ignorable="w14 w15 w16se w16cid w16 w16cex w16sdtdh w16sdtfl w16du wp14">
   <w:p>
     <w:pPr>
       <w:pStyle w:val="SAGEFooter"/>
@@ -10414,7 +10284,7 @@
 </file>
 
 <file path=word/footer3.xml><?xml version="1.0" encoding="utf-8"?>
-<w:ftr xmlns:wpc="http://schemas.microsoft.com/office/word/2010/wordprocessingCanvas" xmlns:cx="http://schemas.microsoft.com/office/drawing/2014/chartex" xmlns:cx1="http://schemas.microsoft.com/office/drawing/2015/9/8/chartex" xmlns:cx2="http://schemas.microsoft.com/office/drawing/2015/10/21/chartex" xmlns:cx3="http://schemas.microsoft.com/office/drawing/2016/5/9/chartex" xmlns:cx4="http://schemas.microsoft.com/office/drawing/2016/5/10/chartex" xmlns:cx5="http://schemas.microsoft.com/office/drawing/2016/5/11/chartex" xmlns:cx6="http://schemas.microsoft.com/office/drawing/2016/5/12/chartex" xmlns:cx7="http://schemas.microsoft.com/office/drawing/2016/5/13/chartex" xmlns:cx8="http://schemas.microsoft.com/office/drawing/2016/5/14/chartex" xmlns:mc="http://schemas.openxmlformats.org/markup-compatibility/2006" xmlns:aink="http://schemas.microsoft.com/office/drawing/2016/ink" xmlns:am3d="http://schemas.microsoft.com/office/drawing/2017/model3d" xmlns:o="urn:schemas-microsoft-com:office:office" xmlns:oel="http://schemas.microsoft.com/office/2019/extlst" xmlns:r="http://schemas.openxmlformats.org/officeDocument/2006/relationships" xmlns:m="http://schemas.openxmlformats.org/officeDocument/2006/math" xmlns:v="urn:schemas-microsoft-com:vml" xmlns:wp14="http://schemas.microsoft.com/office/word/2010/wordprocessingDrawing" xmlns:wp="http://schemas.openxmlformats.org/drawingml/2006/wordprocessingDrawing" xmlns:w10="urn:schemas-microsoft-com:office:word" xmlns:w="http://schemas.openxmlformats.org/wordprocessingml/2006/main" xmlns:w14="http://schemas.microsoft.com/office/word/2010/wordml" xmlns:w15="http://schemas.microsoft.com/office/word/2012/wordml" xmlns:w16cex="http://schemas.microsoft.com/office/word/2018/wordml/cex" xmlns:w16cid="http://schemas.microsoft.com/office/word/2016/wordml/cid" xmlns:w16="http://schemas.microsoft.com/office/word/2018/wordml" xmlns:w16du="http://schemas.microsoft.com/office/word/2023/wordml/word16du" xmlns:w16sdtdh="http://schemas.microsoft.com/office/word/2020/wordml/sdtdatahash" xmlns:w16se="http://schemas.microsoft.com/office/word/2015/wordml/symex" xmlns:wpg="http://schemas.microsoft.com/office/word/2010/wordprocessingGroup" xmlns:wpi="http://schemas.microsoft.com/office/word/2010/wordprocessingInk" xmlns:wne="http://schemas.microsoft.com/office/word/2006/wordml" xmlns:wps="http://schemas.microsoft.com/office/word/2010/wordprocessingShape" mc:Ignorable="w14 w15 w16se w16cid w16 w16cex w16sdtdh w16du wp14">
+<w:ftr xmlns:wpc="http://schemas.microsoft.com/office/word/2010/wordprocessingCanvas" xmlns:cx="http://schemas.microsoft.com/office/drawing/2014/chartex" xmlns:cx1="http://schemas.microsoft.com/office/drawing/2015/9/8/chartex" xmlns:cx2="http://schemas.microsoft.com/office/drawing/2015/10/21/chartex" xmlns:cx3="http://schemas.microsoft.com/office/drawing/2016/5/9/chartex" xmlns:cx4="http://schemas.microsoft.com/office/drawing/2016/5/10/chartex" xmlns:cx5="http://schemas.microsoft.com/office/drawing/2016/5/11/chartex" xmlns:cx6="http://schemas.microsoft.com/office/drawing/2016/5/12/chartex" xmlns:cx7="http://schemas.microsoft.com/office/drawing/2016/5/13/chartex" xmlns:cx8="http://schemas.microsoft.com/office/drawing/2016/5/14/chartex" xmlns:mc="http://schemas.openxmlformats.org/markup-compatibility/2006" xmlns:aink="http://schemas.microsoft.com/office/drawing/2016/ink" xmlns:am3d="http://schemas.microsoft.com/office/drawing/2017/model3d" xmlns:o="urn:schemas-microsoft-com:office:office" xmlns:oel="http://schemas.microsoft.com/office/2019/extlst" xmlns:r="http://schemas.openxmlformats.org/officeDocument/2006/relationships" xmlns:m="http://schemas.openxmlformats.org/officeDocument/2006/math" xmlns:v="urn:schemas-microsoft-com:vml" xmlns:wp14="http://schemas.microsoft.com/office/word/2010/wordprocessingDrawing" xmlns:wp="http://schemas.openxmlformats.org/drawingml/2006/wordprocessingDrawing" xmlns:w10="urn:schemas-microsoft-com:office:word" xmlns:w="http://schemas.openxmlformats.org/wordprocessingml/2006/main" xmlns:w14="http://schemas.microsoft.com/office/word/2010/wordml" xmlns:w15="http://schemas.microsoft.com/office/word/2012/wordml" xmlns:w16cex="http://schemas.microsoft.com/office/word/2018/wordml/cex" xmlns:w16cid="http://schemas.microsoft.com/office/word/2016/wordml/cid" xmlns:w16="http://schemas.microsoft.com/office/word/2018/wordml" xmlns:w16du="http://schemas.microsoft.com/office/word/2023/wordml/word16du" xmlns:w16sdtdh="http://schemas.microsoft.com/office/word/2020/wordml/sdtdatahash" xmlns:w16sdtfl="http://schemas.microsoft.com/office/word/2024/wordml/sdtformatlock" xmlns:w16se="http://schemas.microsoft.com/office/word/2015/wordml/symex" xmlns:wpg="http://schemas.microsoft.com/office/word/2010/wordprocessingGroup" xmlns:wpi="http://schemas.microsoft.com/office/word/2010/wordprocessingInk" xmlns:wne="http://schemas.microsoft.com/office/word/2006/wordml" xmlns:wps="http://schemas.microsoft.com/office/word/2010/wordprocessingShape" mc:Ignorable="w14 w15 w16se w16cid w16 w16cex w16sdtdh w16sdtfl w16du wp14">
   <w:p>
     <w:pPr>
       <w:pStyle w:val="Footer"/>
@@ -10424,7 +10294,7 @@
 </file>
 
 <file path=word/footer4.xml><?xml version="1.0" encoding="utf-8"?>
-<w:ftr xmlns:wpc="http://schemas.microsoft.com/office/word/2010/wordprocessingCanvas" xmlns:cx="http://schemas.microsoft.com/office/drawing/2014/chartex" xmlns:cx1="http://schemas.microsoft.com/office/drawing/2015/9/8/chartex" xmlns:cx2="http://schemas.microsoft.com/office/drawing/2015/10/21/chartex" xmlns:cx3="http://schemas.microsoft.com/office/drawing/2016/5/9/chartex" xmlns:cx4="http://schemas.microsoft.com/office/drawing/2016/5/10/chartex" xmlns:cx5="http://schemas.microsoft.com/office/drawing/2016/5/11/chartex" xmlns:cx6="http://schemas.microsoft.com/office/drawing/2016/5/12/chartex" xmlns:cx7="http://schemas.microsoft.com/office/drawing/2016/5/13/chartex" xmlns:cx8="http://schemas.microsoft.com/office/drawing/2016/5/14/chartex" xmlns:mc="http://schemas.openxmlformats.org/markup-compatibility/2006" xmlns:aink="http://schemas.microsoft.com/office/drawing/2016/ink" xmlns:am3d="http://schemas.microsoft.com/office/drawing/2017/model3d" xmlns:o="urn:schemas-microsoft-com:office:office" xmlns:oel="http://schemas.microsoft.com/office/2019/extlst" xmlns:r="http://schemas.openxmlformats.org/officeDocument/2006/relationships" xmlns:m="http://schemas.openxmlformats.org/officeDocument/2006/math" xmlns:v="urn:schemas-microsoft-com:vml" xmlns:wp14="http://schemas.microsoft.com/office/word/2010/wordprocessingDrawing" xmlns:wp="http://schemas.openxmlformats.org/drawingml/2006/wordprocessingDrawing" xmlns:w10="urn:schemas-microsoft-com:office:word" xmlns:w="http://schemas.openxmlformats.org/wordprocessingml/2006/main" xmlns:w14="http://schemas.microsoft.com/office/word/2010/wordml" xmlns:w15="http://schemas.microsoft.com/office/word/2012/wordml" xmlns:w16cex="http://schemas.microsoft.com/office/word/2018/wordml/cex" xmlns:w16cid="http://schemas.microsoft.com/office/word/2016/wordml/cid" xmlns:w16="http://schemas.microsoft.com/office/word/2018/wordml" xmlns:w16du="http://schemas.microsoft.com/office/word/2023/wordml/word16du" xmlns:w16sdtdh="http://schemas.microsoft.com/office/word/2020/wordml/sdtdatahash" xmlns:w16se="http://schemas.microsoft.com/office/word/2015/wordml/symex" xmlns:wpg="http://schemas.microsoft.com/office/word/2010/wordprocessingGroup" xmlns:wpi="http://schemas.microsoft.com/office/word/2010/wordprocessingInk" xmlns:wne="http://schemas.microsoft.com/office/word/2006/wordml" xmlns:wps="http://schemas.microsoft.com/office/word/2010/wordprocessingShape" mc:Ignorable="w14 w15 w16se w16cid w16 w16cex w16sdtdh w16du wp14">
+<w:ftr xmlns:wpc="http://schemas.microsoft.com/office/word/2010/wordprocessingCanvas" xmlns:cx="http://schemas.microsoft.com/office/drawing/2014/chartex" xmlns:cx1="http://schemas.microsoft.com/office/drawing/2015/9/8/chartex" xmlns:cx2="http://schemas.microsoft.com/office/drawing/2015/10/21/chartex" xmlns:cx3="http://schemas.microsoft.com/office/drawing/2016/5/9/chartex" xmlns:cx4="http://schemas.microsoft.com/office/drawing/2016/5/10/chartex" xmlns:cx5="http://schemas.microsoft.com/office/drawing/2016/5/11/chartex" xmlns:cx6="http://schemas.microsoft.com/office/drawing/2016/5/12/chartex" xmlns:cx7="http://schemas.microsoft.com/office/drawing/2016/5/13/chartex" xmlns:cx8="http://schemas.microsoft.com/office/drawing/2016/5/14/chartex" xmlns:mc="http://schemas.openxmlformats.org/markup-compatibility/2006" xmlns:aink="http://schemas.microsoft.com/office/drawing/2016/ink" xmlns:am3d="http://schemas.microsoft.com/office/drawing/2017/model3d" xmlns:o="urn:schemas-microsoft-com:office:office" xmlns:oel="http://schemas.microsoft.com/office/2019/extlst" xmlns:r="http://schemas.openxmlformats.org/officeDocument/2006/relationships" xmlns:m="http://schemas.openxmlformats.org/officeDocument/2006/math" xmlns:v="urn:schemas-microsoft-com:vml" xmlns:wp14="http://schemas.microsoft.com/office/word/2010/wordprocessingDrawing" xmlns:wp="http://schemas.openxmlformats.org/drawingml/2006/wordprocessingDrawing" xmlns:w10="urn:schemas-microsoft-com:office:word" xmlns:w="http://schemas.openxmlformats.org/wordprocessingml/2006/main" xmlns:w14="http://schemas.microsoft.com/office/word/2010/wordml" xmlns:w15="http://schemas.microsoft.com/office/word/2012/wordml" xmlns:w16cex="http://schemas.microsoft.com/office/word/2018/wordml/cex" xmlns:w16cid="http://schemas.microsoft.com/office/word/2016/wordml/cid" xmlns:w16="http://schemas.microsoft.com/office/word/2018/wordml" xmlns:w16du="http://schemas.microsoft.com/office/word/2023/wordml/word16du" xmlns:w16sdtdh="http://schemas.microsoft.com/office/word/2020/wordml/sdtdatahash" xmlns:w16sdtfl="http://schemas.microsoft.com/office/word/2024/wordml/sdtformatlock" xmlns:w16se="http://schemas.microsoft.com/office/word/2015/wordml/symex" xmlns:wpg="http://schemas.microsoft.com/office/word/2010/wordprocessingGroup" xmlns:wpi="http://schemas.microsoft.com/office/word/2010/wordprocessingInk" xmlns:wne="http://schemas.microsoft.com/office/word/2006/wordml" xmlns:wps="http://schemas.microsoft.com/office/word/2010/wordprocessingShape" mc:Ignorable="w14 w15 w16se w16cid w16 w16cex w16sdtdh w16sdtfl w16du wp14">
   <w:p>
     <w:pPr>
       <w:pStyle w:val="Footer"/>
@@ -10435,7 +10305,7 @@
 </file>
 
 <file path=word/footer5.xml><?xml version="1.0" encoding="utf-8"?>
-<w:ftr xmlns:wpc="http://schemas.microsoft.com/office/word/2010/wordprocessingCanvas" xmlns:cx="http://schemas.microsoft.com/office/drawing/2014/chartex" xmlns:cx1="http://schemas.microsoft.com/office/drawing/2015/9/8/chartex" xmlns:cx2="http://schemas.microsoft.com/office/drawing/2015/10/21/chartex" xmlns:cx3="http://schemas.microsoft.com/office/drawing/2016/5/9/chartex" xmlns:cx4="http://schemas.microsoft.com/office/drawing/2016/5/10/chartex" xmlns:cx5="http://schemas.microsoft.com/office/drawing/2016/5/11/chartex" xmlns:cx6="http://schemas.microsoft.com/office/drawing/2016/5/12/chartex" xmlns:cx7="http://schemas.microsoft.com/office/drawing/2016/5/13/chartex" xmlns:cx8="http://schemas.microsoft.com/office/drawing/2016/5/14/chartex" xmlns:mc="http://schemas.openxmlformats.org/markup-compatibility/2006" xmlns:aink="http://schemas.microsoft.com/office/drawing/2016/ink" xmlns:am3d="http://schemas.microsoft.com/office/drawing/2017/model3d" xmlns:o="urn:schemas-microsoft-com:office:office" xmlns:oel="http://schemas.microsoft.com/office/2019/extlst" xmlns:r="http://schemas.openxmlformats.org/officeDocument/2006/relationships" xmlns:m="http://schemas.openxmlformats.org/officeDocument/2006/math" xmlns:v="urn:schemas-microsoft-com:vml" xmlns:wp14="http://schemas.microsoft.com/office/word/2010/wordprocessingDrawing" xmlns:wp="http://schemas.openxmlformats.org/drawingml/2006/wordprocessingDrawing" xmlns:w10="urn:schemas-microsoft-com:office:word" xmlns:w="http://schemas.openxmlformats.org/wordprocessingml/2006/main" xmlns:w14="http://schemas.microsoft.com/office/word/2010/wordml" xmlns:w15="http://schemas.microsoft.com/office/word/2012/wordml" xmlns:w16cex="http://schemas.microsoft.com/office/word/2018/wordml/cex" xmlns:w16cid="http://schemas.microsoft.com/office/word/2016/wordml/cid" xmlns:w16="http://schemas.microsoft.com/office/word/2018/wordml" xmlns:w16du="http://schemas.microsoft.com/office/word/2023/wordml/word16du" xmlns:w16sdtdh="http://schemas.microsoft.com/office/word/2020/wordml/sdtdatahash" xmlns:w16se="http://schemas.microsoft.com/office/word/2015/wordml/symex" xmlns:wpg="http://schemas.microsoft.com/office/word/2010/wordprocessingGroup" xmlns:wpi="http://schemas.microsoft.com/office/word/2010/wordprocessingInk" xmlns:wne="http://schemas.microsoft.com/office/word/2006/wordml" xmlns:wps="http://schemas.microsoft.com/office/word/2010/wordprocessingShape" mc:Ignorable="w14 w15 w16se w16cid w16 w16cex w16sdtdh w16du wp14">
+<w:ftr xmlns:wpc="http://schemas.microsoft.com/office/word/2010/wordprocessingCanvas" xmlns:cx="http://schemas.microsoft.com/office/drawing/2014/chartex" xmlns:cx1="http://schemas.microsoft.com/office/drawing/2015/9/8/chartex" xmlns:cx2="http://schemas.microsoft.com/office/drawing/2015/10/21/chartex" xmlns:cx3="http://schemas.microsoft.com/office/drawing/2016/5/9/chartex" xmlns:cx4="http://schemas.microsoft.com/office/drawing/2016/5/10/chartex" xmlns:cx5="http://schemas.microsoft.com/office/drawing/2016/5/11/chartex" xmlns:cx6="http://schemas.microsoft.com/office/drawing/2016/5/12/chartex" xmlns:cx7="http://schemas.microsoft.com/office/drawing/2016/5/13/chartex" xmlns:cx8="http://schemas.microsoft.com/office/drawing/2016/5/14/chartex" xmlns:mc="http://schemas.openxmlformats.org/markup-compatibility/2006" xmlns:aink="http://schemas.microsoft.com/office/drawing/2016/ink" xmlns:am3d="http://schemas.microsoft.com/office/drawing/2017/model3d" xmlns:o="urn:schemas-microsoft-com:office:office" xmlns:oel="http://schemas.microsoft.com/office/2019/extlst" xmlns:r="http://schemas.openxmlformats.org/officeDocument/2006/relationships" xmlns:m="http://schemas.openxmlformats.org/officeDocument/2006/math" xmlns:v="urn:schemas-microsoft-com:vml" xmlns:wp14="http://schemas.microsoft.com/office/word/2010/wordprocessingDrawing" xmlns:wp="http://schemas.openxmlformats.org/drawingml/2006/wordprocessingDrawing" xmlns:w10="urn:schemas-microsoft-com:office:word" xmlns:w="http://schemas.openxmlformats.org/wordprocessingml/2006/main" xmlns:w14="http://schemas.microsoft.com/office/word/2010/wordml" xmlns:w15="http://schemas.microsoft.com/office/word/2012/wordml" xmlns:w16cex="http://schemas.microsoft.com/office/word/2018/wordml/cex" xmlns:w16cid="http://schemas.microsoft.com/office/word/2016/wordml/cid" xmlns:w16="http://schemas.microsoft.com/office/word/2018/wordml" xmlns:w16du="http://schemas.microsoft.com/office/word/2023/wordml/word16du" xmlns:w16sdtdh="http://schemas.microsoft.com/office/word/2020/wordml/sdtdatahash" xmlns:w16sdtfl="http://schemas.microsoft.com/office/word/2024/wordml/sdtformatlock" xmlns:w16se="http://schemas.microsoft.com/office/word/2015/wordml/symex" xmlns:wpg="http://schemas.microsoft.com/office/word/2010/wordprocessingGroup" xmlns:wpi="http://schemas.microsoft.com/office/word/2010/wordprocessingInk" xmlns:wne="http://schemas.microsoft.com/office/word/2006/wordml" xmlns:wps="http://schemas.microsoft.com/office/word/2010/wordprocessingShape" mc:Ignorable="w14 w15 w16se w16cid w16 w16cex w16sdtdh w16sdtfl w16du wp14">
   <w:tbl>
     <w:tblPr>
       <w:tblStyle w:val="TableGrid"/>
@@ -10603,7 +10473,7 @@
 </file>
 
 <file path=word/footer6.xml><?xml version="1.0" encoding="utf-8"?>
-<w:ftr xmlns:wpc="http://schemas.microsoft.com/office/word/2010/wordprocessingCanvas" xmlns:cx="http://schemas.microsoft.com/office/drawing/2014/chartex" xmlns:cx1="http://schemas.microsoft.com/office/drawing/2015/9/8/chartex" xmlns:cx2="http://schemas.microsoft.com/office/drawing/2015/10/21/chartex" xmlns:cx3="http://schemas.microsoft.com/office/drawing/2016/5/9/chartex" xmlns:cx4="http://schemas.microsoft.com/office/drawing/2016/5/10/chartex" xmlns:cx5="http://schemas.microsoft.com/office/drawing/2016/5/11/chartex" xmlns:cx6="http://schemas.microsoft.com/office/drawing/2016/5/12/chartex" xmlns:cx7="http://schemas.microsoft.com/office/drawing/2016/5/13/chartex" xmlns:cx8="http://schemas.microsoft.com/office/drawing/2016/5/14/chartex" xmlns:mc="http://schemas.openxmlformats.org/markup-compatibility/2006" xmlns:aink="http://schemas.microsoft.com/office/drawing/2016/ink" xmlns:am3d="http://schemas.microsoft.com/office/drawing/2017/model3d" xmlns:o="urn:schemas-microsoft-com:office:office" xmlns:oel="http://schemas.microsoft.com/office/2019/extlst" xmlns:r="http://schemas.openxmlformats.org/officeDocument/2006/relationships" xmlns:m="http://schemas.openxmlformats.org/officeDocument/2006/math" xmlns:v="urn:schemas-microsoft-com:vml" xmlns:wp14="http://schemas.microsoft.com/office/word/2010/wordprocessingDrawing" xmlns:wp="http://schemas.openxmlformats.org/drawingml/2006/wordprocessingDrawing" xmlns:w10="urn:schemas-microsoft-com:office:word" xmlns:w="http://schemas.openxmlformats.org/wordprocessingml/2006/main" xmlns:w14="http://schemas.microsoft.com/office/word/2010/wordml" xmlns:w15="http://schemas.microsoft.com/office/word/2012/wordml" xmlns:w16cex="http://schemas.microsoft.com/office/word/2018/wordml/cex" xmlns:w16cid="http://schemas.microsoft.com/office/word/2016/wordml/cid" xmlns:w16="http://schemas.microsoft.com/office/word/2018/wordml" xmlns:w16du="http://schemas.microsoft.com/office/word/2023/wordml/word16du" xmlns:w16sdtdh="http://schemas.microsoft.com/office/word/2020/wordml/sdtdatahash" xmlns:w16se="http://schemas.microsoft.com/office/word/2015/wordml/symex" xmlns:wpg="http://schemas.microsoft.com/office/word/2010/wordprocessingGroup" xmlns:wpi="http://schemas.microsoft.com/office/word/2010/wordprocessingInk" xmlns:wne="http://schemas.microsoft.com/office/word/2006/wordml" xmlns:wps="http://schemas.microsoft.com/office/word/2010/wordprocessingShape" mc:Ignorable="w14 w15 w16se w16cid w16 w16cex w16sdtdh w16du wp14">
+<w:ftr xmlns:wpc="http://schemas.microsoft.com/office/word/2010/wordprocessingCanvas" xmlns:cx="http://schemas.microsoft.com/office/drawing/2014/chartex" xmlns:cx1="http://schemas.microsoft.com/office/drawing/2015/9/8/chartex" xmlns:cx2="http://schemas.microsoft.com/office/drawing/2015/10/21/chartex" xmlns:cx3="http://schemas.microsoft.com/office/drawing/2016/5/9/chartex" xmlns:cx4="http://schemas.microsoft.com/office/drawing/2016/5/10/chartex" xmlns:cx5="http://schemas.microsoft.com/office/drawing/2016/5/11/chartex" xmlns:cx6="http://schemas.microsoft.com/office/drawing/2016/5/12/chartex" xmlns:cx7="http://schemas.microsoft.com/office/drawing/2016/5/13/chartex" xmlns:cx8="http://schemas.microsoft.com/office/drawing/2016/5/14/chartex" xmlns:mc="http://schemas.openxmlformats.org/markup-compatibility/2006" xmlns:aink="http://schemas.microsoft.com/office/drawing/2016/ink" xmlns:am3d="http://schemas.microsoft.com/office/drawing/2017/model3d" xmlns:o="urn:schemas-microsoft-com:office:office" xmlns:oel="http://schemas.microsoft.com/office/2019/extlst" xmlns:r="http://schemas.openxmlformats.org/officeDocument/2006/relationships" xmlns:m="http://schemas.openxmlformats.org/officeDocument/2006/math" xmlns:v="urn:schemas-microsoft-com:vml" xmlns:wp14="http://schemas.microsoft.com/office/word/2010/wordprocessingDrawing" xmlns:wp="http://schemas.openxmlformats.org/drawingml/2006/wordprocessingDrawing" xmlns:w10="urn:schemas-microsoft-com:office:word" xmlns:w="http://schemas.openxmlformats.org/wordprocessingml/2006/main" xmlns:w14="http://schemas.microsoft.com/office/word/2010/wordml" xmlns:w15="http://schemas.microsoft.com/office/word/2012/wordml" xmlns:w16cex="http://schemas.microsoft.com/office/word/2018/wordml/cex" xmlns:w16cid="http://schemas.microsoft.com/office/word/2016/wordml/cid" xmlns:w16="http://schemas.microsoft.com/office/word/2018/wordml" xmlns:w16du="http://schemas.microsoft.com/office/word/2023/wordml/word16du" xmlns:w16sdtdh="http://schemas.microsoft.com/office/word/2020/wordml/sdtdatahash" xmlns:w16sdtfl="http://schemas.microsoft.com/office/word/2024/wordml/sdtformatlock" xmlns:w16se="http://schemas.microsoft.com/office/word/2015/wordml/symex" xmlns:wpg="http://schemas.microsoft.com/office/word/2010/wordprocessingGroup" xmlns:wpi="http://schemas.microsoft.com/office/word/2010/wordprocessingInk" xmlns:wne="http://schemas.microsoft.com/office/word/2006/wordml" xmlns:wps="http://schemas.microsoft.com/office/word/2010/wordprocessingShape" mc:Ignorable="w14 w15 w16se w16cid w16 w16cex w16sdtdh w16sdtfl w16du wp14">
   <w:tbl>
     <w:tblPr>
       <w:tblStyle w:val="TableGrid"/>
@@ -10764,7 +10634,7 @@
 </file>
 
 <file path=word/footnotes.xml><?xml version="1.0" encoding="utf-8"?>
-<w:footnotes xmlns:wpc="http://schemas.microsoft.com/office/word/2010/wordprocessingCanvas" xmlns:cx="http://schemas.microsoft.com/office/drawing/2014/chartex" xmlns:cx1="http://schemas.microsoft.com/office/drawing/2015/9/8/chartex" xmlns:cx2="http://schemas.microsoft.com/office/drawing/2015/10/21/chartex" xmlns:cx3="http://schemas.microsoft.com/office/drawing/2016/5/9/chartex" xmlns:cx4="http://schemas.microsoft.com/office/drawing/2016/5/10/chartex" xmlns:cx5="http://schemas.microsoft.com/office/drawing/2016/5/11/chartex" xmlns:cx6="http://schemas.microsoft.com/office/drawing/2016/5/12/chartex" xmlns:cx7="http://schemas.microsoft.com/office/drawing/2016/5/13/chartex" xmlns:cx8="http://schemas.microsoft.com/office/drawing/2016/5/14/chartex" xmlns:mc="http://schemas.openxmlformats.org/markup-compatibility/2006" xmlns:aink="http://schemas.microsoft.com/office/drawing/2016/ink" xmlns:am3d="http://schemas.microsoft.com/office/drawing/2017/model3d" xmlns:o="urn:schemas-microsoft-com:office:office" xmlns:oel="http://schemas.microsoft.com/office/2019/extlst" xmlns:r="http://schemas.openxmlformats.org/officeDocument/2006/relationships" xmlns:m="http://schemas.openxmlformats.org/officeDocument/2006/math" xmlns:v="urn:schemas-microsoft-com:vml" xmlns:wp14="http://schemas.microsoft.com/office/word/2010/wordprocessingDrawing" xmlns:wp="http://schemas.openxmlformats.org/drawingml/2006/wordprocessingDrawing" xmlns:w10="urn:schemas-microsoft-com:office:word" xmlns:w="http://schemas.openxmlformats.org/wordprocessingml/2006/main" xmlns:w14="http://schemas.microsoft.com/office/word/2010/wordml" xmlns:w15="http://schemas.microsoft.com/office/word/2012/wordml" xmlns:w16cex="http://schemas.microsoft.com/office/word/2018/wordml/cex" xmlns:w16cid="http://schemas.microsoft.com/office/word/2016/wordml/cid" xmlns:w16="http://schemas.microsoft.com/office/word/2018/wordml" xmlns:w16du="http://schemas.microsoft.com/office/word/2023/wordml/word16du" xmlns:w16sdtdh="http://schemas.microsoft.com/office/word/2020/wordml/sdtdatahash" xmlns:w16se="http://schemas.microsoft.com/office/word/2015/wordml/symex" xmlns:wpg="http://schemas.microsoft.com/office/word/2010/wordprocessingGroup" xmlns:wpi="http://schemas.microsoft.com/office/word/2010/wordprocessingInk" xmlns:wne="http://schemas.microsoft.com/office/word/2006/wordml" xmlns:wps="http://schemas.microsoft.com/office/word/2010/wordprocessingShape" mc:Ignorable="w14 w15 w16se w16cid w16 w16cex w16sdtdh w16du wp14">
+<w:footnotes xmlns:wpc="http://schemas.microsoft.com/office/word/2010/wordprocessingCanvas" xmlns:cx="http://schemas.microsoft.com/office/drawing/2014/chartex" xmlns:cx1="http://schemas.microsoft.com/office/drawing/2015/9/8/chartex" xmlns:cx2="http://schemas.microsoft.com/office/drawing/2015/10/21/chartex" xmlns:cx3="http://schemas.microsoft.com/office/drawing/2016/5/9/chartex" xmlns:cx4="http://schemas.microsoft.com/office/drawing/2016/5/10/chartex" xmlns:cx5="http://schemas.microsoft.com/office/drawing/2016/5/11/chartex" xmlns:cx6="http://schemas.microsoft.com/office/drawing/2016/5/12/chartex" xmlns:cx7="http://schemas.microsoft.com/office/drawing/2016/5/13/chartex" xmlns:cx8="http://schemas.microsoft.com/office/drawing/2016/5/14/chartex" xmlns:mc="http://schemas.openxmlformats.org/markup-compatibility/2006" xmlns:aink="http://schemas.microsoft.com/office/drawing/2016/ink" xmlns:am3d="http://schemas.microsoft.com/office/drawing/2017/model3d" xmlns:o="urn:schemas-microsoft-com:office:office" xmlns:oel="http://schemas.microsoft.com/office/2019/extlst" xmlns:r="http://schemas.openxmlformats.org/officeDocument/2006/relationships" xmlns:m="http://schemas.openxmlformats.org/officeDocument/2006/math" xmlns:v="urn:schemas-microsoft-com:vml" xmlns:wp14="http://schemas.microsoft.com/office/word/2010/wordprocessingDrawing" xmlns:wp="http://schemas.openxmlformats.org/drawingml/2006/wordprocessingDrawing" xmlns:w10="urn:schemas-microsoft-com:office:word" xmlns:w="http://schemas.openxmlformats.org/wordprocessingml/2006/main" xmlns:w14="http://schemas.microsoft.com/office/word/2010/wordml" xmlns:w15="http://schemas.microsoft.com/office/word/2012/wordml" xmlns:w16cex="http://schemas.microsoft.com/office/word/2018/wordml/cex" xmlns:w16cid="http://schemas.microsoft.com/office/word/2016/wordml/cid" xmlns:w16="http://schemas.microsoft.com/office/word/2018/wordml" xmlns:w16du="http://schemas.microsoft.com/office/word/2023/wordml/word16du" xmlns:w16sdtdh="http://schemas.microsoft.com/office/word/2020/wordml/sdtdatahash" xmlns:w16sdtfl="http://schemas.microsoft.com/office/word/2024/wordml/sdtformatlock" xmlns:w16se="http://schemas.microsoft.com/office/word/2015/wordml/symex" xmlns:wpg="http://schemas.microsoft.com/office/word/2010/wordprocessingGroup" xmlns:wpi="http://schemas.microsoft.com/office/word/2010/wordprocessingInk" xmlns:wne="http://schemas.microsoft.com/office/word/2006/wordml" xmlns:wps="http://schemas.microsoft.com/office/word/2010/wordprocessingShape" mc:Ignorable="w14 w15 w16se w16cid w16 w16cex w16sdtdh w16sdtfl w16du wp14">
   <w:footnote w:type="separator" w:id="-1">
     <w:p>
       <w:pPr>
@@ -10793,7 +10663,7 @@
 </file>
 
 <file path=word/header1.xml><?xml version="1.0" encoding="utf-8"?>
-<w:hdr xmlns:wpc="http://schemas.microsoft.com/office/word/2010/wordprocessingCanvas" xmlns:cx="http://schemas.microsoft.com/office/drawing/2014/chartex" xmlns:cx1="http://schemas.microsoft.com/office/drawing/2015/9/8/chartex" xmlns:cx2="http://schemas.microsoft.com/office/drawing/2015/10/21/chartex" xmlns:cx3="http://schemas.microsoft.com/office/drawing/2016/5/9/chartex" xmlns:cx4="http://schemas.microsoft.com/office/drawing/2016/5/10/chartex" xmlns:cx5="http://schemas.microsoft.com/office/drawing/2016/5/11/chartex" xmlns:cx6="http://schemas.microsoft.com/office/drawing/2016/5/12/chartex" xmlns:cx7="http://schemas.microsoft.com/office/drawing/2016/5/13/chartex" xmlns:cx8="http://schemas.microsoft.com/office/drawing/2016/5/14/chartex" xmlns:mc="http://schemas.openxmlformats.org/markup-compatibility/2006" xmlns:aink="http://schemas.microsoft.com/office/drawing/2016/ink" xmlns:am3d="http://schemas.microsoft.com/office/drawing/2017/model3d" xmlns:o="urn:schemas-microsoft-com:office:office" xmlns:oel="http://schemas.microsoft.com/office/2019/extlst" xmlns:r="http://schemas.openxmlformats.org/officeDocument/2006/relationships" xmlns:m="http://schemas.openxmlformats.org/officeDocument/2006/math" xmlns:v="urn:schemas-microsoft-com:vml" xmlns:wp14="http://schemas.microsoft.com/office/word/2010/wordprocessingDrawing" xmlns:wp="http://schemas.openxmlformats.org/drawingml/2006/wordprocessingDrawing" xmlns:w10="urn:schemas-microsoft-com:office:word" xmlns:w="http://schemas.openxmlformats.org/wordprocessingml/2006/main" xmlns:w14="http://schemas.microsoft.com/office/word/2010/wordml" xmlns:w15="http://schemas.microsoft.com/office/word/2012/wordml" xmlns:w16cex="http://schemas.microsoft.com/office/word/2018/wordml/cex" xmlns:w16cid="http://schemas.microsoft.com/office/word/2016/wordml/cid" xmlns:w16="http://schemas.microsoft.com/office/word/2018/wordml" xmlns:w16du="http://schemas.microsoft.com/office/word/2023/wordml/word16du" xmlns:w16sdtdh="http://schemas.microsoft.com/office/word/2020/wordml/sdtdatahash" xmlns:w16se="http://schemas.microsoft.com/office/word/2015/wordml/symex" xmlns:wpg="http://schemas.microsoft.com/office/word/2010/wordprocessingGroup" xmlns:wpi="http://schemas.microsoft.com/office/word/2010/wordprocessingInk" xmlns:wne="http://schemas.microsoft.com/office/word/2006/wordml" xmlns:wps="http://schemas.microsoft.com/office/word/2010/wordprocessingShape" mc:Ignorable="w14 w15 w16se w16cid w16 w16cex w16sdtdh w16du wp14">
+<w:hdr xmlns:wpc="http://schemas.microsoft.com/office/word/2010/wordprocessingCanvas" xmlns:cx="http://schemas.microsoft.com/office/drawing/2014/chartex" xmlns:cx1="http://schemas.microsoft.com/office/drawing/2015/9/8/chartex" xmlns:cx2="http://schemas.microsoft.com/office/drawing/2015/10/21/chartex" xmlns:cx3="http://schemas.microsoft.com/office/drawing/2016/5/9/chartex" xmlns:cx4="http://schemas.microsoft.com/office/drawing/2016/5/10/chartex" xmlns:cx5="http://schemas.microsoft.com/office/drawing/2016/5/11/chartex" xmlns:cx6="http://schemas.microsoft.com/office/drawing/2016/5/12/chartex" xmlns:cx7="http://schemas.microsoft.com/office/drawing/2016/5/13/chartex" xmlns:cx8="http://schemas.microsoft.com/office/drawing/2016/5/14/chartex" xmlns:mc="http://schemas.openxmlformats.org/markup-compatibility/2006" xmlns:aink="http://schemas.microsoft.com/office/drawing/2016/ink" xmlns:am3d="http://schemas.microsoft.com/office/drawing/2017/model3d" xmlns:o="urn:schemas-microsoft-com:office:office" xmlns:oel="http://schemas.microsoft.com/office/2019/extlst" xmlns:r="http://schemas.openxmlformats.org/officeDocument/2006/relationships" xmlns:m="http://schemas.openxmlformats.org/officeDocument/2006/math" xmlns:v="urn:schemas-microsoft-com:vml" xmlns:wp14="http://schemas.microsoft.com/office/word/2010/wordprocessingDrawing" xmlns:wp="http://schemas.openxmlformats.org/drawingml/2006/wordprocessingDrawing" xmlns:w10="urn:schemas-microsoft-com:office:word" xmlns:w="http://schemas.openxmlformats.org/wordprocessingml/2006/main" xmlns:w14="http://schemas.microsoft.com/office/word/2010/wordml" xmlns:w15="http://schemas.microsoft.com/office/word/2012/wordml" xmlns:w16cex="http://schemas.microsoft.com/office/word/2018/wordml/cex" xmlns:w16cid="http://schemas.microsoft.com/office/word/2016/wordml/cid" xmlns:w16="http://schemas.microsoft.com/office/word/2018/wordml" xmlns:w16du="http://schemas.microsoft.com/office/word/2023/wordml/word16du" xmlns:w16sdtdh="http://schemas.microsoft.com/office/word/2020/wordml/sdtdatahash" xmlns:w16sdtfl="http://schemas.microsoft.com/office/word/2024/wordml/sdtformatlock" xmlns:w16se="http://schemas.microsoft.com/office/word/2015/wordml/symex" xmlns:wpg="http://schemas.microsoft.com/office/word/2010/wordprocessingGroup" xmlns:wpi="http://schemas.microsoft.com/office/word/2010/wordprocessingInk" xmlns:wne="http://schemas.microsoft.com/office/word/2006/wordml" xmlns:wps="http://schemas.microsoft.com/office/word/2010/wordprocessingShape" mc:Ignorable="w14 w15 w16se w16cid w16 w16cex w16sdtdh w16sdtfl w16du wp14">
   <w:p>
     <w:pPr>
       <w:pStyle w:val="Header"/>
@@ -10803,7 +10673,7 @@
 </file>
 
 <file path=word/header2.xml><?xml version="1.0" encoding="utf-8"?>
-<w:hdr xmlns:wpc="http://schemas.microsoft.com/office/word/2010/wordprocessingCanvas" xmlns:cx="http://schemas.microsoft.com/office/drawing/2014/chartex" xmlns:cx1="http://schemas.microsoft.com/office/drawing/2015/9/8/chartex" xmlns:cx2="http://schemas.microsoft.com/office/drawing/2015/10/21/chartex" xmlns:cx3="http://schemas.microsoft.com/office/drawing/2016/5/9/chartex" xmlns:cx4="http://schemas.microsoft.com/office/drawing/2016/5/10/chartex" xmlns:cx5="http://schemas.microsoft.com/office/drawing/2016/5/11/chartex" xmlns:cx6="http://schemas.microsoft.com/office/drawing/2016/5/12/chartex" xmlns:cx7="http://schemas.microsoft.com/office/drawing/2016/5/13/chartex" xmlns:cx8="http://schemas.microsoft.com/office/drawing/2016/5/14/chartex" xmlns:mc="http://schemas.openxmlformats.org/markup-compatibility/2006" xmlns:aink="http://schemas.microsoft.com/office/drawing/2016/ink" xmlns:am3d="http://schemas.microsoft.com/office/drawing/2017/model3d" xmlns:o="urn:schemas-microsoft-com:office:office" xmlns:oel="http://schemas.microsoft.com/office/2019/extlst" xmlns:r="http://schemas.openxmlformats.org/officeDocument/2006/relationships" xmlns:m="http://schemas.openxmlformats.org/officeDocument/2006/math" xmlns:v="urn:schemas-microsoft-com:vml" xmlns:wp14="http://schemas.microsoft.com/office/word/2010/wordprocessingDrawing" xmlns:wp="http://schemas.openxmlformats.org/drawingml/2006/wordprocessingDrawing" xmlns:w10="urn:schemas-microsoft-com:office:word" xmlns:w="http://schemas.openxmlformats.org/wordprocessingml/2006/main" xmlns:w14="http://schemas.microsoft.com/office/word/2010/wordml" xmlns:w15="http://schemas.microsoft.com/office/word/2012/wordml" xmlns:w16cex="http://schemas.microsoft.com/office/word/2018/wordml/cex" xmlns:w16cid="http://schemas.microsoft.com/office/word/2016/wordml/cid" xmlns:w16="http://schemas.microsoft.com/office/word/2018/wordml" xmlns:w16du="http://schemas.microsoft.com/office/word/2023/wordml/word16du" xmlns:w16sdtdh="http://schemas.microsoft.com/office/word/2020/wordml/sdtdatahash" xmlns:w16se="http://schemas.microsoft.com/office/word/2015/wordml/symex" xmlns:wpg="http://schemas.microsoft.com/office/word/2010/wordprocessingGroup" xmlns:wpi="http://schemas.microsoft.com/office/word/2010/wordprocessingInk" xmlns:wne="http://schemas.microsoft.com/office/word/2006/wordml" xmlns:wps="http://schemas.microsoft.com/office/word/2010/wordprocessingShape" mc:Ignorable="w14 w15 w16se w16cid w16 w16cex w16sdtdh w16du wp14">
+<w:hdr xmlns:wpc="http://schemas.microsoft.com/office/word/2010/wordprocessingCanvas" xmlns:cx="http://schemas.microsoft.com/office/drawing/2014/chartex" xmlns:cx1="http://schemas.microsoft.com/office/drawing/2015/9/8/chartex" xmlns:cx2="http://schemas.microsoft.com/office/drawing/2015/10/21/chartex" xmlns:cx3="http://schemas.microsoft.com/office/drawing/2016/5/9/chartex" xmlns:cx4="http://schemas.microsoft.com/office/drawing/2016/5/10/chartex" xmlns:cx5="http://schemas.microsoft.com/office/drawing/2016/5/11/chartex" xmlns:cx6="http://schemas.microsoft.com/office/drawing/2016/5/12/chartex" xmlns:cx7="http://schemas.microsoft.com/office/drawing/2016/5/13/chartex" xmlns:cx8="http://schemas.microsoft.com/office/drawing/2016/5/14/chartex" xmlns:mc="http://schemas.openxmlformats.org/markup-compatibility/2006" xmlns:aink="http://schemas.microsoft.com/office/drawing/2016/ink" xmlns:am3d="http://schemas.microsoft.com/office/drawing/2017/model3d" xmlns:o="urn:schemas-microsoft-com:office:office" xmlns:oel="http://schemas.microsoft.com/office/2019/extlst" xmlns:r="http://schemas.openxmlformats.org/officeDocument/2006/relationships" xmlns:m="http://schemas.openxmlformats.org/officeDocument/2006/math" xmlns:v="urn:schemas-microsoft-com:vml" xmlns:wp14="http://schemas.microsoft.com/office/word/2010/wordprocessingDrawing" xmlns:wp="http://schemas.openxmlformats.org/drawingml/2006/wordprocessingDrawing" xmlns:w10="urn:schemas-microsoft-com:office:word" xmlns:w="http://schemas.openxmlformats.org/wordprocessingml/2006/main" xmlns:w14="http://schemas.microsoft.com/office/word/2010/wordml" xmlns:w15="http://schemas.microsoft.com/office/word/2012/wordml" xmlns:w16cex="http://schemas.microsoft.com/office/word/2018/wordml/cex" xmlns:w16cid="http://schemas.microsoft.com/office/word/2016/wordml/cid" xmlns:w16="http://schemas.microsoft.com/office/word/2018/wordml" xmlns:w16du="http://schemas.microsoft.com/office/word/2023/wordml/word16du" xmlns:w16sdtdh="http://schemas.microsoft.com/office/word/2020/wordml/sdtdatahash" xmlns:w16sdtfl="http://schemas.microsoft.com/office/word/2024/wordml/sdtformatlock" xmlns:w16se="http://schemas.microsoft.com/office/word/2015/wordml/symex" xmlns:wpg="http://schemas.microsoft.com/office/word/2010/wordprocessingGroup" xmlns:wpi="http://schemas.microsoft.com/office/word/2010/wordprocessingInk" xmlns:wne="http://schemas.microsoft.com/office/word/2006/wordml" xmlns:wps="http://schemas.microsoft.com/office/word/2010/wordprocessingShape" mc:Ignorable="w14 w15 w16se w16cid w16 w16cex w16sdtdh w16sdtfl w16du wp14">
   <w:p>
     <w:pPr>
       <w:pStyle w:val="Header"/>
@@ -10813,7 +10683,7 @@
 </file>
 
 <file path=word/header3.xml><?xml version="1.0" encoding="utf-8"?>
-<w:hdr xmlns:wpc="http://schemas.microsoft.com/office/word/2010/wordprocessingCanvas" xmlns:cx="http://schemas.microsoft.com/office/drawing/2014/chartex" xmlns:cx1="http://schemas.microsoft.com/office/drawing/2015/9/8/chartex" xmlns:cx2="http://schemas.microsoft.com/office/drawing/2015/10/21/chartex" xmlns:cx3="http://schemas.microsoft.com/office/drawing/2016/5/9/chartex" xmlns:cx4="http://schemas.microsoft.com/office/drawing/2016/5/10/chartex" xmlns:cx5="http://schemas.microsoft.com/office/drawing/2016/5/11/chartex" xmlns:cx6="http://schemas.microsoft.com/office/drawing/2016/5/12/chartex" xmlns:cx7="http://schemas.microsoft.com/office/drawing/2016/5/13/chartex" xmlns:cx8="http://schemas.microsoft.com/office/drawing/2016/5/14/chartex" xmlns:mc="http://schemas.openxmlformats.org/markup-compatibility/2006" xmlns:aink="http://schemas.microsoft.com/office/drawing/2016/ink" xmlns:am3d="http://schemas.microsoft.com/office/drawing/2017/model3d" xmlns:o="urn:schemas-microsoft-com:office:office" xmlns:oel="http://schemas.microsoft.com/office/2019/extlst" xmlns:r="http://schemas.openxmlformats.org/officeDocument/2006/relationships" xmlns:m="http://schemas.openxmlformats.org/officeDocument/2006/math" xmlns:v="urn:schemas-microsoft-com:vml" xmlns:wp14="http://schemas.microsoft.com/office/word/2010/wordprocessingDrawing" xmlns:wp="http://schemas.openxmlformats.org/drawingml/2006/wordprocessingDrawing" xmlns:w10="urn:schemas-microsoft-com:office:word" xmlns:w="http://schemas.openxmlformats.org/wordprocessingml/2006/main" xmlns:w14="http://schemas.microsoft.com/office/word/2010/wordml" xmlns:w15="http://schemas.microsoft.com/office/word/2012/wordml" xmlns:w16cex="http://schemas.microsoft.com/office/word/2018/wordml/cex" xmlns:w16cid="http://schemas.microsoft.com/office/word/2016/wordml/cid" xmlns:w16="http://schemas.microsoft.com/office/word/2018/wordml" xmlns:w16du="http://schemas.microsoft.com/office/word/2023/wordml/word16du" xmlns:w16sdtdh="http://schemas.microsoft.com/office/word/2020/wordml/sdtdatahash" xmlns:w16se="http://schemas.microsoft.com/office/word/2015/wordml/symex" xmlns:wpg="http://schemas.microsoft.com/office/word/2010/wordprocessingGroup" xmlns:wpi="http://schemas.microsoft.com/office/word/2010/wordprocessingInk" xmlns:wne="http://schemas.microsoft.com/office/word/2006/wordml" xmlns:wps="http://schemas.microsoft.com/office/word/2010/wordprocessingShape" mc:Ignorable="w14 w15 w16se w16cid w16 w16cex w16sdtdh w16du wp14">
+<w:hdr xmlns:wpc="http://schemas.microsoft.com/office/word/2010/wordprocessingCanvas" xmlns:cx="http://schemas.microsoft.com/office/drawing/2014/chartex" xmlns:cx1="http://schemas.microsoft.com/office/drawing/2015/9/8/chartex" xmlns:cx2="http://schemas.microsoft.com/office/drawing/2015/10/21/chartex" xmlns:cx3="http://schemas.microsoft.com/office/drawing/2016/5/9/chartex" xmlns:cx4="http://schemas.microsoft.com/office/drawing/2016/5/10/chartex" xmlns:cx5="http://schemas.microsoft.com/office/drawing/2016/5/11/chartex" xmlns:cx6="http://schemas.microsoft.com/office/drawing/2016/5/12/chartex" xmlns:cx7="http://schemas.microsoft.com/office/drawing/2016/5/13/chartex" xmlns:cx8="http://schemas.microsoft.com/office/drawing/2016/5/14/chartex" xmlns:mc="http://schemas.openxmlformats.org/markup-compatibility/2006" xmlns:aink="http://schemas.microsoft.com/office/drawing/2016/ink" xmlns:am3d="http://schemas.microsoft.com/office/drawing/2017/model3d" xmlns:o="urn:schemas-microsoft-com:office:office" xmlns:oel="http://schemas.microsoft.com/office/2019/extlst" xmlns:r="http://schemas.openxmlformats.org/officeDocument/2006/relationships" xmlns:m="http://schemas.openxmlformats.org/officeDocument/2006/math" xmlns:v="urn:schemas-microsoft-com:vml" xmlns:wp14="http://schemas.microsoft.com/office/word/2010/wordprocessingDrawing" xmlns:wp="http://schemas.openxmlformats.org/drawingml/2006/wordprocessingDrawing" xmlns:w10="urn:schemas-microsoft-com:office:word" xmlns:w="http://schemas.openxmlformats.org/wordprocessingml/2006/main" xmlns:w14="http://schemas.microsoft.com/office/word/2010/wordml" xmlns:w15="http://schemas.microsoft.com/office/word/2012/wordml" xmlns:w16cex="http://schemas.microsoft.com/office/word/2018/wordml/cex" xmlns:w16cid="http://schemas.microsoft.com/office/word/2016/wordml/cid" xmlns:w16="http://schemas.microsoft.com/office/word/2018/wordml" xmlns:w16du="http://schemas.microsoft.com/office/word/2023/wordml/word16du" xmlns:w16sdtdh="http://schemas.microsoft.com/office/word/2020/wordml/sdtdatahash" xmlns:w16sdtfl="http://schemas.microsoft.com/office/word/2024/wordml/sdtformatlock" xmlns:w16se="http://schemas.microsoft.com/office/word/2015/wordml/symex" xmlns:wpg="http://schemas.microsoft.com/office/word/2010/wordprocessingGroup" xmlns:wpi="http://schemas.microsoft.com/office/word/2010/wordprocessingInk" xmlns:wne="http://schemas.microsoft.com/office/word/2006/wordml" xmlns:wps="http://schemas.microsoft.com/office/word/2010/wordprocessingShape" mc:Ignorable="w14 w15 w16se w16cid w16 w16cex w16sdtdh w16sdtfl w16du wp14">
   <w:p>
     <w:pPr>
       <w:pStyle w:val="Header"/>
@@ -10892,7 +10762,7 @@
 </file>
 
 <file path=word/header4.xml><?xml version="1.0" encoding="utf-8"?>
-<w:hdr xmlns:wpc="http://schemas.microsoft.com/office/word/2010/wordprocessingCanvas" xmlns:cx="http://schemas.microsoft.com/office/drawing/2014/chartex" xmlns:cx1="http://schemas.microsoft.com/office/drawing/2015/9/8/chartex" xmlns:cx2="http://schemas.microsoft.com/office/drawing/2015/10/21/chartex" xmlns:cx3="http://schemas.microsoft.com/office/drawing/2016/5/9/chartex" xmlns:cx4="http://schemas.microsoft.com/office/drawing/2016/5/10/chartex" xmlns:cx5="http://schemas.microsoft.com/office/drawing/2016/5/11/chartex" xmlns:cx6="http://schemas.microsoft.com/office/drawing/2016/5/12/chartex" xmlns:cx7="http://schemas.microsoft.com/office/drawing/2016/5/13/chartex" xmlns:cx8="http://schemas.microsoft.com/office/drawing/2016/5/14/chartex" xmlns:mc="http://schemas.openxmlformats.org/markup-compatibility/2006" xmlns:aink="http://schemas.microsoft.com/office/drawing/2016/ink" xmlns:am3d="http://schemas.microsoft.com/office/drawing/2017/model3d" xmlns:o="urn:schemas-microsoft-com:office:office" xmlns:oel="http://schemas.microsoft.com/office/2019/extlst" xmlns:r="http://schemas.openxmlformats.org/officeDocument/2006/relationships" xmlns:m="http://schemas.openxmlformats.org/officeDocument/2006/math" xmlns:v="urn:schemas-microsoft-com:vml" xmlns:wp14="http://schemas.microsoft.com/office/word/2010/wordprocessingDrawing" xmlns:wp="http://schemas.openxmlformats.org/drawingml/2006/wordprocessingDrawing" xmlns:w10="urn:schemas-microsoft-com:office:word" xmlns:w="http://schemas.openxmlformats.org/wordprocessingml/2006/main" xmlns:w14="http://schemas.microsoft.com/office/word/2010/wordml" xmlns:w15="http://schemas.microsoft.com/office/word/2012/wordml" xmlns:w16cex="http://schemas.microsoft.com/office/word/2018/wordml/cex" xmlns:w16cid="http://schemas.microsoft.com/office/word/2016/wordml/cid" xmlns:w16="http://schemas.microsoft.com/office/word/2018/wordml" xmlns:w16du="http://schemas.microsoft.com/office/word/2023/wordml/word16du" xmlns:w16sdtdh="http://schemas.microsoft.com/office/word/2020/wordml/sdtdatahash" xmlns:w16se="http://schemas.microsoft.com/office/word/2015/wordml/symex" xmlns:wpg="http://schemas.microsoft.com/office/word/2010/wordprocessingGroup" xmlns:wpi="http://schemas.microsoft.com/office/word/2010/wordprocessingInk" xmlns:wne="http://schemas.microsoft.com/office/word/2006/wordml" xmlns:wps="http://schemas.microsoft.com/office/word/2010/wordprocessingShape" mc:Ignorable="w14 w15 w16se w16cid w16 w16cex w16sdtdh w16du wp14">
+<w:hdr xmlns:wpc="http://schemas.microsoft.com/office/word/2010/wordprocessingCanvas" xmlns:cx="http://schemas.microsoft.com/office/drawing/2014/chartex" xmlns:cx1="http://schemas.microsoft.com/office/drawing/2015/9/8/chartex" xmlns:cx2="http://schemas.microsoft.com/office/drawing/2015/10/21/chartex" xmlns:cx3="http://schemas.microsoft.com/office/drawing/2016/5/9/chartex" xmlns:cx4="http://schemas.microsoft.com/office/drawing/2016/5/10/chartex" xmlns:cx5="http://schemas.microsoft.com/office/drawing/2016/5/11/chartex" xmlns:cx6="http://schemas.microsoft.com/office/drawing/2016/5/12/chartex" xmlns:cx7="http://schemas.microsoft.com/office/drawing/2016/5/13/chartex" xmlns:cx8="http://schemas.microsoft.com/office/drawing/2016/5/14/chartex" xmlns:mc="http://schemas.openxmlformats.org/markup-compatibility/2006" xmlns:aink="http://schemas.microsoft.com/office/drawing/2016/ink" xmlns:am3d="http://schemas.microsoft.com/office/drawing/2017/model3d" xmlns:o="urn:schemas-microsoft-com:office:office" xmlns:oel="http://schemas.microsoft.com/office/2019/extlst" xmlns:r="http://schemas.openxmlformats.org/officeDocument/2006/relationships" xmlns:m="http://schemas.openxmlformats.org/officeDocument/2006/math" xmlns:v="urn:schemas-microsoft-com:vml" xmlns:wp14="http://schemas.microsoft.com/office/word/2010/wordprocessingDrawing" xmlns:wp="http://schemas.openxmlformats.org/drawingml/2006/wordprocessingDrawing" xmlns:w10="urn:schemas-microsoft-com:office:word" xmlns:w="http://schemas.openxmlformats.org/wordprocessingml/2006/main" xmlns:w14="http://schemas.microsoft.com/office/word/2010/wordml" xmlns:w15="http://schemas.microsoft.com/office/word/2012/wordml" xmlns:w16cex="http://schemas.microsoft.com/office/word/2018/wordml/cex" xmlns:w16cid="http://schemas.microsoft.com/office/word/2016/wordml/cid" xmlns:w16="http://schemas.microsoft.com/office/word/2018/wordml" xmlns:w16du="http://schemas.microsoft.com/office/word/2023/wordml/word16du" xmlns:w16sdtdh="http://schemas.microsoft.com/office/word/2020/wordml/sdtdatahash" xmlns:w16sdtfl="http://schemas.microsoft.com/office/word/2024/wordml/sdtformatlock" xmlns:w16se="http://schemas.microsoft.com/office/word/2015/wordml/symex" xmlns:wpg="http://schemas.microsoft.com/office/word/2010/wordprocessingGroup" xmlns:wpi="http://schemas.microsoft.com/office/word/2010/wordprocessingInk" xmlns:wne="http://schemas.microsoft.com/office/word/2006/wordml" xmlns:wps="http://schemas.microsoft.com/office/word/2010/wordprocessingShape" mc:Ignorable="w14 w15 w16se w16cid w16 w16cex w16sdtdh w16sdtfl w16du wp14">
   <w:p>
     <w:pPr>
       <w:pStyle w:val="Header"/>
@@ -10902,7 +10772,7 @@
 </file>
 
 <file path=word/header5.xml><?xml version="1.0" encoding="utf-8"?>
-<w:hdr xmlns:wpc="http://schemas.microsoft.com/office/word/2010/wordprocessingCanvas" xmlns:cx="http://schemas.microsoft.com/office/drawing/2014/chartex" xmlns:cx1="http://schemas.microsoft.com/office/drawing/2015/9/8/chartex" xmlns:cx2="http://schemas.microsoft.com/office/drawing/2015/10/21/chartex" xmlns:cx3="http://schemas.microsoft.com/office/drawing/2016/5/9/chartex" xmlns:cx4="http://schemas.microsoft.com/office/drawing/2016/5/10/chartex" xmlns:cx5="http://schemas.microsoft.com/office/drawing/2016/5/11/chartex" xmlns:cx6="http://schemas.microsoft.com/office/drawing/2016/5/12/chartex" xmlns:cx7="http://schemas.microsoft.com/office/drawing/2016/5/13/chartex" xmlns:cx8="http://schemas.microsoft.com/office/drawing/2016/5/14/chartex" xmlns:mc="http://schemas.openxmlformats.org/markup-compatibility/2006" xmlns:aink="http://schemas.microsoft.com/office/drawing/2016/ink" xmlns:am3d="http://schemas.microsoft.com/office/drawing/2017/model3d" xmlns:o="urn:schemas-microsoft-com:office:office" xmlns:oel="http://schemas.microsoft.com/office/2019/extlst" xmlns:r="http://schemas.openxmlformats.org/officeDocument/2006/relationships" xmlns:m="http://schemas.openxmlformats.org/officeDocument/2006/math" xmlns:v="urn:schemas-microsoft-com:vml" xmlns:wp14="http://schemas.microsoft.com/office/word/2010/wordprocessingDrawing" xmlns:wp="http://schemas.openxmlformats.org/drawingml/2006/wordprocessingDrawing" xmlns:w10="urn:schemas-microsoft-com:office:word" xmlns:w="http://schemas.openxmlformats.org/wordprocessingml/2006/main" xmlns:w14="http://schemas.microsoft.com/office/word/2010/wordml" xmlns:w15="http://schemas.microsoft.com/office/word/2012/wordml" xmlns:w16cex="http://schemas.microsoft.com/office/word/2018/wordml/cex" xmlns:w16cid="http://schemas.microsoft.com/office/word/2016/wordml/cid" xmlns:w16="http://schemas.microsoft.com/office/word/2018/wordml" xmlns:w16du="http://schemas.microsoft.com/office/word/2023/wordml/word16du" xmlns:w16sdtdh="http://schemas.microsoft.com/office/word/2020/wordml/sdtdatahash" xmlns:w16se="http://schemas.microsoft.com/office/word/2015/wordml/symex" xmlns:wpg="http://schemas.microsoft.com/office/word/2010/wordprocessingGroup" xmlns:wpi="http://schemas.microsoft.com/office/word/2010/wordprocessingInk" xmlns:wne="http://schemas.microsoft.com/office/word/2006/wordml" xmlns:wps="http://schemas.microsoft.com/office/word/2010/wordprocessingShape" mc:Ignorable="w14 w15 w16se w16cid w16 w16cex w16sdtdh w16du wp14">
+<w:hdr xmlns:wpc="http://schemas.microsoft.com/office/word/2010/wordprocessingCanvas" xmlns:cx="http://schemas.microsoft.com/office/drawing/2014/chartex" xmlns:cx1="http://schemas.microsoft.com/office/drawing/2015/9/8/chartex" xmlns:cx2="http://schemas.microsoft.com/office/drawing/2015/10/21/chartex" xmlns:cx3="http://schemas.microsoft.com/office/drawing/2016/5/9/chartex" xmlns:cx4="http://schemas.microsoft.com/office/drawing/2016/5/10/chartex" xmlns:cx5="http://schemas.microsoft.com/office/drawing/2016/5/11/chartex" xmlns:cx6="http://schemas.microsoft.com/office/drawing/2016/5/12/chartex" xmlns:cx7="http://schemas.microsoft.com/office/drawing/2016/5/13/chartex" xmlns:cx8="http://schemas.microsoft.com/office/drawing/2016/5/14/chartex" xmlns:mc="http://schemas.openxmlformats.org/markup-compatibility/2006" xmlns:aink="http://schemas.microsoft.com/office/drawing/2016/ink" xmlns:am3d="http://schemas.microsoft.com/office/drawing/2017/model3d" xmlns:o="urn:schemas-microsoft-com:office:office" xmlns:oel="http://schemas.microsoft.com/office/2019/extlst" xmlns:r="http://schemas.openxmlformats.org/officeDocument/2006/relationships" xmlns:m="http://schemas.openxmlformats.org/officeDocument/2006/math" xmlns:v="urn:schemas-microsoft-com:vml" xmlns:wp14="http://schemas.microsoft.com/office/word/2010/wordprocessingDrawing" xmlns:wp="http://schemas.openxmlformats.org/drawingml/2006/wordprocessingDrawing" xmlns:w10="urn:schemas-microsoft-com:office:word" xmlns:w="http://schemas.openxmlformats.org/wordprocessingml/2006/main" xmlns:w14="http://schemas.microsoft.com/office/word/2010/wordml" xmlns:w15="http://schemas.microsoft.com/office/word/2012/wordml" xmlns:w16cex="http://schemas.microsoft.com/office/word/2018/wordml/cex" xmlns:w16cid="http://schemas.microsoft.com/office/word/2016/wordml/cid" xmlns:w16="http://schemas.microsoft.com/office/word/2018/wordml" xmlns:w16du="http://schemas.microsoft.com/office/word/2023/wordml/word16du" xmlns:w16sdtdh="http://schemas.microsoft.com/office/word/2020/wordml/sdtdatahash" xmlns:w16sdtfl="http://schemas.microsoft.com/office/word/2024/wordml/sdtformatlock" xmlns:w16se="http://schemas.microsoft.com/office/word/2015/wordml/symex" xmlns:wpg="http://schemas.microsoft.com/office/word/2010/wordprocessingGroup" xmlns:wpi="http://schemas.microsoft.com/office/word/2010/wordprocessingInk" xmlns:wne="http://schemas.microsoft.com/office/word/2006/wordml" xmlns:wps="http://schemas.microsoft.com/office/word/2010/wordprocessingShape" mc:Ignorable="w14 w15 w16se w16cid w16 w16cex w16sdtdh w16sdtfl w16du wp14">
   <w:p>
     <w:pPr>
       <w:pStyle w:val="Header"/>
@@ -10913,7 +10783,7 @@
 </file>
 
 <file path=word/header6.xml><?xml version="1.0" encoding="utf-8"?>
-<w:hdr xmlns:wpc="http://schemas.microsoft.com/office/word/2010/wordprocessingCanvas" xmlns:cx="http://schemas.microsoft.com/office/drawing/2014/chartex" xmlns:cx1="http://schemas.microsoft.com/office/drawing/2015/9/8/chartex" xmlns:cx2="http://schemas.microsoft.com/office/drawing/2015/10/21/chartex" xmlns:cx3="http://schemas.microsoft.com/office/drawing/2016/5/9/chartex" xmlns:cx4="http://schemas.microsoft.com/office/drawing/2016/5/10/chartex" xmlns:cx5="http://schemas.microsoft.com/office/drawing/2016/5/11/chartex" xmlns:cx6="http://schemas.microsoft.com/office/drawing/2016/5/12/chartex" xmlns:cx7="http://schemas.microsoft.com/office/drawing/2016/5/13/chartex" xmlns:cx8="http://schemas.microsoft.com/office/drawing/2016/5/14/chartex" xmlns:mc="http://schemas.openxmlformats.org/markup-compatibility/2006" xmlns:aink="http://schemas.microsoft.com/office/drawing/2016/ink" xmlns:am3d="http://schemas.microsoft.com/office/drawing/2017/model3d" xmlns:o="urn:schemas-microsoft-com:office:office" xmlns:oel="http://schemas.microsoft.com/office/2019/extlst" xmlns:r="http://schemas.openxmlformats.org/officeDocument/2006/relationships" xmlns:m="http://schemas.openxmlformats.org/officeDocument/2006/math" xmlns:v="urn:schemas-microsoft-com:vml" xmlns:wp14="http://schemas.microsoft.com/office/word/2010/wordprocessingDrawing" xmlns:wp="http://schemas.openxmlformats.org/drawingml/2006/wordprocessingDrawing" xmlns:w10="urn:schemas-microsoft-com:office:word" xmlns:w="http://schemas.openxmlformats.org/wordprocessingml/2006/main" xmlns:w14="http://schemas.microsoft.com/office/word/2010/wordml" xmlns:w15="http://schemas.microsoft.com/office/word/2012/wordml" xmlns:w16cex="http://schemas.microsoft.com/office/word/2018/wordml/cex" xmlns:w16cid="http://schemas.microsoft.com/office/word/2016/wordml/cid" xmlns:w16="http://schemas.microsoft.com/office/word/2018/wordml" xmlns:w16du="http://schemas.microsoft.com/office/word/2023/wordml/word16du" xmlns:w16sdtdh="http://schemas.microsoft.com/office/word/2020/wordml/sdtdatahash" xmlns:w16se="http://schemas.microsoft.com/office/word/2015/wordml/symex" xmlns:wpg="http://schemas.microsoft.com/office/word/2010/wordprocessingGroup" xmlns:wpi="http://schemas.microsoft.com/office/word/2010/wordprocessingInk" xmlns:wne="http://schemas.microsoft.com/office/word/2006/wordml" xmlns:wps="http://schemas.microsoft.com/office/word/2010/wordprocessingShape" mc:Ignorable="w14 w15 w16se w16cid w16 w16cex w16sdtdh w16du wp14">
+<w:hdr xmlns:wpc="http://schemas.microsoft.com/office/word/2010/wordprocessingCanvas" xmlns:cx="http://schemas.microsoft.com/office/drawing/2014/chartex" xmlns:cx1="http://schemas.microsoft.com/office/drawing/2015/9/8/chartex" xmlns:cx2="http://schemas.microsoft.com/office/drawing/2015/10/21/chartex" xmlns:cx3="http://schemas.microsoft.com/office/drawing/2016/5/9/chartex" xmlns:cx4="http://schemas.microsoft.com/office/drawing/2016/5/10/chartex" xmlns:cx5="http://schemas.microsoft.com/office/drawing/2016/5/11/chartex" xmlns:cx6="http://schemas.microsoft.com/office/drawing/2016/5/12/chartex" xmlns:cx7="http://schemas.microsoft.com/office/drawing/2016/5/13/chartex" xmlns:cx8="http://schemas.microsoft.com/office/drawing/2016/5/14/chartex" xmlns:mc="http://schemas.openxmlformats.org/markup-compatibility/2006" xmlns:aink="http://schemas.microsoft.com/office/drawing/2016/ink" xmlns:am3d="http://schemas.microsoft.com/office/drawing/2017/model3d" xmlns:o="urn:schemas-microsoft-com:office:office" xmlns:oel="http://schemas.microsoft.com/office/2019/extlst" xmlns:r="http://schemas.openxmlformats.org/officeDocument/2006/relationships" xmlns:m="http://schemas.openxmlformats.org/officeDocument/2006/math" xmlns:v="urn:schemas-microsoft-com:vml" xmlns:wp14="http://schemas.microsoft.com/office/word/2010/wordprocessingDrawing" xmlns:wp="http://schemas.openxmlformats.org/drawingml/2006/wordprocessingDrawing" xmlns:w10="urn:schemas-microsoft-com:office:word" xmlns:w="http://schemas.openxmlformats.org/wordprocessingml/2006/main" xmlns:w14="http://schemas.microsoft.com/office/word/2010/wordml" xmlns:w15="http://schemas.microsoft.com/office/word/2012/wordml" xmlns:w16cex="http://schemas.microsoft.com/office/word/2018/wordml/cex" xmlns:w16cid="http://schemas.microsoft.com/office/word/2016/wordml/cid" xmlns:w16="http://schemas.microsoft.com/office/word/2018/wordml" xmlns:w16du="http://schemas.microsoft.com/office/word/2023/wordml/word16du" xmlns:w16sdtdh="http://schemas.microsoft.com/office/word/2020/wordml/sdtdatahash" xmlns:w16sdtfl="http://schemas.microsoft.com/office/word/2024/wordml/sdtformatlock" xmlns:w16se="http://schemas.microsoft.com/office/word/2015/wordml/symex" xmlns:wpg="http://schemas.microsoft.com/office/word/2010/wordprocessingGroup" xmlns:wpi="http://schemas.microsoft.com/office/word/2010/wordprocessingInk" xmlns:wne="http://schemas.microsoft.com/office/word/2006/wordml" xmlns:wps="http://schemas.microsoft.com/office/word/2010/wordprocessingShape" mc:Ignorable="w14 w15 w16se w16cid w16 w16cex w16sdtdh w16sdtfl w16du wp14">
   <w:p>
     <w:pPr>
       <w:pStyle w:val="SAGEHeader"/>
@@ -10940,7 +10810,7 @@
       <w:rPr>
         <w:noProof/>
       </w:rPr>
-      <w:t>Installing the Wizard</w:t>
+      <w:t>Using the Wizard - Web Solution Type Path</w:t>
     </w:r>
     <w:r>
       <w:rPr>
@@ -10953,7 +10823,7 @@
 </file>
 
 <file path=word/header7.xml><?xml version="1.0" encoding="utf-8"?>
-<w:hdr xmlns:wpc="http://schemas.microsoft.com/office/word/2010/wordprocessingCanvas" xmlns:cx="http://schemas.microsoft.com/office/drawing/2014/chartex" xmlns:cx1="http://schemas.microsoft.com/office/drawing/2015/9/8/chartex" xmlns:cx2="http://schemas.microsoft.com/office/drawing/2015/10/21/chartex" xmlns:cx3="http://schemas.microsoft.com/office/drawing/2016/5/9/chartex" xmlns:cx4="http://schemas.microsoft.com/office/drawing/2016/5/10/chartex" xmlns:cx5="http://schemas.microsoft.com/office/drawing/2016/5/11/chartex" xmlns:cx6="http://schemas.microsoft.com/office/drawing/2016/5/12/chartex" xmlns:cx7="http://schemas.microsoft.com/office/drawing/2016/5/13/chartex" xmlns:cx8="http://schemas.microsoft.com/office/drawing/2016/5/14/chartex" xmlns:mc="http://schemas.openxmlformats.org/markup-compatibility/2006" xmlns:aink="http://schemas.microsoft.com/office/drawing/2016/ink" xmlns:am3d="http://schemas.microsoft.com/office/drawing/2017/model3d" xmlns:o="urn:schemas-microsoft-com:office:office" xmlns:oel="http://schemas.microsoft.com/office/2019/extlst" xmlns:r="http://schemas.openxmlformats.org/officeDocument/2006/relationships" xmlns:m="http://schemas.openxmlformats.org/officeDocument/2006/math" xmlns:v="urn:schemas-microsoft-com:vml" xmlns:wp14="http://schemas.microsoft.com/office/word/2010/wordprocessingDrawing" xmlns:wp="http://schemas.openxmlformats.org/drawingml/2006/wordprocessingDrawing" xmlns:w10="urn:schemas-microsoft-com:office:word" xmlns:w="http://schemas.openxmlformats.org/wordprocessingml/2006/main" xmlns:w14="http://schemas.microsoft.com/office/word/2010/wordml" xmlns:w15="http://schemas.microsoft.com/office/word/2012/wordml" xmlns:w16cex="http://schemas.microsoft.com/office/word/2018/wordml/cex" xmlns:w16cid="http://schemas.microsoft.com/office/word/2016/wordml/cid" xmlns:w16="http://schemas.microsoft.com/office/word/2018/wordml" xmlns:w16du="http://schemas.microsoft.com/office/word/2023/wordml/word16du" xmlns:w16sdtdh="http://schemas.microsoft.com/office/word/2020/wordml/sdtdatahash" xmlns:w16se="http://schemas.microsoft.com/office/word/2015/wordml/symex" xmlns:wpg="http://schemas.microsoft.com/office/word/2010/wordprocessingGroup" xmlns:wpi="http://schemas.microsoft.com/office/word/2010/wordprocessingInk" xmlns:wne="http://schemas.microsoft.com/office/word/2006/wordml" xmlns:wps="http://schemas.microsoft.com/office/word/2010/wordprocessingShape" mc:Ignorable="w14 w15 w16se w16cid w16 w16cex w16sdtdh w16du wp14">
+<w:hdr xmlns:wpc="http://schemas.microsoft.com/office/word/2010/wordprocessingCanvas" xmlns:cx="http://schemas.microsoft.com/office/drawing/2014/chartex" xmlns:cx1="http://schemas.microsoft.com/office/drawing/2015/9/8/chartex" xmlns:cx2="http://schemas.microsoft.com/office/drawing/2015/10/21/chartex" xmlns:cx3="http://schemas.microsoft.com/office/drawing/2016/5/9/chartex" xmlns:cx4="http://schemas.microsoft.com/office/drawing/2016/5/10/chartex" xmlns:cx5="http://schemas.microsoft.com/office/drawing/2016/5/11/chartex" xmlns:cx6="http://schemas.microsoft.com/office/drawing/2016/5/12/chartex" xmlns:cx7="http://schemas.microsoft.com/office/drawing/2016/5/13/chartex" xmlns:cx8="http://schemas.microsoft.com/office/drawing/2016/5/14/chartex" xmlns:mc="http://schemas.openxmlformats.org/markup-compatibility/2006" xmlns:aink="http://schemas.microsoft.com/office/drawing/2016/ink" xmlns:am3d="http://schemas.microsoft.com/office/drawing/2017/model3d" xmlns:o="urn:schemas-microsoft-com:office:office" xmlns:oel="http://schemas.microsoft.com/office/2019/extlst" xmlns:r="http://schemas.openxmlformats.org/officeDocument/2006/relationships" xmlns:m="http://schemas.openxmlformats.org/officeDocument/2006/math" xmlns:v="urn:schemas-microsoft-com:vml" xmlns:wp14="http://schemas.microsoft.com/office/word/2010/wordprocessingDrawing" xmlns:wp="http://schemas.openxmlformats.org/drawingml/2006/wordprocessingDrawing" xmlns:w10="urn:schemas-microsoft-com:office:word" xmlns:w="http://schemas.openxmlformats.org/wordprocessingml/2006/main" xmlns:w14="http://schemas.microsoft.com/office/word/2010/wordml" xmlns:w15="http://schemas.microsoft.com/office/word/2012/wordml" xmlns:w16cex="http://schemas.microsoft.com/office/word/2018/wordml/cex" xmlns:w16cid="http://schemas.microsoft.com/office/word/2016/wordml/cid" xmlns:w16="http://schemas.microsoft.com/office/word/2018/wordml" xmlns:w16du="http://schemas.microsoft.com/office/word/2023/wordml/word16du" xmlns:w16sdtdh="http://schemas.microsoft.com/office/word/2020/wordml/sdtdatahash" xmlns:w16sdtfl="http://schemas.microsoft.com/office/word/2024/wordml/sdtformatlock" xmlns:w16se="http://schemas.microsoft.com/office/word/2015/wordml/symex" xmlns:wpg="http://schemas.microsoft.com/office/word/2010/wordprocessingGroup" xmlns:wpi="http://schemas.microsoft.com/office/word/2010/wordprocessingInk" xmlns:wne="http://schemas.microsoft.com/office/word/2006/wordml" xmlns:wps="http://schemas.microsoft.com/office/word/2010/wordprocessingShape" mc:Ignorable="w14 w15 w16se w16cid w16 w16cex w16sdtdh w16sdtfl w16du wp14">
   <w:p>
     <w:pPr>
       <w:pStyle w:val="Header"/>
@@ -10963,7 +10833,7 @@
 </file>
 
 <file path=word/numbering.xml><?xml version="1.0" encoding="utf-8"?>
-<w:numbering xmlns:wpc="http://schemas.microsoft.com/office/word/2010/wordprocessingCanvas" xmlns:cx="http://schemas.microsoft.com/office/drawing/2014/chartex" xmlns:cx1="http://schemas.microsoft.com/office/drawing/2015/9/8/chartex" xmlns:cx2="http://schemas.microsoft.com/office/drawing/2015/10/21/chartex" xmlns:cx3="http://schemas.microsoft.com/office/drawing/2016/5/9/chartex" xmlns:cx4="http://schemas.microsoft.com/office/drawing/2016/5/10/chartex" xmlns:cx5="http://schemas.microsoft.com/office/drawing/2016/5/11/chartex" xmlns:cx6="http://schemas.microsoft.com/office/drawing/2016/5/12/chartex" xmlns:cx7="http://schemas.microsoft.com/office/drawing/2016/5/13/chartex" xmlns:cx8="http://schemas.microsoft.com/office/drawing/2016/5/14/chartex" xmlns:mc="http://schemas.openxmlformats.org/markup-compatibility/2006" xmlns:aink="http://schemas.microsoft.com/office/drawing/2016/ink" xmlns:am3d="http://schemas.microsoft.com/office/drawing/2017/model3d" xmlns:o="urn:schemas-microsoft-com:office:office" xmlns:oel="http://schemas.microsoft.com/office/2019/extlst" xmlns:r="http://schemas.openxmlformats.org/officeDocument/2006/relationships" xmlns:m="http://schemas.openxmlformats.org/officeDocument/2006/math" xmlns:v="urn:schemas-microsoft-com:vml" xmlns:wp14="http://schemas.microsoft.com/office/word/2010/wordprocessingDrawing" xmlns:wp="http://schemas.openxmlformats.org/drawingml/2006/wordprocessingDrawing" xmlns:w10="urn:schemas-microsoft-com:office:word" xmlns:w="http://schemas.openxmlformats.org/wordprocessingml/2006/main" xmlns:w14="http://schemas.microsoft.com/office/word/2010/wordml" xmlns:w15="http://schemas.microsoft.com/office/word/2012/wordml" xmlns:w16cex="http://schemas.microsoft.com/office/word/2018/wordml/cex" xmlns:w16cid="http://schemas.microsoft.com/office/word/2016/wordml/cid" xmlns:w16="http://schemas.microsoft.com/office/word/2018/wordml" xmlns:w16du="http://schemas.microsoft.com/office/word/2023/wordml/word16du" xmlns:w16sdtdh="http://schemas.microsoft.com/office/word/2020/wordml/sdtdatahash" xmlns:w16se="http://schemas.microsoft.com/office/word/2015/wordml/symex" xmlns:wpg="http://schemas.microsoft.com/office/word/2010/wordprocessingGroup" xmlns:wpi="http://schemas.microsoft.com/office/word/2010/wordprocessingInk" xmlns:wne="http://schemas.microsoft.com/office/word/2006/wordml" xmlns:wps="http://schemas.microsoft.com/office/word/2010/wordprocessingShape" mc:Ignorable="w14 w15 w16se w16cid w16 w16cex w16sdtdh w16du wp14">
+<w:numbering xmlns:wpc="http://schemas.microsoft.com/office/word/2010/wordprocessingCanvas" xmlns:cx="http://schemas.microsoft.com/office/drawing/2014/chartex" xmlns:cx1="http://schemas.microsoft.com/office/drawing/2015/9/8/chartex" xmlns:cx2="http://schemas.microsoft.com/office/drawing/2015/10/21/chartex" xmlns:cx3="http://schemas.microsoft.com/office/drawing/2016/5/9/chartex" xmlns:cx4="http://schemas.microsoft.com/office/drawing/2016/5/10/chartex" xmlns:cx5="http://schemas.microsoft.com/office/drawing/2016/5/11/chartex" xmlns:cx6="http://schemas.microsoft.com/office/drawing/2016/5/12/chartex" xmlns:cx7="http://schemas.microsoft.com/office/drawing/2016/5/13/chartex" xmlns:cx8="http://schemas.microsoft.com/office/drawing/2016/5/14/chartex" xmlns:mc="http://schemas.openxmlformats.org/markup-compatibility/2006" xmlns:aink="http://schemas.microsoft.com/office/drawing/2016/ink" xmlns:am3d="http://schemas.microsoft.com/office/drawing/2017/model3d" xmlns:o="urn:schemas-microsoft-com:office:office" xmlns:oel="http://schemas.microsoft.com/office/2019/extlst" xmlns:r="http://schemas.openxmlformats.org/officeDocument/2006/relationships" xmlns:m="http://schemas.openxmlformats.org/officeDocument/2006/math" xmlns:v="urn:schemas-microsoft-com:vml" xmlns:wp14="http://schemas.microsoft.com/office/word/2010/wordprocessingDrawing" xmlns:wp="http://schemas.openxmlformats.org/drawingml/2006/wordprocessingDrawing" xmlns:w10="urn:schemas-microsoft-com:office:word" xmlns:w="http://schemas.openxmlformats.org/wordprocessingml/2006/main" xmlns:w14="http://schemas.microsoft.com/office/word/2010/wordml" xmlns:w15="http://schemas.microsoft.com/office/word/2012/wordml" xmlns:w16cex="http://schemas.microsoft.com/office/word/2018/wordml/cex" xmlns:w16cid="http://schemas.microsoft.com/office/word/2016/wordml/cid" xmlns:w16="http://schemas.microsoft.com/office/word/2018/wordml" xmlns:w16du="http://schemas.microsoft.com/office/word/2023/wordml/word16du" xmlns:w16sdtdh="http://schemas.microsoft.com/office/word/2020/wordml/sdtdatahash" xmlns:w16sdtfl="http://schemas.microsoft.com/office/word/2024/wordml/sdtformatlock" xmlns:w16se="http://schemas.microsoft.com/office/word/2015/wordml/symex" xmlns:wpg="http://schemas.microsoft.com/office/word/2010/wordprocessingGroup" xmlns:wpi="http://schemas.microsoft.com/office/word/2010/wordprocessingInk" xmlns:wne="http://schemas.microsoft.com/office/word/2006/wordml" xmlns:wps="http://schemas.microsoft.com/office/word/2010/wordprocessingShape" mc:Ignorable="w14 w15 w16se w16cid w16 w16cex w16sdtdh w16sdtfl w16du wp14">
   <w:numPicBullet w:numPicBulletId="0">
     <w:pict>
       <v:shapetype id="_x0000_t75" coordsize="21600,21600" o:spt="75" o:preferrelative="t" path="m@4@5l@4@11@9@11@9@5xe" filled="f" stroked="f">
@@ -10985,15 +10855,8 @@
         <v:path o:extrusionok="f" gradientshapeok="t" o:connecttype="rect"/>
         <o:lock v:ext="edit" aspectratio="t"/>
       </v:shapetype>
-      <v:shape id="_x0000_i1108" type="#_x0000_t75" style="width:20.25pt;height:20.25pt" o:bullet="t">
+      <v:shape id="_x0000_i1025" type="#_x0000_t75" style="width:21.6pt;height:21.6pt" o:bullet="t">
         <v:imagedata r:id="rId1" o:title="clip_image001"/>
-      </v:shape>
-    </w:pict>
-  </w:numPicBullet>
-  <w:numPicBullet w:numPicBulletId="1">
-    <w:pict>
-      <v:shape id="_x0000_i1109" type="#_x0000_t75" style="width:118.5pt;height:118.5pt" o:bullet="t">
-        <v:imagedata r:id="rId2" o:title="clip_image002"/>
       </v:shape>
     </w:pict>
   </w:numPicBullet>
@@ -11723,406 +11586,6 @@
     </w:lvl>
   </w:abstractNum>
   <w:abstractNum w:abstractNumId="14" w15:restartNumberingAfterBreak="0">
-    <w:nsid w:val="21685289"/>
-    <w:multiLevelType w:val="hybridMultilevel"/>
-    <w:tmpl w:val="91C4AF44"/>
-    <w:lvl w:ilvl="0" w:tplc="B594996A">
-      <w:start w:val="1"/>
-      <w:numFmt w:val="bullet"/>
-      <w:lvlText w:val=""/>
-      <w:lvlPicBulletId w:val="1"/>
-      <w:lvlJc w:val="left"/>
-      <w:pPr>
-        <w:ind w:left="360" w:hanging="360"/>
-      </w:pPr>
-      <w:rPr>
-        <w:rFonts w:ascii="Symbol" w:hAnsi="Symbol" w:hint="default"/>
-        <w:color w:val="auto"/>
-      </w:rPr>
-    </w:lvl>
-    <w:lvl w:ilvl="1" w:tplc="08090003">
-      <w:start w:val="1"/>
-      <w:numFmt w:val="bullet"/>
-      <w:lvlText w:val="o"/>
-      <w:lvlJc w:val="left"/>
-      <w:pPr>
-        <w:ind w:left="1080" w:hanging="360"/>
-      </w:pPr>
-      <w:rPr>
-        <w:rFonts w:ascii="Courier New" w:hAnsi="Courier New" w:cs="Courier New" w:hint="default"/>
-      </w:rPr>
-    </w:lvl>
-    <w:lvl w:ilvl="2" w:tplc="08090005">
-      <w:start w:val="1"/>
-      <w:numFmt w:val="bullet"/>
-      <w:lvlText w:val=""/>
-      <w:lvlJc w:val="left"/>
-      <w:pPr>
-        <w:ind w:left="1800" w:hanging="360"/>
-      </w:pPr>
-      <w:rPr>
-        <w:rFonts w:ascii="Wingdings" w:hAnsi="Wingdings" w:hint="default"/>
-      </w:rPr>
-    </w:lvl>
-    <w:lvl w:ilvl="3" w:tplc="08090001">
-      <w:start w:val="1"/>
-      <w:numFmt w:val="bullet"/>
-      <w:lvlText w:val=""/>
-      <w:lvlJc w:val="left"/>
-      <w:pPr>
-        <w:ind w:left="2520" w:hanging="360"/>
-      </w:pPr>
-      <w:rPr>
-        <w:rFonts w:ascii="Symbol" w:hAnsi="Symbol" w:hint="default"/>
-      </w:rPr>
-    </w:lvl>
-    <w:lvl w:ilvl="4" w:tplc="08090003">
-      <w:start w:val="1"/>
-      <w:numFmt w:val="bullet"/>
-      <w:lvlText w:val="o"/>
-      <w:lvlJc w:val="left"/>
-      <w:pPr>
-        <w:ind w:left="3240" w:hanging="360"/>
-      </w:pPr>
-      <w:rPr>
-        <w:rFonts w:ascii="Courier New" w:hAnsi="Courier New" w:cs="Courier New" w:hint="default"/>
-      </w:rPr>
-    </w:lvl>
-    <w:lvl w:ilvl="5" w:tplc="08090005">
-      <w:start w:val="1"/>
-      <w:numFmt w:val="bullet"/>
-      <w:lvlText w:val=""/>
-      <w:lvlJc w:val="left"/>
-      <w:pPr>
-        <w:ind w:left="3960" w:hanging="360"/>
-      </w:pPr>
-      <w:rPr>
-        <w:rFonts w:ascii="Wingdings" w:hAnsi="Wingdings" w:hint="default"/>
-      </w:rPr>
-    </w:lvl>
-    <w:lvl w:ilvl="6" w:tplc="08090001">
-      <w:start w:val="1"/>
-      <w:numFmt w:val="bullet"/>
-      <w:lvlText w:val=""/>
-      <w:lvlJc w:val="left"/>
-      <w:pPr>
-        <w:ind w:left="4680" w:hanging="360"/>
-      </w:pPr>
-      <w:rPr>
-        <w:rFonts w:ascii="Symbol" w:hAnsi="Symbol" w:hint="default"/>
-      </w:rPr>
-    </w:lvl>
-    <w:lvl w:ilvl="7" w:tplc="08090003">
-      <w:start w:val="1"/>
-      <w:numFmt w:val="bullet"/>
-      <w:lvlText w:val="o"/>
-      <w:lvlJc w:val="left"/>
-      <w:pPr>
-        <w:ind w:left="5400" w:hanging="360"/>
-      </w:pPr>
-      <w:rPr>
-        <w:rFonts w:ascii="Courier New" w:hAnsi="Courier New" w:cs="Courier New" w:hint="default"/>
-      </w:rPr>
-    </w:lvl>
-    <w:lvl w:ilvl="8" w:tplc="08090005">
-      <w:start w:val="1"/>
-      <w:numFmt w:val="bullet"/>
-      <w:lvlText w:val=""/>
-      <w:lvlJc w:val="left"/>
-      <w:pPr>
-        <w:ind w:left="6120" w:hanging="360"/>
-      </w:pPr>
-      <w:rPr>
-        <w:rFonts w:ascii="Wingdings" w:hAnsi="Wingdings" w:hint="default"/>
-      </w:rPr>
-    </w:lvl>
-  </w:abstractNum>
-  <w:abstractNum w:abstractNumId="15" w15:restartNumberingAfterBreak="0">
-    <w:nsid w:val="23B8722D"/>
-    <w:multiLevelType w:val="hybridMultilevel"/>
-    <w:tmpl w:val="E29AC6E4"/>
-    <w:lvl w:ilvl="0" w:tplc="0409000F">
-      <w:start w:val="1"/>
-      <w:numFmt w:val="decimal"/>
-      <w:lvlText w:val="%1."/>
-      <w:lvlJc w:val="left"/>
-      <w:pPr>
-        <w:ind w:left="720" w:hanging="360"/>
-      </w:pPr>
-    </w:lvl>
-    <w:lvl w:ilvl="1" w:tplc="04090019" w:tentative="1">
-      <w:start w:val="1"/>
-      <w:numFmt w:val="lowerLetter"/>
-      <w:lvlText w:val="%2."/>
-      <w:lvlJc w:val="left"/>
-      <w:pPr>
-        <w:ind w:left="1440" w:hanging="360"/>
-      </w:pPr>
-    </w:lvl>
-    <w:lvl w:ilvl="2" w:tplc="0409001B" w:tentative="1">
-      <w:start w:val="1"/>
-      <w:numFmt w:val="lowerRoman"/>
-      <w:lvlText w:val="%3."/>
-      <w:lvlJc w:val="right"/>
-      <w:pPr>
-        <w:ind w:left="2160" w:hanging="180"/>
-      </w:pPr>
-    </w:lvl>
-    <w:lvl w:ilvl="3" w:tplc="0409000F" w:tentative="1">
-      <w:start w:val="1"/>
-      <w:numFmt w:val="decimal"/>
-      <w:lvlText w:val="%4."/>
-      <w:lvlJc w:val="left"/>
-      <w:pPr>
-        <w:ind w:left="2880" w:hanging="360"/>
-      </w:pPr>
-    </w:lvl>
-    <w:lvl w:ilvl="4" w:tplc="04090019" w:tentative="1">
-      <w:start w:val="1"/>
-      <w:numFmt w:val="lowerLetter"/>
-      <w:lvlText w:val="%5."/>
-      <w:lvlJc w:val="left"/>
-      <w:pPr>
-        <w:ind w:left="3600" w:hanging="360"/>
-      </w:pPr>
-    </w:lvl>
-    <w:lvl w:ilvl="5" w:tplc="0409001B" w:tentative="1">
-      <w:start w:val="1"/>
-      <w:numFmt w:val="lowerRoman"/>
-      <w:lvlText w:val="%6."/>
-      <w:lvlJc w:val="right"/>
-      <w:pPr>
-        <w:ind w:left="4320" w:hanging="180"/>
-      </w:pPr>
-    </w:lvl>
-    <w:lvl w:ilvl="6" w:tplc="0409000F" w:tentative="1">
-      <w:start w:val="1"/>
-      <w:numFmt w:val="decimal"/>
-      <w:lvlText w:val="%7."/>
-      <w:lvlJc w:val="left"/>
-      <w:pPr>
-        <w:ind w:left="5040" w:hanging="360"/>
-      </w:pPr>
-    </w:lvl>
-    <w:lvl w:ilvl="7" w:tplc="04090019" w:tentative="1">
-      <w:start w:val="1"/>
-      <w:numFmt w:val="lowerLetter"/>
-      <w:lvlText w:val="%8."/>
-      <w:lvlJc w:val="left"/>
-      <w:pPr>
-        <w:ind w:left="5760" w:hanging="360"/>
-      </w:pPr>
-    </w:lvl>
-    <w:lvl w:ilvl="8" w:tplc="0409001B" w:tentative="1">
-      <w:start w:val="1"/>
-      <w:numFmt w:val="lowerRoman"/>
-      <w:lvlText w:val="%9."/>
-      <w:lvlJc w:val="right"/>
-      <w:pPr>
-        <w:ind w:left="6480" w:hanging="180"/>
-      </w:pPr>
-    </w:lvl>
-  </w:abstractNum>
-  <w:abstractNum w:abstractNumId="16" w15:restartNumberingAfterBreak="0">
-    <w:nsid w:val="25904387"/>
-    <w:multiLevelType w:val="hybridMultilevel"/>
-    <w:tmpl w:val="9B7EB25A"/>
-    <w:lvl w:ilvl="0" w:tplc="04090001">
-      <w:start w:val="1"/>
-      <w:numFmt w:val="bullet"/>
-      <w:lvlText w:val=""/>
-      <w:lvlJc w:val="left"/>
-      <w:pPr>
-        <w:ind w:left="720" w:hanging="360"/>
-      </w:pPr>
-      <w:rPr>
-        <w:rFonts w:ascii="Symbol" w:hAnsi="Symbol" w:hint="default"/>
-      </w:rPr>
-    </w:lvl>
-    <w:lvl w:ilvl="1" w:tplc="04090003" w:tentative="1">
-      <w:start w:val="1"/>
-      <w:numFmt w:val="bullet"/>
-      <w:lvlText w:val="o"/>
-      <w:lvlJc w:val="left"/>
-      <w:pPr>
-        <w:ind w:left="1440" w:hanging="360"/>
-      </w:pPr>
-      <w:rPr>
-        <w:rFonts w:ascii="Courier New" w:hAnsi="Courier New" w:cs="Courier New" w:hint="default"/>
-      </w:rPr>
-    </w:lvl>
-    <w:lvl w:ilvl="2" w:tplc="04090005" w:tentative="1">
-      <w:start w:val="1"/>
-      <w:numFmt w:val="bullet"/>
-      <w:lvlText w:val=""/>
-      <w:lvlJc w:val="left"/>
-      <w:pPr>
-        <w:ind w:left="2160" w:hanging="360"/>
-      </w:pPr>
-      <w:rPr>
-        <w:rFonts w:ascii="Wingdings" w:hAnsi="Wingdings" w:hint="default"/>
-      </w:rPr>
-    </w:lvl>
-    <w:lvl w:ilvl="3" w:tplc="04090001" w:tentative="1">
-      <w:start w:val="1"/>
-      <w:numFmt w:val="bullet"/>
-      <w:lvlText w:val=""/>
-      <w:lvlJc w:val="left"/>
-      <w:pPr>
-        <w:ind w:left="2880" w:hanging="360"/>
-      </w:pPr>
-      <w:rPr>
-        <w:rFonts w:ascii="Symbol" w:hAnsi="Symbol" w:hint="default"/>
-      </w:rPr>
-    </w:lvl>
-    <w:lvl w:ilvl="4" w:tplc="04090003" w:tentative="1">
-      <w:start w:val="1"/>
-      <w:numFmt w:val="bullet"/>
-      <w:lvlText w:val="o"/>
-      <w:lvlJc w:val="left"/>
-      <w:pPr>
-        <w:ind w:left="3600" w:hanging="360"/>
-      </w:pPr>
-      <w:rPr>
-        <w:rFonts w:ascii="Courier New" w:hAnsi="Courier New" w:cs="Courier New" w:hint="default"/>
-      </w:rPr>
-    </w:lvl>
-    <w:lvl w:ilvl="5" w:tplc="04090005" w:tentative="1">
-      <w:start w:val="1"/>
-      <w:numFmt w:val="bullet"/>
-      <w:lvlText w:val=""/>
-      <w:lvlJc w:val="left"/>
-      <w:pPr>
-        <w:ind w:left="4320" w:hanging="360"/>
-      </w:pPr>
-      <w:rPr>
-        <w:rFonts w:ascii="Wingdings" w:hAnsi="Wingdings" w:hint="default"/>
-      </w:rPr>
-    </w:lvl>
-    <w:lvl w:ilvl="6" w:tplc="04090001" w:tentative="1">
-      <w:start w:val="1"/>
-      <w:numFmt w:val="bullet"/>
-      <w:lvlText w:val=""/>
-      <w:lvlJc w:val="left"/>
-      <w:pPr>
-        <w:ind w:left="5040" w:hanging="360"/>
-      </w:pPr>
-      <w:rPr>
-        <w:rFonts w:ascii="Symbol" w:hAnsi="Symbol" w:hint="default"/>
-      </w:rPr>
-    </w:lvl>
-    <w:lvl w:ilvl="7" w:tplc="04090003" w:tentative="1">
-      <w:start w:val="1"/>
-      <w:numFmt w:val="bullet"/>
-      <w:lvlText w:val="o"/>
-      <w:lvlJc w:val="left"/>
-      <w:pPr>
-        <w:ind w:left="5760" w:hanging="360"/>
-      </w:pPr>
-      <w:rPr>
-        <w:rFonts w:ascii="Courier New" w:hAnsi="Courier New" w:cs="Courier New" w:hint="default"/>
-      </w:rPr>
-    </w:lvl>
-    <w:lvl w:ilvl="8" w:tplc="04090005" w:tentative="1">
-      <w:start w:val="1"/>
-      <w:numFmt w:val="bullet"/>
-      <w:lvlText w:val=""/>
-      <w:lvlJc w:val="left"/>
-      <w:pPr>
-        <w:ind w:left="6480" w:hanging="360"/>
-      </w:pPr>
-      <w:rPr>
-        <w:rFonts w:ascii="Wingdings" w:hAnsi="Wingdings" w:hint="default"/>
-      </w:rPr>
-    </w:lvl>
-  </w:abstractNum>
-  <w:abstractNum w:abstractNumId="17" w15:restartNumberingAfterBreak="0">
-    <w:nsid w:val="2DBC305F"/>
-    <w:multiLevelType w:val="hybridMultilevel"/>
-    <w:tmpl w:val="D1AE8962"/>
-    <w:lvl w:ilvl="0" w:tplc="0809000F">
-      <w:start w:val="1"/>
-      <w:numFmt w:val="decimal"/>
-      <w:lvlText w:val="%1."/>
-      <w:lvlJc w:val="left"/>
-      <w:pPr>
-        <w:ind w:left="720" w:hanging="360"/>
-      </w:pPr>
-    </w:lvl>
-    <w:lvl w:ilvl="1" w:tplc="08090019" w:tentative="1">
-      <w:start w:val="1"/>
-      <w:numFmt w:val="lowerLetter"/>
-      <w:lvlText w:val="%2."/>
-      <w:lvlJc w:val="left"/>
-      <w:pPr>
-        <w:ind w:left="1440" w:hanging="360"/>
-      </w:pPr>
-    </w:lvl>
-    <w:lvl w:ilvl="2" w:tplc="0809001B" w:tentative="1">
-      <w:start w:val="1"/>
-      <w:numFmt w:val="lowerRoman"/>
-      <w:lvlText w:val="%3."/>
-      <w:lvlJc w:val="right"/>
-      <w:pPr>
-        <w:ind w:left="2160" w:hanging="180"/>
-      </w:pPr>
-    </w:lvl>
-    <w:lvl w:ilvl="3" w:tplc="0809000F" w:tentative="1">
-      <w:start w:val="1"/>
-      <w:numFmt w:val="decimal"/>
-      <w:lvlText w:val="%4."/>
-      <w:lvlJc w:val="left"/>
-      <w:pPr>
-        <w:ind w:left="2880" w:hanging="360"/>
-      </w:pPr>
-    </w:lvl>
-    <w:lvl w:ilvl="4" w:tplc="08090019" w:tentative="1">
-      <w:start w:val="1"/>
-      <w:numFmt w:val="lowerLetter"/>
-      <w:lvlText w:val="%5."/>
-      <w:lvlJc w:val="left"/>
-      <w:pPr>
-        <w:ind w:left="3600" w:hanging="360"/>
-      </w:pPr>
-    </w:lvl>
-    <w:lvl w:ilvl="5" w:tplc="0809001B" w:tentative="1">
-      <w:start w:val="1"/>
-      <w:numFmt w:val="lowerRoman"/>
-      <w:lvlText w:val="%6."/>
-      <w:lvlJc w:val="right"/>
-      <w:pPr>
-        <w:ind w:left="4320" w:hanging="180"/>
-      </w:pPr>
-    </w:lvl>
-    <w:lvl w:ilvl="6" w:tplc="0809000F" w:tentative="1">
-      <w:start w:val="1"/>
-      <w:numFmt w:val="decimal"/>
-      <w:lvlText w:val="%7."/>
-      <w:lvlJc w:val="left"/>
-      <w:pPr>
-        <w:ind w:left="5040" w:hanging="360"/>
-      </w:pPr>
-    </w:lvl>
-    <w:lvl w:ilvl="7" w:tplc="08090019" w:tentative="1">
-      <w:start w:val="1"/>
-      <w:numFmt w:val="lowerLetter"/>
-      <w:lvlText w:val="%8."/>
-      <w:lvlJc w:val="left"/>
-      <w:pPr>
-        <w:ind w:left="5760" w:hanging="360"/>
-      </w:pPr>
-    </w:lvl>
-    <w:lvl w:ilvl="8" w:tplc="0809001B" w:tentative="1">
-      <w:start w:val="1"/>
-      <w:numFmt w:val="lowerRoman"/>
-      <w:lvlText w:val="%9."/>
-      <w:lvlJc w:val="right"/>
-      <w:pPr>
-        <w:ind w:left="6480" w:hanging="180"/>
-      </w:pPr>
-    </w:lvl>
-  </w:abstractNum>
-  <w:abstractNum w:abstractNumId="18" w15:restartNumberingAfterBreak="0">
     <w:nsid w:val="35FD6700"/>
     <w:multiLevelType w:val="multilevel"/>
     <w:tmpl w:val="F34A106A"/>
@@ -12282,120 +11745,7 @@
       </w:rPr>
     </w:lvl>
   </w:abstractNum>
-  <w:abstractNum w:abstractNumId="19" w15:restartNumberingAfterBreak="0">
-    <w:nsid w:val="39262ABC"/>
-    <w:multiLevelType w:val="multilevel"/>
-    <w:tmpl w:val="2E6C6DA8"/>
-    <w:lvl w:ilvl="0">
-      <w:start w:val="3"/>
-      <w:numFmt w:val="decimal"/>
-      <w:lvlText w:val="%1"/>
-      <w:lvlJc w:val="left"/>
-      <w:pPr>
-        <w:ind w:left="420" w:hanging="420"/>
-      </w:pPr>
-      <w:rPr>
-        <w:rFonts w:hint="default"/>
-      </w:rPr>
-    </w:lvl>
-    <w:lvl w:ilvl="1">
-      <w:start w:val="1"/>
-      <w:numFmt w:val="decimal"/>
-      <w:lvlText w:val="%1.%2"/>
-      <w:lvlJc w:val="left"/>
-      <w:pPr>
-        <w:ind w:left="720" w:hanging="720"/>
-      </w:pPr>
-      <w:rPr>
-        <w:rFonts w:hint="default"/>
-      </w:rPr>
-    </w:lvl>
-    <w:lvl w:ilvl="2">
-      <w:start w:val="1"/>
-      <w:numFmt w:val="decimal"/>
-      <w:lvlText w:val="%1.%2.%3"/>
-      <w:lvlJc w:val="left"/>
-      <w:pPr>
-        <w:ind w:left="720" w:hanging="720"/>
-      </w:pPr>
-      <w:rPr>
-        <w:rFonts w:hint="default"/>
-      </w:rPr>
-    </w:lvl>
-    <w:lvl w:ilvl="3">
-      <w:start w:val="1"/>
-      <w:numFmt w:val="decimal"/>
-      <w:lvlText w:val="%1.%2.%3.%4"/>
-      <w:lvlJc w:val="left"/>
-      <w:pPr>
-        <w:ind w:left="1080" w:hanging="1080"/>
-      </w:pPr>
-      <w:rPr>
-        <w:rFonts w:hint="default"/>
-      </w:rPr>
-    </w:lvl>
-    <w:lvl w:ilvl="4">
-      <w:start w:val="1"/>
-      <w:numFmt w:val="decimal"/>
-      <w:lvlText w:val="%1.%2.%3.%4.%5"/>
-      <w:lvlJc w:val="left"/>
-      <w:pPr>
-        <w:ind w:left="1440" w:hanging="1440"/>
-      </w:pPr>
-      <w:rPr>
-        <w:rFonts w:hint="default"/>
-      </w:rPr>
-    </w:lvl>
-    <w:lvl w:ilvl="5">
-      <w:start w:val="1"/>
-      <w:numFmt w:val="decimal"/>
-      <w:lvlText w:val="%1.%2.%3.%4.%5.%6"/>
-      <w:lvlJc w:val="left"/>
-      <w:pPr>
-        <w:ind w:left="1440" w:hanging="1440"/>
-      </w:pPr>
-      <w:rPr>
-        <w:rFonts w:hint="default"/>
-      </w:rPr>
-    </w:lvl>
-    <w:lvl w:ilvl="6">
-      <w:start w:val="1"/>
-      <w:numFmt w:val="decimal"/>
-      <w:lvlText w:val="%1.%2.%3.%4.%5.%6.%7"/>
-      <w:lvlJc w:val="left"/>
-      <w:pPr>
-        <w:ind w:left="1800" w:hanging="1800"/>
-      </w:pPr>
-      <w:rPr>
-        <w:rFonts w:hint="default"/>
-      </w:rPr>
-    </w:lvl>
-    <w:lvl w:ilvl="7">
-      <w:start w:val="1"/>
-      <w:numFmt w:val="decimal"/>
-      <w:lvlText w:val="%1.%2.%3.%4.%5.%6.%7.%8"/>
-      <w:lvlJc w:val="left"/>
-      <w:pPr>
-        <w:ind w:left="2160" w:hanging="2160"/>
-      </w:pPr>
-      <w:rPr>
-        <w:rFonts w:hint="default"/>
-      </w:rPr>
-    </w:lvl>
-    <w:lvl w:ilvl="8">
-      <w:start w:val="1"/>
-      <w:numFmt w:val="decimal"/>
-      <w:lvlText w:val="%1.%2.%3.%4.%5.%6.%7.%8.%9"/>
-      <w:lvlJc w:val="left"/>
-      <w:pPr>
-        <w:ind w:left="2520" w:hanging="2520"/>
-      </w:pPr>
-      <w:rPr>
-        <w:rFonts w:hint="default"/>
-      </w:rPr>
-    </w:lvl>
-  </w:abstractNum>
-  <w:abstractNum w:abstractNumId="20" w15:restartNumberingAfterBreak="0">
+  <w:abstractNum w:abstractNumId="15" w15:restartNumberingAfterBreak="0">
     <w:nsid w:val="3BCF329B"/>
     <w:multiLevelType w:val="hybridMultilevel"/>
     <w:tmpl w:val="2F7029D4"/>
@@ -12539,7 +11889,7 @@
       </w:rPr>
     </w:lvl>
   </w:abstractNum>
-  <w:abstractNum w:abstractNumId="21" w15:restartNumberingAfterBreak="0">
+  <w:abstractNum w:abstractNumId="16" w15:restartNumberingAfterBreak="0">
     <w:nsid w:val="3F8F0DC5"/>
     <w:multiLevelType w:val="multilevel"/>
     <w:tmpl w:val="DF5C4BBA"/>
@@ -12680,7 +12030,7 @@
       </w:rPr>
     </w:lvl>
   </w:abstractNum>
-  <w:abstractNum w:abstractNumId="22" w15:restartNumberingAfterBreak="0">
+  <w:abstractNum w:abstractNumId="17" w15:restartNumberingAfterBreak="0">
     <w:nsid w:val="417C6B6C"/>
     <w:multiLevelType w:val="hybridMultilevel"/>
     <w:tmpl w:val="CCC6580E"/>
@@ -12772,7 +12122,7 @@
       </w:pPr>
     </w:lvl>
   </w:abstractNum>
-  <w:abstractNum w:abstractNumId="23" w15:restartNumberingAfterBreak="0">
+  <w:abstractNum w:abstractNumId="18" w15:restartNumberingAfterBreak="0">
     <w:nsid w:val="452141E2"/>
     <w:multiLevelType w:val="hybridMultilevel"/>
     <w:tmpl w:val="72E41D80"/>
@@ -12886,570 +12236,7 @@
       </w:rPr>
     </w:lvl>
   </w:abstractNum>
-  <w:abstractNum w:abstractNumId="24" w15:restartNumberingAfterBreak="0">
-    <w:nsid w:val="49F91626"/>
-    <w:multiLevelType w:val="hybridMultilevel"/>
-    <w:tmpl w:val="ACFCC428"/>
-    <w:lvl w:ilvl="0" w:tplc="08090001">
-      <w:start w:val="1"/>
-      <w:numFmt w:val="bullet"/>
-      <w:lvlText w:val=""/>
-      <w:lvlJc w:val="left"/>
-      <w:pPr>
-        <w:ind w:left="1060" w:hanging="360"/>
-      </w:pPr>
-      <w:rPr>
-        <w:rFonts w:ascii="Symbol" w:hAnsi="Symbol" w:hint="default"/>
-      </w:rPr>
-    </w:lvl>
-    <w:lvl w:ilvl="1" w:tplc="08090003" w:tentative="1">
-      <w:start w:val="1"/>
-      <w:numFmt w:val="bullet"/>
-      <w:lvlText w:val="o"/>
-      <w:lvlJc w:val="left"/>
-      <w:pPr>
-        <w:ind w:left="1780" w:hanging="360"/>
-      </w:pPr>
-      <w:rPr>
-        <w:rFonts w:ascii="Courier New" w:hAnsi="Courier New" w:cs="Courier New" w:hint="default"/>
-      </w:rPr>
-    </w:lvl>
-    <w:lvl w:ilvl="2" w:tplc="08090005" w:tentative="1">
-      <w:start w:val="1"/>
-      <w:numFmt w:val="bullet"/>
-      <w:lvlText w:val=""/>
-      <w:lvlJc w:val="left"/>
-      <w:pPr>
-        <w:ind w:left="2500" w:hanging="360"/>
-      </w:pPr>
-      <w:rPr>
-        <w:rFonts w:ascii="Wingdings" w:hAnsi="Wingdings" w:hint="default"/>
-      </w:rPr>
-    </w:lvl>
-    <w:lvl w:ilvl="3" w:tplc="08090001" w:tentative="1">
-      <w:start w:val="1"/>
-      <w:numFmt w:val="bullet"/>
-      <w:lvlText w:val=""/>
-      <w:lvlJc w:val="left"/>
-      <w:pPr>
-        <w:ind w:left="3220" w:hanging="360"/>
-      </w:pPr>
-      <w:rPr>
-        <w:rFonts w:ascii="Symbol" w:hAnsi="Symbol" w:hint="default"/>
-      </w:rPr>
-    </w:lvl>
-    <w:lvl w:ilvl="4" w:tplc="08090003" w:tentative="1">
-      <w:start w:val="1"/>
-      <w:numFmt w:val="bullet"/>
-      <w:lvlText w:val="o"/>
-      <w:lvlJc w:val="left"/>
-      <w:pPr>
-        <w:ind w:left="3940" w:hanging="360"/>
-      </w:pPr>
-      <w:rPr>
-        <w:rFonts w:ascii="Courier New" w:hAnsi="Courier New" w:cs="Courier New" w:hint="default"/>
-      </w:rPr>
-    </w:lvl>
-    <w:lvl w:ilvl="5" w:tplc="08090005" w:tentative="1">
-      <w:start w:val="1"/>
-      <w:numFmt w:val="bullet"/>
-      <w:lvlText w:val=""/>
-      <w:lvlJc w:val="left"/>
-      <w:pPr>
-        <w:ind w:left="4660" w:hanging="360"/>
-      </w:pPr>
-      <w:rPr>
-        <w:rFonts w:ascii="Wingdings" w:hAnsi="Wingdings" w:hint="default"/>
-      </w:rPr>
-    </w:lvl>
-    <w:lvl w:ilvl="6" w:tplc="08090001" w:tentative="1">
-      <w:start w:val="1"/>
-      <w:numFmt w:val="bullet"/>
-      <w:lvlText w:val=""/>
-      <w:lvlJc w:val="left"/>
-      <w:pPr>
-        <w:ind w:left="5380" w:hanging="360"/>
-      </w:pPr>
-      <w:rPr>
-        <w:rFonts w:ascii="Symbol" w:hAnsi="Symbol" w:hint="default"/>
-      </w:rPr>
-    </w:lvl>
-    <w:lvl w:ilvl="7" w:tplc="08090003" w:tentative="1">
-      <w:start w:val="1"/>
-      <w:numFmt w:val="bullet"/>
-      <w:lvlText w:val="o"/>
-      <w:lvlJc w:val="left"/>
-      <w:pPr>
-        <w:ind w:left="6100" w:hanging="360"/>
-      </w:pPr>
-      <w:rPr>
-        <w:rFonts w:ascii="Courier New" w:hAnsi="Courier New" w:cs="Courier New" w:hint="default"/>
-      </w:rPr>
-    </w:lvl>
-    <w:lvl w:ilvl="8" w:tplc="08090005" w:tentative="1">
-      <w:start w:val="1"/>
-      <w:numFmt w:val="bullet"/>
-      <w:lvlText w:val=""/>
-      <w:lvlJc w:val="left"/>
-      <w:pPr>
-        <w:ind w:left="6820" w:hanging="360"/>
-      </w:pPr>
-      <w:rPr>
-        <w:rFonts w:ascii="Wingdings" w:hAnsi="Wingdings" w:hint="default"/>
-      </w:rPr>
-    </w:lvl>
-  </w:abstractNum>
-  <w:abstractNum w:abstractNumId="25" w15:restartNumberingAfterBreak="0">
-    <w:nsid w:val="5D4B6192"/>
-    <w:multiLevelType w:val="hybridMultilevel"/>
-    <w:tmpl w:val="C5D62B9E"/>
-    <w:lvl w:ilvl="0" w:tplc="1E947F76">
-      <w:start w:val="1"/>
-      <w:numFmt w:val="decimal"/>
-      <w:lvlText w:val="%1."/>
-      <w:lvlJc w:val="left"/>
-      <w:pPr>
-        <w:ind w:left="340" w:hanging="340"/>
-      </w:pPr>
-      <w:rPr>
-        <w:rFonts w:hint="default"/>
-      </w:rPr>
-    </w:lvl>
-    <w:lvl w:ilvl="1" w:tplc="04090001">
-      <w:start w:val="1"/>
-      <w:numFmt w:val="bullet"/>
-      <w:lvlText w:val=""/>
-      <w:lvlJc w:val="left"/>
-      <w:pPr>
-        <w:ind w:left="1440" w:hanging="360"/>
-      </w:pPr>
-      <w:rPr>
-        <w:rFonts w:ascii="Symbol" w:hAnsi="Symbol" w:hint="default"/>
-      </w:rPr>
-    </w:lvl>
-    <w:lvl w:ilvl="2" w:tplc="0809001B">
-      <w:start w:val="1"/>
-      <w:numFmt w:val="lowerRoman"/>
-      <w:lvlText w:val="%3."/>
-      <w:lvlJc w:val="right"/>
-      <w:pPr>
-        <w:ind w:left="2160" w:hanging="180"/>
-      </w:pPr>
-    </w:lvl>
-    <w:lvl w:ilvl="3" w:tplc="0809000F" w:tentative="1">
-      <w:start w:val="1"/>
-      <w:numFmt w:val="decimal"/>
-      <w:lvlText w:val="%4."/>
-      <w:lvlJc w:val="left"/>
-      <w:pPr>
-        <w:ind w:left="2880" w:hanging="360"/>
-      </w:pPr>
-    </w:lvl>
-    <w:lvl w:ilvl="4" w:tplc="08090019" w:tentative="1">
-      <w:start w:val="1"/>
-      <w:numFmt w:val="lowerLetter"/>
-      <w:lvlText w:val="%5."/>
-      <w:lvlJc w:val="left"/>
-      <w:pPr>
-        <w:ind w:left="3600" w:hanging="360"/>
-      </w:pPr>
-    </w:lvl>
-    <w:lvl w:ilvl="5" w:tplc="0809001B" w:tentative="1">
-      <w:start w:val="1"/>
-      <w:numFmt w:val="lowerRoman"/>
-      <w:lvlText w:val="%6."/>
-      <w:lvlJc w:val="right"/>
-      <w:pPr>
-        <w:ind w:left="4320" w:hanging="180"/>
-      </w:pPr>
-    </w:lvl>
-    <w:lvl w:ilvl="6" w:tplc="0809000F" w:tentative="1">
-      <w:start w:val="1"/>
-      <w:numFmt w:val="decimal"/>
-      <w:lvlText w:val="%7."/>
-      <w:lvlJc w:val="left"/>
-      <w:pPr>
-        <w:ind w:left="5040" w:hanging="360"/>
-      </w:pPr>
-    </w:lvl>
-    <w:lvl w:ilvl="7" w:tplc="08090019" w:tentative="1">
-      <w:start w:val="1"/>
-      <w:numFmt w:val="lowerLetter"/>
-      <w:lvlText w:val="%8."/>
-      <w:lvlJc w:val="left"/>
-      <w:pPr>
-        <w:ind w:left="5760" w:hanging="360"/>
-      </w:pPr>
-    </w:lvl>
-    <w:lvl w:ilvl="8" w:tplc="0809001B" w:tentative="1">
-      <w:start w:val="1"/>
-      <w:numFmt w:val="lowerRoman"/>
-      <w:lvlText w:val="%9."/>
-      <w:lvlJc w:val="right"/>
-      <w:pPr>
-        <w:ind w:left="6480" w:hanging="180"/>
-      </w:pPr>
-    </w:lvl>
-  </w:abstractNum>
-  <w:abstractNum w:abstractNumId="26" w15:restartNumberingAfterBreak="0">
-    <w:nsid w:val="5FAA3C36"/>
-    <w:multiLevelType w:val="hybridMultilevel"/>
-    <w:tmpl w:val="42869062"/>
-    <w:lvl w:ilvl="0" w:tplc="1E947F76">
-      <w:start w:val="1"/>
-      <w:numFmt w:val="decimal"/>
-      <w:lvlText w:val="%1."/>
-      <w:lvlJc w:val="left"/>
-      <w:pPr>
-        <w:ind w:left="340" w:hanging="340"/>
-      </w:pPr>
-      <w:rPr>
-        <w:rFonts w:hint="default"/>
-      </w:rPr>
-    </w:lvl>
-    <w:lvl w:ilvl="1" w:tplc="0409000F">
-      <w:start w:val="1"/>
-      <w:numFmt w:val="decimal"/>
-      <w:lvlText w:val="%2."/>
-      <w:lvlJc w:val="left"/>
-      <w:pPr>
-        <w:ind w:left="1440" w:hanging="360"/>
-      </w:pPr>
-      <w:rPr>
-        <w:rFonts w:hint="default"/>
-      </w:rPr>
-    </w:lvl>
-    <w:lvl w:ilvl="2" w:tplc="04090001">
-      <w:start w:val="1"/>
-      <w:numFmt w:val="bullet"/>
-      <w:lvlText w:val=""/>
-      <w:lvlJc w:val="left"/>
-      <w:pPr>
-        <w:ind w:left="2160" w:hanging="180"/>
-      </w:pPr>
-      <w:rPr>
-        <w:rFonts w:ascii="Symbol" w:hAnsi="Symbol" w:hint="default"/>
-      </w:rPr>
-    </w:lvl>
-    <w:lvl w:ilvl="3" w:tplc="0809000F" w:tentative="1">
-      <w:start w:val="1"/>
-      <w:numFmt w:val="decimal"/>
-      <w:lvlText w:val="%4."/>
-      <w:lvlJc w:val="left"/>
-      <w:pPr>
-        <w:ind w:left="2880" w:hanging="360"/>
-      </w:pPr>
-    </w:lvl>
-    <w:lvl w:ilvl="4" w:tplc="08090019" w:tentative="1">
-      <w:start w:val="1"/>
-      <w:numFmt w:val="lowerLetter"/>
-      <w:lvlText w:val="%5."/>
-      <w:lvlJc w:val="left"/>
-      <w:pPr>
-        <w:ind w:left="3600" w:hanging="360"/>
-      </w:pPr>
-    </w:lvl>
-    <w:lvl w:ilvl="5" w:tplc="0809001B" w:tentative="1">
-      <w:start w:val="1"/>
-      <w:numFmt w:val="lowerRoman"/>
-      <w:lvlText w:val="%6."/>
-      <w:lvlJc w:val="right"/>
-      <w:pPr>
-        <w:ind w:left="4320" w:hanging="180"/>
-      </w:pPr>
-    </w:lvl>
-    <w:lvl w:ilvl="6" w:tplc="0809000F" w:tentative="1">
-      <w:start w:val="1"/>
-      <w:numFmt w:val="decimal"/>
-      <w:lvlText w:val="%7."/>
-      <w:lvlJc w:val="left"/>
-      <w:pPr>
-        <w:ind w:left="5040" w:hanging="360"/>
-      </w:pPr>
-    </w:lvl>
-    <w:lvl w:ilvl="7" w:tplc="08090019" w:tentative="1">
-      <w:start w:val="1"/>
-      <w:numFmt w:val="lowerLetter"/>
-      <w:lvlText w:val="%8."/>
-      <w:lvlJc w:val="left"/>
-      <w:pPr>
-        <w:ind w:left="5760" w:hanging="360"/>
-      </w:pPr>
-    </w:lvl>
-    <w:lvl w:ilvl="8" w:tplc="0809001B" w:tentative="1">
-      <w:start w:val="1"/>
-      <w:numFmt w:val="lowerRoman"/>
-      <w:lvlText w:val="%9."/>
-      <w:lvlJc w:val="right"/>
-      <w:pPr>
-        <w:ind w:left="6480" w:hanging="180"/>
-      </w:pPr>
-    </w:lvl>
-  </w:abstractNum>
-  <w:abstractNum w:abstractNumId="27" w15:restartNumberingAfterBreak="0">
-    <w:nsid w:val="60033049"/>
-    <w:multiLevelType w:val="multilevel"/>
-    <w:tmpl w:val="18EA11FE"/>
-    <w:lvl w:ilvl="0">
-      <w:start w:val="1"/>
-      <w:numFmt w:val="bullet"/>
-      <w:lvlText w:val=""/>
-      <w:lvlJc w:val="left"/>
-      <w:pPr>
-        <w:tabs>
-          <w:tab w:val="num" w:pos="340"/>
-        </w:tabs>
-        <w:ind w:left="340" w:hanging="340"/>
-      </w:pPr>
-      <w:rPr>
-        <w:rFonts w:ascii="Wingdings 2" w:hAnsi="Wingdings 2" w:hint="default"/>
-        <w:color w:val="auto"/>
-        <w:sz w:val="24"/>
-      </w:rPr>
-    </w:lvl>
-    <w:lvl w:ilvl="1">
-      <w:start w:val="1"/>
-      <w:numFmt w:val="bullet"/>
-      <w:lvlText w:val=""/>
-      <w:lvlJc w:val="left"/>
-      <w:pPr>
-        <w:tabs>
-          <w:tab w:val="num" w:pos="340"/>
-        </w:tabs>
-        <w:ind w:left="340" w:hanging="340"/>
-      </w:pPr>
-      <w:rPr>
-        <w:rFonts w:ascii="Symbol" w:hAnsi="Symbol" w:hint="default"/>
-        <w:color w:val="auto"/>
-      </w:rPr>
-    </w:lvl>
-    <w:lvl w:ilvl="2">
-      <w:start w:val="1"/>
-      <w:numFmt w:val="bullet"/>
-      <w:lvlText w:val=""/>
-      <w:lvlJc w:val="left"/>
-      <w:pPr>
-        <w:tabs>
-          <w:tab w:val="num" w:pos="680"/>
-        </w:tabs>
-        <w:ind w:left="680" w:hanging="340"/>
-      </w:pPr>
-      <w:rPr>
-        <w:rFonts w:ascii="Symbol" w:hAnsi="Symbol" w:hint="default"/>
-        <w:color w:val="auto"/>
-      </w:rPr>
-    </w:lvl>
-    <w:lvl w:ilvl="3">
-      <w:start w:val="1"/>
-      <w:numFmt w:val="bullet"/>
-      <w:lvlText w:val=""/>
-      <w:lvlJc w:val="left"/>
-      <w:pPr>
-        <w:tabs>
-          <w:tab w:val="num" w:pos="1021"/>
-        </w:tabs>
-        <w:ind w:left="1021" w:hanging="341"/>
-      </w:pPr>
-      <w:rPr>
-        <w:rFonts w:ascii="Symbol" w:hAnsi="Symbol" w:hint="default"/>
-        <w:color w:val="auto"/>
-      </w:rPr>
-    </w:lvl>
-    <w:lvl w:ilvl="4">
-      <w:start w:val="1"/>
-      <w:numFmt w:val="bullet"/>
-      <w:lvlText w:val=""/>
-      <w:lvlJc w:val="left"/>
-      <w:pPr>
-        <w:tabs>
-          <w:tab w:val="num" w:pos="1361"/>
-        </w:tabs>
-        <w:ind w:left="1361" w:hanging="340"/>
-      </w:pPr>
-      <w:rPr>
-        <w:rFonts w:ascii="Symbol" w:hAnsi="Symbol" w:hint="default"/>
-        <w:color w:val="auto"/>
-      </w:rPr>
-    </w:lvl>
-    <w:lvl w:ilvl="5">
-      <w:start w:val="1"/>
-      <w:numFmt w:val="bullet"/>
-      <w:lvlText w:val=""/>
-      <w:lvlJc w:val="left"/>
-      <w:pPr>
-        <w:tabs>
-          <w:tab w:val="num" w:pos="1701"/>
-        </w:tabs>
-        <w:ind w:left="1701" w:hanging="340"/>
-      </w:pPr>
-      <w:rPr>
-        <w:rFonts w:ascii="Symbol" w:hAnsi="Symbol" w:hint="default"/>
-        <w:color w:val="auto"/>
-      </w:rPr>
-    </w:lvl>
-    <w:lvl w:ilvl="6">
-      <w:start w:val="1"/>
-      <w:numFmt w:val="bullet"/>
-      <w:lvlText w:val=""/>
-      <w:lvlJc w:val="left"/>
-      <w:pPr>
-        <w:tabs>
-          <w:tab w:val="num" w:pos="2041"/>
-        </w:tabs>
-        <w:ind w:left="2041" w:hanging="340"/>
-      </w:pPr>
-      <w:rPr>
-        <w:rFonts w:ascii="Symbol" w:hAnsi="Symbol" w:hint="default"/>
-        <w:color w:val="auto"/>
-      </w:rPr>
-    </w:lvl>
-    <w:lvl w:ilvl="7">
-      <w:start w:val="1"/>
-      <w:numFmt w:val="bullet"/>
-      <w:lvlText w:val=""/>
-      <w:lvlJc w:val="left"/>
-      <w:pPr>
-        <w:tabs>
-          <w:tab w:val="num" w:pos="2381"/>
-        </w:tabs>
-        <w:ind w:left="2381" w:hanging="340"/>
-      </w:pPr>
-      <w:rPr>
-        <w:rFonts w:ascii="Symbol" w:hAnsi="Symbol" w:hint="default"/>
-        <w:color w:val="auto"/>
-      </w:rPr>
-    </w:lvl>
-    <w:lvl w:ilvl="8">
-      <w:start w:val="1"/>
-      <w:numFmt w:val="bullet"/>
-      <w:lvlText w:val=""/>
-      <w:lvlJc w:val="left"/>
-      <w:pPr>
-        <w:tabs>
-          <w:tab w:val="num" w:pos="2722"/>
-        </w:tabs>
-        <w:ind w:left="2722" w:hanging="341"/>
-      </w:pPr>
-      <w:rPr>
-        <w:rFonts w:ascii="Symbol" w:hAnsi="Symbol" w:hint="default"/>
-        <w:color w:val="auto"/>
-      </w:rPr>
-    </w:lvl>
-  </w:abstractNum>
-  <w:abstractNum w:abstractNumId="28" w15:restartNumberingAfterBreak="0">
-    <w:nsid w:val="63840C7E"/>
-    <w:multiLevelType w:val="hybridMultilevel"/>
-    <w:tmpl w:val="BA84D6EC"/>
-    <w:lvl w:ilvl="0" w:tplc="04090001">
-      <w:start w:val="1"/>
-      <w:numFmt w:val="bullet"/>
-      <w:lvlText w:val=""/>
-      <w:lvlJc w:val="left"/>
-      <w:pPr>
-        <w:ind w:left="720" w:hanging="360"/>
-      </w:pPr>
-      <w:rPr>
-        <w:rFonts w:ascii="Symbol" w:hAnsi="Symbol" w:hint="default"/>
-      </w:rPr>
-    </w:lvl>
-    <w:lvl w:ilvl="1" w:tplc="04090003" w:tentative="1">
-      <w:start w:val="1"/>
-      <w:numFmt w:val="bullet"/>
-      <w:lvlText w:val="o"/>
-      <w:lvlJc w:val="left"/>
-      <w:pPr>
-        <w:ind w:left="1440" w:hanging="360"/>
-      </w:pPr>
-      <w:rPr>
-        <w:rFonts w:ascii="Courier New" w:hAnsi="Courier New" w:cs="Courier New" w:hint="default"/>
-      </w:rPr>
-    </w:lvl>
-    <w:lvl w:ilvl="2" w:tplc="04090005" w:tentative="1">
-      <w:start w:val="1"/>
-      <w:numFmt w:val="bullet"/>
-      <w:lvlText w:val=""/>
-      <w:lvlJc w:val="left"/>
-      <w:pPr>
-        <w:ind w:left="2160" w:hanging="360"/>
-      </w:pPr>
-      <w:rPr>
-        <w:rFonts w:ascii="Wingdings" w:hAnsi="Wingdings" w:hint="default"/>
-      </w:rPr>
-    </w:lvl>
-    <w:lvl w:ilvl="3" w:tplc="04090001" w:tentative="1">
-      <w:start w:val="1"/>
-      <w:numFmt w:val="bullet"/>
-      <w:lvlText w:val=""/>
-      <w:lvlJc w:val="left"/>
-      <w:pPr>
-        <w:ind w:left="2880" w:hanging="360"/>
-      </w:pPr>
-      <w:rPr>
-        <w:rFonts w:ascii="Symbol" w:hAnsi="Symbol" w:hint="default"/>
-      </w:rPr>
-    </w:lvl>
-    <w:lvl w:ilvl="4" w:tplc="04090003" w:tentative="1">
-      <w:start w:val="1"/>
-      <w:numFmt w:val="bullet"/>
-      <w:lvlText w:val="o"/>
-      <w:lvlJc w:val="left"/>
-      <w:pPr>
-        <w:ind w:left="3600" w:hanging="360"/>
-      </w:pPr>
-      <w:rPr>
-        <w:rFonts w:ascii="Courier New" w:hAnsi="Courier New" w:cs="Courier New" w:hint="default"/>
-      </w:rPr>
-    </w:lvl>
-    <w:lvl w:ilvl="5" w:tplc="04090005" w:tentative="1">
-      <w:start w:val="1"/>
-      <w:numFmt w:val="bullet"/>
-      <w:lvlText w:val=""/>
-      <w:lvlJc w:val="left"/>
-      <w:pPr>
-        <w:ind w:left="4320" w:hanging="360"/>
-      </w:pPr>
-      <w:rPr>
-        <w:rFonts w:ascii="Wingdings" w:hAnsi="Wingdings" w:hint="default"/>
-      </w:rPr>
-    </w:lvl>
-    <w:lvl w:ilvl="6" w:tplc="04090001" w:tentative="1">
-      <w:start w:val="1"/>
-      <w:numFmt w:val="bullet"/>
-      <w:lvlText w:val=""/>
-      <w:lvlJc w:val="left"/>
-      <w:pPr>
-        <w:ind w:left="5040" w:hanging="360"/>
-      </w:pPr>
-      <w:rPr>
-        <w:rFonts w:ascii="Symbol" w:hAnsi="Symbol" w:hint="default"/>
-      </w:rPr>
-    </w:lvl>
-    <w:lvl w:ilvl="7" w:tplc="04090003" w:tentative="1">
-      <w:start w:val="1"/>
-      <w:numFmt w:val="bullet"/>
-      <w:lvlText w:val="o"/>
-      <w:lvlJc w:val="left"/>
-      <w:pPr>
-        <w:ind w:left="5760" w:hanging="360"/>
-      </w:pPr>
-      <w:rPr>
-        <w:rFonts w:ascii="Courier New" w:hAnsi="Courier New" w:cs="Courier New" w:hint="default"/>
-      </w:rPr>
-    </w:lvl>
-    <w:lvl w:ilvl="8" w:tplc="04090005" w:tentative="1">
-      <w:start w:val="1"/>
-      <w:numFmt w:val="bullet"/>
-      <w:lvlText w:val=""/>
-      <w:lvlJc w:val="left"/>
-      <w:pPr>
-        <w:ind w:left="6480" w:hanging="360"/>
-      </w:pPr>
-      <w:rPr>
-        <w:rFonts w:ascii="Wingdings" w:hAnsi="Wingdings" w:hint="default"/>
-      </w:rPr>
-    </w:lvl>
-  </w:abstractNum>
-  <w:abstractNum w:abstractNumId="29" w15:restartNumberingAfterBreak="0">
+  <w:abstractNum w:abstractNumId="19" w15:restartNumberingAfterBreak="0">
     <w:nsid w:val="69DB46B7"/>
     <w:multiLevelType w:val="multilevel"/>
     <w:tmpl w:val="08090023"/>
@@ -13537,263 +12324,7 @@
       </w:pPr>
     </w:lvl>
   </w:abstractNum>
-  <w:abstractNum w:abstractNumId="30" w15:restartNumberingAfterBreak="0">
-    <w:nsid w:val="6AF86EF1"/>
-    <w:multiLevelType w:val="hybridMultilevel"/>
-    <w:tmpl w:val="E0DE2E0A"/>
-    <w:lvl w:ilvl="0" w:tplc="04090001">
-      <w:start w:val="1"/>
-      <w:numFmt w:val="bullet"/>
-      <w:lvlText w:val=""/>
-      <w:lvlJc w:val="left"/>
-      <w:pPr>
-        <w:ind w:left="720" w:hanging="360"/>
-      </w:pPr>
-      <w:rPr>
-        <w:rFonts w:ascii="Symbol" w:hAnsi="Symbol" w:hint="default"/>
-      </w:rPr>
-    </w:lvl>
-    <w:lvl w:ilvl="1" w:tplc="04090003" w:tentative="1">
-      <w:start w:val="1"/>
-      <w:numFmt w:val="bullet"/>
-      <w:lvlText w:val="o"/>
-      <w:lvlJc w:val="left"/>
-      <w:pPr>
-        <w:ind w:left="1440" w:hanging="360"/>
-      </w:pPr>
-      <w:rPr>
-        <w:rFonts w:ascii="Courier New" w:hAnsi="Courier New" w:cs="Courier New" w:hint="default"/>
-      </w:rPr>
-    </w:lvl>
-    <w:lvl w:ilvl="2" w:tplc="04090005" w:tentative="1">
-      <w:start w:val="1"/>
-      <w:numFmt w:val="bullet"/>
-      <w:lvlText w:val=""/>
-      <w:lvlJc w:val="left"/>
-      <w:pPr>
-        <w:ind w:left="2160" w:hanging="360"/>
-      </w:pPr>
-      <w:rPr>
-        <w:rFonts w:ascii="Wingdings" w:hAnsi="Wingdings" w:hint="default"/>
-      </w:rPr>
-    </w:lvl>
-    <w:lvl w:ilvl="3" w:tplc="04090001" w:tentative="1">
-      <w:start w:val="1"/>
-      <w:numFmt w:val="bullet"/>
-      <w:lvlText w:val=""/>
-      <w:lvlJc w:val="left"/>
-      <w:pPr>
-        <w:ind w:left="2880" w:hanging="360"/>
-      </w:pPr>
-      <w:rPr>
-        <w:rFonts w:ascii="Symbol" w:hAnsi="Symbol" w:hint="default"/>
-      </w:rPr>
-    </w:lvl>
-    <w:lvl w:ilvl="4" w:tplc="04090003" w:tentative="1">
-      <w:start w:val="1"/>
-      <w:numFmt w:val="bullet"/>
-      <w:lvlText w:val="o"/>
-      <w:lvlJc w:val="left"/>
-      <w:pPr>
-        <w:ind w:left="3600" w:hanging="360"/>
-      </w:pPr>
-      <w:rPr>
-        <w:rFonts w:ascii="Courier New" w:hAnsi="Courier New" w:cs="Courier New" w:hint="default"/>
-      </w:rPr>
-    </w:lvl>
-    <w:lvl w:ilvl="5" w:tplc="04090005" w:tentative="1">
-      <w:start w:val="1"/>
-      <w:numFmt w:val="bullet"/>
-      <w:lvlText w:val=""/>
-      <w:lvlJc w:val="left"/>
-      <w:pPr>
-        <w:ind w:left="4320" w:hanging="360"/>
-      </w:pPr>
-      <w:rPr>
-        <w:rFonts w:ascii="Wingdings" w:hAnsi="Wingdings" w:hint="default"/>
-      </w:rPr>
-    </w:lvl>
-    <w:lvl w:ilvl="6" w:tplc="04090001" w:tentative="1">
-      <w:start w:val="1"/>
-      <w:numFmt w:val="bullet"/>
-      <w:lvlText w:val=""/>
-      <w:lvlJc w:val="left"/>
-      <w:pPr>
-        <w:ind w:left="5040" w:hanging="360"/>
-      </w:pPr>
-      <w:rPr>
-        <w:rFonts w:ascii="Symbol" w:hAnsi="Symbol" w:hint="default"/>
-      </w:rPr>
-    </w:lvl>
-    <w:lvl w:ilvl="7" w:tplc="04090003" w:tentative="1">
-      <w:start w:val="1"/>
-      <w:numFmt w:val="bullet"/>
-      <w:lvlText w:val="o"/>
-      <w:lvlJc w:val="left"/>
-      <w:pPr>
-        <w:ind w:left="5760" w:hanging="360"/>
-      </w:pPr>
-      <w:rPr>
-        <w:rFonts w:ascii="Courier New" w:hAnsi="Courier New" w:cs="Courier New" w:hint="default"/>
-      </w:rPr>
-    </w:lvl>
-    <w:lvl w:ilvl="8" w:tplc="04090005" w:tentative="1">
-      <w:start w:val="1"/>
-      <w:numFmt w:val="bullet"/>
-      <w:lvlText w:val=""/>
-      <w:lvlJc w:val="left"/>
-      <w:pPr>
-        <w:ind w:left="6480" w:hanging="360"/>
-      </w:pPr>
-      <w:rPr>
-        <w:rFonts w:ascii="Wingdings" w:hAnsi="Wingdings" w:hint="default"/>
-      </w:rPr>
-    </w:lvl>
-  </w:abstractNum>
-  <w:abstractNum w:abstractNumId="31" w15:restartNumberingAfterBreak="0">
-    <w:nsid w:val="6FBF328F"/>
-    <w:multiLevelType w:val="hybridMultilevel"/>
-    <w:tmpl w:val="49965760"/>
-    <w:lvl w:ilvl="0" w:tplc="E944627A">
-      <w:start w:val="1"/>
-      <w:numFmt w:val="bullet"/>
-      <w:lvlText w:val=""/>
-      <w:lvlJc w:val="left"/>
-      <w:pPr>
-        <w:tabs>
-          <w:tab w:val="num" w:pos="0"/>
-        </w:tabs>
-        <w:ind w:left="0" w:hanging="170"/>
-      </w:pPr>
-      <w:rPr>
-        <w:rFonts w:ascii="Wingdings" w:hAnsi="Wingdings" w:hint="default"/>
-        <w:color w:val="003481"/>
-        <w:position w:val="0"/>
-        <w:sz w:val="17"/>
-      </w:rPr>
-    </w:lvl>
-    <w:lvl w:ilvl="1" w:tplc="08090003" w:tentative="1">
-      <w:start w:val="1"/>
-      <w:numFmt w:val="bullet"/>
-      <w:lvlText w:val="o"/>
-      <w:lvlJc w:val="left"/>
-      <w:pPr>
-        <w:tabs>
-          <w:tab w:val="num" w:pos="1553"/>
-        </w:tabs>
-        <w:ind w:left="1553" w:hanging="360"/>
-      </w:pPr>
-      <w:rPr>
-        <w:rFonts w:ascii="Courier New" w:hAnsi="Courier New" w:cs="Courier New" w:hint="default"/>
-      </w:rPr>
-    </w:lvl>
-    <w:lvl w:ilvl="2" w:tplc="08090005" w:tentative="1">
-      <w:start w:val="1"/>
-      <w:numFmt w:val="bullet"/>
-      <w:lvlText w:val=""/>
-      <w:lvlJc w:val="left"/>
-      <w:pPr>
-        <w:tabs>
-          <w:tab w:val="num" w:pos="2273"/>
-        </w:tabs>
-        <w:ind w:left="2273" w:hanging="360"/>
-      </w:pPr>
-      <w:rPr>
-        <w:rFonts w:ascii="Wingdings" w:hAnsi="Wingdings" w:hint="default"/>
-      </w:rPr>
-    </w:lvl>
-    <w:lvl w:ilvl="3" w:tplc="08090001" w:tentative="1">
-      <w:start w:val="1"/>
-      <w:numFmt w:val="bullet"/>
-      <w:lvlText w:val=""/>
-      <w:lvlJc w:val="left"/>
-      <w:pPr>
-        <w:tabs>
-          <w:tab w:val="num" w:pos="2993"/>
-        </w:tabs>
-        <w:ind w:left="2993" w:hanging="360"/>
-      </w:pPr>
-      <w:rPr>
-        <w:rFonts w:ascii="Symbol" w:hAnsi="Symbol" w:hint="default"/>
-      </w:rPr>
-    </w:lvl>
-    <w:lvl w:ilvl="4" w:tplc="08090003" w:tentative="1">
-      <w:start w:val="1"/>
-      <w:numFmt w:val="bullet"/>
-      <w:lvlText w:val="o"/>
-      <w:lvlJc w:val="left"/>
-      <w:pPr>
-        <w:tabs>
-          <w:tab w:val="num" w:pos="3713"/>
-        </w:tabs>
-        <w:ind w:left="3713" w:hanging="360"/>
-      </w:pPr>
-      <w:rPr>
-        <w:rFonts w:ascii="Courier New" w:hAnsi="Courier New" w:cs="Courier New" w:hint="default"/>
-      </w:rPr>
-    </w:lvl>
-    <w:lvl w:ilvl="5" w:tplc="08090005" w:tentative="1">
-      <w:start w:val="1"/>
-      <w:numFmt w:val="bullet"/>
-      <w:lvlText w:val=""/>
-      <w:lvlJc w:val="left"/>
-      <w:pPr>
-        <w:tabs>
-          <w:tab w:val="num" w:pos="4433"/>
-        </w:tabs>
-        <w:ind w:left="4433" w:hanging="360"/>
-      </w:pPr>
-      <w:rPr>
-        <w:rFonts w:ascii="Wingdings" w:hAnsi="Wingdings" w:hint="default"/>
-      </w:rPr>
-    </w:lvl>
-    <w:lvl w:ilvl="6" w:tplc="08090001" w:tentative="1">
-      <w:start w:val="1"/>
-      <w:numFmt w:val="bullet"/>
-      <w:lvlText w:val=""/>
-      <w:lvlJc w:val="left"/>
-      <w:pPr>
-        <w:tabs>
-          <w:tab w:val="num" w:pos="5153"/>
-        </w:tabs>
-        <w:ind w:left="5153" w:hanging="360"/>
-      </w:pPr>
-      <w:rPr>
-        <w:rFonts w:ascii="Symbol" w:hAnsi="Symbol" w:hint="default"/>
-      </w:rPr>
-    </w:lvl>
-    <w:lvl w:ilvl="7" w:tplc="08090003" w:tentative="1">
-      <w:start w:val="1"/>
-      <w:numFmt w:val="bullet"/>
-      <w:lvlText w:val="o"/>
-      <w:lvlJc w:val="left"/>
-      <w:pPr>
-        <w:tabs>
-          <w:tab w:val="num" w:pos="5873"/>
-        </w:tabs>
-        <w:ind w:left="5873" w:hanging="360"/>
-      </w:pPr>
-      <w:rPr>
-        <w:rFonts w:ascii="Courier New" w:hAnsi="Courier New" w:cs="Courier New" w:hint="default"/>
-      </w:rPr>
-    </w:lvl>
-    <w:lvl w:ilvl="8" w:tplc="08090005" w:tentative="1">
-      <w:start w:val="1"/>
-      <w:numFmt w:val="bullet"/>
-      <w:lvlText w:val=""/>
-      <w:lvlJc w:val="left"/>
-      <w:pPr>
-        <w:tabs>
-          <w:tab w:val="num" w:pos="6593"/>
-        </w:tabs>
-        <w:ind w:left="6593" w:hanging="360"/>
-      </w:pPr>
-      <w:rPr>
-        <w:rFonts w:ascii="Wingdings" w:hAnsi="Wingdings" w:hint="default"/>
-      </w:rPr>
-    </w:lvl>
-  </w:abstractNum>
-  <w:abstractNum w:abstractNumId="32" w15:restartNumberingAfterBreak="0">
+  <w:abstractNum w:abstractNumId="20" w15:restartNumberingAfterBreak="0">
     <w:nsid w:val="74B17716"/>
     <w:multiLevelType w:val="multilevel"/>
     <w:tmpl w:val="0809001D"/>
@@ -13880,7 +12411,7 @@
       </w:pPr>
     </w:lvl>
   </w:abstractNum>
-  <w:abstractNum w:abstractNumId="33" w15:restartNumberingAfterBreak="0">
+  <w:abstractNum w:abstractNumId="21" w15:restartNumberingAfterBreak="0">
     <w:nsid w:val="76850F02"/>
     <w:multiLevelType w:val="multilevel"/>
     <w:tmpl w:val="0809001F"/>
@@ -13967,332 +12498,65 @@
       </w:pPr>
     </w:lvl>
   </w:abstractNum>
-  <w:abstractNum w:abstractNumId="34" w15:restartNumberingAfterBreak="0">
-    <w:nsid w:val="7821525D"/>
-    <w:multiLevelType w:val="hybridMultilevel"/>
-    <w:tmpl w:val="19A2CB24"/>
-    <w:lvl w:ilvl="0" w:tplc="0809000F">
-      <w:start w:val="1"/>
-      <w:numFmt w:val="decimal"/>
-      <w:lvlText w:val="%1."/>
-      <w:lvlJc w:val="left"/>
-      <w:pPr>
-        <w:ind w:left="720" w:hanging="360"/>
-      </w:pPr>
-    </w:lvl>
-    <w:lvl w:ilvl="1" w:tplc="08090019" w:tentative="1">
-      <w:start w:val="1"/>
-      <w:numFmt w:val="lowerLetter"/>
-      <w:lvlText w:val="%2."/>
-      <w:lvlJc w:val="left"/>
-      <w:pPr>
-        <w:ind w:left="1440" w:hanging="360"/>
-      </w:pPr>
-    </w:lvl>
-    <w:lvl w:ilvl="2" w:tplc="0809001B" w:tentative="1">
-      <w:start w:val="1"/>
-      <w:numFmt w:val="lowerRoman"/>
-      <w:lvlText w:val="%3."/>
-      <w:lvlJc w:val="right"/>
-      <w:pPr>
-        <w:ind w:left="2160" w:hanging="180"/>
-      </w:pPr>
-    </w:lvl>
-    <w:lvl w:ilvl="3" w:tplc="0809000F" w:tentative="1">
-      <w:start w:val="1"/>
-      <w:numFmt w:val="decimal"/>
-      <w:lvlText w:val="%4."/>
-      <w:lvlJc w:val="left"/>
-      <w:pPr>
-        <w:ind w:left="2880" w:hanging="360"/>
-      </w:pPr>
-    </w:lvl>
-    <w:lvl w:ilvl="4" w:tplc="08090019" w:tentative="1">
-      <w:start w:val="1"/>
-      <w:numFmt w:val="lowerLetter"/>
-      <w:lvlText w:val="%5."/>
-      <w:lvlJc w:val="left"/>
-      <w:pPr>
-        <w:ind w:left="3600" w:hanging="360"/>
-      </w:pPr>
-    </w:lvl>
-    <w:lvl w:ilvl="5" w:tplc="0809001B" w:tentative="1">
-      <w:start w:val="1"/>
-      <w:numFmt w:val="lowerRoman"/>
-      <w:lvlText w:val="%6."/>
-      <w:lvlJc w:val="right"/>
-      <w:pPr>
-        <w:ind w:left="4320" w:hanging="180"/>
-      </w:pPr>
-    </w:lvl>
-    <w:lvl w:ilvl="6" w:tplc="0809000F" w:tentative="1">
-      <w:start w:val="1"/>
-      <w:numFmt w:val="decimal"/>
-      <w:lvlText w:val="%7."/>
-      <w:lvlJc w:val="left"/>
-      <w:pPr>
-        <w:ind w:left="5040" w:hanging="360"/>
-      </w:pPr>
-    </w:lvl>
-    <w:lvl w:ilvl="7" w:tplc="08090019" w:tentative="1">
-      <w:start w:val="1"/>
-      <w:numFmt w:val="lowerLetter"/>
-      <w:lvlText w:val="%8."/>
-      <w:lvlJc w:val="left"/>
-      <w:pPr>
-        <w:ind w:left="5760" w:hanging="360"/>
-      </w:pPr>
-    </w:lvl>
-    <w:lvl w:ilvl="8" w:tplc="0809001B" w:tentative="1">
-      <w:start w:val="1"/>
-      <w:numFmt w:val="lowerRoman"/>
-      <w:lvlText w:val="%9."/>
-      <w:lvlJc w:val="right"/>
-      <w:pPr>
-        <w:ind w:left="6480" w:hanging="180"/>
-      </w:pPr>
-    </w:lvl>
-  </w:abstractNum>
-  <w:num w:numId="1" w16cid:durableId="252015527">
+  <w:num w:numId="1" w16cid:durableId="2002850182">
+    <w:abstractNumId w:val="14"/>
+  </w:num>
+  <w:num w:numId="2" w16cid:durableId="789589069">
+    <w:abstractNumId w:val="11"/>
+  </w:num>
+  <w:num w:numId="3" w16cid:durableId="1577086829">
     <w:abstractNumId w:val="10"/>
   </w:num>
-  <w:num w:numId="2" w16cid:durableId="1525627200">
-    <w:abstractNumId w:val="27"/>
+  <w:num w:numId="4" w16cid:durableId="230628619">
+    <w:abstractNumId w:val="21"/>
   </w:num>
-  <w:num w:numId="3" w16cid:durableId="2002850182">
+  <w:num w:numId="5" w16cid:durableId="1369722204">
+    <w:abstractNumId w:val="20"/>
+  </w:num>
+  <w:num w:numId="6" w16cid:durableId="1260866734">
+    <w:abstractNumId w:val="19"/>
+  </w:num>
+  <w:num w:numId="7" w16cid:durableId="386078158">
+    <w:abstractNumId w:val="9"/>
+  </w:num>
+  <w:num w:numId="8" w16cid:durableId="2038893822">
+    <w:abstractNumId w:val="7"/>
+  </w:num>
+  <w:num w:numId="9" w16cid:durableId="1915895731">
+    <w:abstractNumId w:val="6"/>
+  </w:num>
+  <w:num w:numId="10" w16cid:durableId="1866602895">
+    <w:abstractNumId w:val="5"/>
+  </w:num>
+  <w:num w:numId="11" w16cid:durableId="706875124">
+    <w:abstractNumId w:val="4"/>
+  </w:num>
+  <w:num w:numId="12" w16cid:durableId="1531143557">
+    <w:abstractNumId w:val="8"/>
+  </w:num>
+  <w:num w:numId="13" w16cid:durableId="7222945">
+    <w:abstractNumId w:val="3"/>
+  </w:num>
+  <w:num w:numId="14" w16cid:durableId="1410883115">
+    <w:abstractNumId w:val="2"/>
+  </w:num>
+  <w:num w:numId="15" w16cid:durableId="349769546">
+    <w:abstractNumId w:val="1"/>
+  </w:num>
+  <w:num w:numId="16" w16cid:durableId="1528451148">
+    <w:abstractNumId w:val="0"/>
+  </w:num>
+  <w:num w:numId="17" w16cid:durableId="711271748">
+    <w:abstractNumId w:val="17"/>
+  </w:num>
+  <w:num w:numId="18" w16cid:durableId="1733038027">
+    <w:abstractNumId w:val="15"/>
+  </w:num>
+  <w:num w:numId="19" w16cid:durableId="1510293055">
     <w:abstractNumId w:val="18"/>
   </w:num>
-  <w:num w:numId="4" w16cid:durableId="789589069">
-    <w:abstractNumId w:val="11"/>
-  </w:num>
-  <w:num w:numId="5" w16cid:durableId="1577086829">
-    <w:abstractNumId w:val="10"/>
-  </w:num>
-  <w:num w:numId="6" w16cid:durableId="1623880683">
-    <w:abstractNumId w:val="27"/>
-  </w:num>
-  <w:num w:numId="7" w16cid:durableId="46879240">
-    <w:abstractNumId w:val="18"/>
-    <w:lvlOverride w:ilvl="0">
-      <w:lvl w:ilvl="0">
-        <w:start w:val="1"/>
-        <w:numFmt w:val="decimal"/>
-        <w:lvlText w:val="%1.0"/>
-        <w:lvlJc w:val="left"/>
-        <w:pPr>
-          <w:ind w:left="360" w:hanging="360"/>
-        </w:pPr>
-        <w:rPr>
-          <w:rFonts w:ascii="Arial" w:hAnsi="Arial" w:hint="default"/>
-          <w:b w:val="0"/>
-          <w:i w:val="0"/>
-          <w:caps w:val="0"/>
-          <w:strike w:val="0"/>
-          <w:dstrike w:val="0"/>
-          <w:vanish w:val="0"/>
-          <w:color w:val="2E3456" w:themeColor="text2"/>
-          <w:sz w:val="38"/>
-          <w:u w:val="none" w:color="2E3456" w:themeColor="text2"/>
-          <w:vertAlign w:val="baseline"/>
-        </w:rPr>
-      </w:lvl>
-    </w:lvlOverride>
-    <w:lvlOverride w:ilvl="1">
-      <w:lvl w:ilvl="1">
-        <w:start w:val="1"/>
-        <w:numFmt w:val="lowerLetter"/>
-        <w:lvlText w:val="%2."/>
-        <w:lvlJc w:val="left"/>
-        <w:pPr>
-          <w:ind w:left="1080" w:hanging="360"/>
-        </w:pPr>
-      </w:lvl>
-    </w:lvlOverride>
-    <w:lvlOverride w:ilvl="2">
-      <w:lvl w:ilvl="2">
-        <w:start w:val="1"/>
-        <w:numFmt w:val="lowerRoman"/>
-        <w:lvlText w:val="%3."/>
-        <w:lvlJc w:val="right"/>
-        <w:pPr>
-          <w:ind w:left="1800" w:hanging="180"/>
-        </w:pPr>
-      </w:lvl>
-    </w:lvlOverride>
-    <w:lvlOverride w:ilvl="3">
-      <w:lvl w:ilvl="3" w:tentative="1">
-        <w:start w:val="1"/>
-        <w:numFmt w:val="decimal"/>
-        <w:lvlText w:val="%4."/>
-        <w:lvlJc w:val="left"/>
-        <w:pPr>
-          <w:ind w:left="2520" w:hanging="360"/>
-        </w:pPr>
-      </w:lvl>
-    </w:lvlOverride>
-    <w:lvlOverride w:ilvl="4">
-      <w:lvl w:ilvl="4" w:tentative="1">
-        <w:start w:val="1"/>
-        <w:numFmt w:val="lowerLetter"/>
-        <w:lvlText w:val="%5."/>
-        <w:lvlJc w:val="left"/>
-        <w:pPr>
-          <w:ind w:left="3240" w:hanging="360"/>
-        </w:pPr>
-      </w:lvl>
-    </w:lvlOverride>
-    <w:lvlOverride w:ilvl="5">
-      <w:lvl w:ilvl="5" w:tentative="1">
-        <w:start w:val="1"/>
-        <w:numFmt w:val="lowerRoman"/>
-        <w:lvlText w:val="%6."/>
-        <w:lvlJc w:val="right"/>
-        <w:pPr>
-          <w:ind w:left="3960" w:hanging="180"/>
-        </w:pPr>
-      </w:lvl>
-    </w:lvlOverride>
-    <w:lvlOverride w:ilvl="6">
-      <w:lvl w:ilvl="6" w:tentative="1">
-        <w:start w:val="1"/>
-        <w:numFmt w:val="decimal"/>
-        <w:lvlText w:val="%7."/>
-        <w:lvlJc w:val="left"/>
-        <w:pPr>
-          <w:ind w:left="4680" w:hanging="360"/>
-        </w:pPr>
-      </w:lvl>
-    </w:lvlOverride>
-    <w:lvlOverride w:ilvl="7">
-      <w:lvl w:ilvl="7" w:tentative="1">
-        <w:start w:val="1"/>
-        <w:numFmt w:val="lowerLetter"/>
-        <w:lvlText w:val="%8."/>
-        <w:lvlJc w:val="left"/>
-        <w:pPr>
-          <w:ind w:left="5400" w:hanging="360"/>
-        </w:pPr>
-      </w:lvl>
-    </w:lvlOverride>
-    <w:lvlOverride w:ilvl="8">
-      <w:lvl w:ilvl="8" w:tentative="1">
-        <w:start w:val="1"/>
-        <w:numFmt w:val="lowerRoman"/>
-        <w:lvlText w:val="%9."/>
-        <w:lvlJc w:val="right"/>
-        <w:pPr>
-          <w:ind w:left="6120" w:hanging="180"/>
-        </w:pPr>
-      </w:lvl>
-    </w:lvlOverride>
-  </w:num>
-  <w:num w:numId="8" w16cid:durableId="1848791982">
-    <w:abstractNumId w:val="11"/>
-  </w:num>
-  <w:num w:numId="9" w16cid:durableId="230628619">
-    <w:abstractNumId w:val="33"/>
-  </w:num>
-  <w:num w:numId="10" w16cid:durableId="1369722204">
-    <w:abstractNumId w:val="32"/>
-  </w:num>
-  <w:num w:numId="11" w16cid:durableId="1260866734">
-    <w:abstractNumId w:val="29"/>
-  </w:num>
-  <w:num w:numId="12" w16cid:durableId="386078158">
-    <w:abstractNumId w:val="9"/>
-  </w:num>
-  <w:num w:numId="13" w16cid:durableId="2038893822">
-    <w:abstractNumId w:val="7"/>
-  </w:num>
-  <w:num w:numId="14" w16cid:durableId="1915895731">
-    <w:abstractNumId w:val="6"/>
-  </w:num>
-  <w:num w:numId="15" w16cid:durableId="1866602895">
-    <w:abstractNumId w:val="5"/>
-  </w:num>
-  <w:num w:numId="16" w16cid:durableId="706875124">
-    <w:abstractNumId w:val="4"/>
-  </w:num>
-  <w:num w:numId="17" w16cid:durableId="1531143557">
-    <w:abstractNumId w:val="8"/>
-  </w:num>
-  <w:num w:numId="18" w16cid:durableId="7222945">
-    <w:abstractNumId w:val="3"/>
-  </w:num>
-  <w:num w:numId="19" w16cid:durableId="1410883115">
-    <w:abstractNumId w:val="2"/>
-  </w:num>
-  <w:num w:numId="20" w16cid:durableId="349769546">
-    <w:abstractNumId w:val="1"/>
-  </w:num>
-  <w:num w:numId="21" w16cid:durableId="1528451148">
-    <w:abstractNumId w:val="0"/>
-  </w:num>
-  <w:num w:numId="22" w16cid:durableId="235823893">
-    <w:abstractNumId w:val="31"/>
-  </w:num>
-  <w:num w:numId="23" w16cid:durableId="1019312708">
-    <w:abstractNumId w:val="34"/>
-  </w:num>
-  <w:num w:numId="24" w16cid:durableId="711271748">
-    <w:abstractNumId w:val="22"/>
-  </w:num>
-  <w:num w:numId="25" w16cid:durableId="1733038027">
-    <w:abstractNumId w:val="20"/>
-  </w:num>
-  <w:num w:numId="26" w16cid:durableId="890732283">
-    <w:abstractNumId w:val="14"/>
-  </w:num>
-  <w:num w:numId="27" w16cid:durableId="423502431">
-    <w:abstractNumId w:val="14"/>
-  </w:num>
-  <w:num w:numId="28" w16cid:durableId="1510293055">
-    <w:abstractNumId w:val="23"/>
-  </w:num>
-  <w:num w:numId="29" w16cid:durableId="812411078">
-    <w:abstractNumId w:val="23"/>
-    <w:lvlOverride w:ilvl="0">
-      <w:startOverride w:val="1"/>
-    </w:lvlOverride>
-  </w:num>
-  <w:num w:numId="30" w16cid:durableId="236743032">
-    <w:abstractNumId w:val="18"/>
-  </w:num>
-  <w:num w:numId="31" w16cid:durableId="1458377931">
-    <w:abstractNumId w:val="18"/>
-    <w:lvlOverride w:ilvl="0">
-      <w:lvl w:ilvl="0">
-        <w:start w:val="1"/>
-        <w:numFmt w:val="decimal"/>
-        <w:lvlText w:val="%1.0"/>
-        <w:lvlJc w:val="left"/>
-        <w:pPr>
-          <w:ind w:left="360" w:hanging="360"/>
-        </w:pPr>
-        <w:rPr>
-          <w:rFonts w:ascii="Arial" w:hAnsi="Arial" w:hint="default"/>
-          <w:b w:val="0"/>
-          <w:i w:val="0"/>
-          <w:caps w:val="0"/>
-          <w:strike w:val="0"/>
-          <w:dstrike w:val="0"/>
-          <w:vanish w:val="0"/>
-          <w:color w:val="2E3456" w:themeColor="text2"/>
-          <w:sz w:val="36"/>
-          <w:u w:val="none" w:color="2E3456" w:themeColor="text2"/>
-          <w:vertAlign w:val="baseline"/>
-        </w:rPr>
-      </w:lvl>
-    </w:lvlOverride>
-  </w:num>
-  <w:num w:numId="32" w16cid:durableId="791443339">
-    <w:abstractNumId w:val="17"/>
-  </w:num>
-  <w:num w:numId="33" w16cid:durableId="1471168446">
-    <w:abstractNumId w:val="24"/>
-  </w:num>
-  <w:num w:numId="34" w16cid:durableId="2125685448">
-    <w:abstractNumId w:val="21"/>
+  <w:num w:numId="20" w16cid:durableId="2125685448">
+    <w:abstractNumId w:val="16"/>
     <w:lvlOverride w:ilvl="0">
       <w:lvl w:ilvl="0">
         <w:start w:val="1"/>
@@ -14447,101 +12711,23 @@
       </w:lvl>
     </w:lvlOverride>
   </w:num>
-  <w:num w:numId="35" w16cid:durableId="1237476049">
-    <w:abstractNumId w:val="21"/>
-    <w:lvlOverride w:ilvl="0">
-      <w:startOverride w:val="1"/>
-    </w:lvlOverride>
-    <w:lvlOverride w:ilvl="1">
-      <w:startOverride w:val="1"/>
-    </w:lvlOverride>
-    <w:lvlOverride w:ilvl="2">
-      <w:startOverride w:val="1"/>
-    </w:lvlOverride>
-    <w:lvlOverride w:ilvl="3">
-      <w:startOverride w:val="1"/>
-    </w:lvlOverride>
-    <w:lvlOverride w:ilvl="4">
-      <w:startOverride w:val="1"/>
-    </w:lvlOverride>
-    <w:lvlOverride w:ilvl="5">
-      <w:startOverride w:val="1"/>
-    </w:lvlOverride>
-    <w:lvlOverride w:ilvl="6">
-      <w:startOverride w:val="1"/>
-    </w:lvlOverride>
-    <w:lvlOverride w:ilvl="7">
-      <w:startOverride w:val="1"/>
-    </w:lvlOverride>
-    <w:lvlOverride w:ilvl="8">
-      <w:startOverride w:val="1"/>
-    </w:lvlOverride>
-  </w:num>
-  <w:num w:numId="36" w16cid:durableId="1689942509">
-    <w:abstractNumId w:val="28"/>
-  </w:num>
-  <w:num w:numId="37" w16cid:durableId="2087025021">
-    <w:abstractNumId w:val="22"/>
+  <w:num w:numId="21" w16cid:durableId="2087025021">
+    <w:abstractNumId w:val="17"/>
     <w:lvlOverride w:ilvl="0">
       <w:startOverride w:val="1"/>
     </w:lvlOverride>
   </w:num>
-  <w:num w:numId="38" w16cid:durableId="910772544">
-    <w:abstractNumId w:val="25"/>
+  <w:num w:numId="22" w16cid:durableId="463738980">
+    <w:abstractNumId w:val="16"/>
   </w:num>
-  <w:num w:numId="39" w16cid:durableId="810101863">
-    <w:abstractNumId w:val="26"/>
-  </w:num>
-  <w:num w:numId="40" w16cid:durableId="857743567">
-    <w:abstractNumId w:val="15"/>
-  </w:num>
-  <w:num w:numId="41" w16cid:durableId="463738980">
-    <w:abstractNumId w:val="21"/>
-  </w:num>
-  <w:num w:numId="42" w16cid:durableId="1321888949">
-    <w:abstractNumId w:val="22"/>
-    <w:lvlOverride w:ilvl="0">
-      <w:startOverride w:val="1"/>
-    </w:lvlOverride>
-  </w:num>
-  <w:num w:numId="43" w16cid:durableId="880048935">
-    <w:abstractNumId w:val="22"/>
-    <w:lvlOverride w:ilvl="0">
-      <w:startOverride w:val="1"/>
-    </w:lvlOverride>
-  </w:num>
-  <w:num w:numId="44" w16cid:durableId="1400206764">
+  <w:num w:numId="23" w16cid:durableId="1400206764">
     <w:abstractNumId w:val="13"/>
   </w:num>
-  <w:num w:numId="45" w16cid:durableId="1846434241">
+  <w:num w:numId="24" w16cid:durableId="1846434241">
     <w:abstractNumId w:val="12"/>
   </w:num>
-  <w:num w:numId="46" w16cid:durableId="1457990808">
+  <w:num w:numId="25" w16cid:durableId="1158034980">
     <w:abstractNumId w:val="16"/>
-  </w:num>
-  <w:num w:numId="47" w16cid:durableId="1571959373">
-    <w:abstractNumId w:val="22"/>
-    <w:lvlOverride w:ilvl="0">
-      <w:startOverride w:val="1"/>
-    </w:lvlOverride>
-  </w:num>
-  <w:num w:numId="48" w16cid:durableId="809909329">
-    <w:abstractNumId w:val="22"/>
-    <w:lvlOverride w:ilvl="0">
-      <w:startOverride w:val="1"/>
-    </w:lvlOverride>
-  </w:num>
-  <w:num w:numId="49" w16cid:durableId="1586381829">
-    <w:abstractNumId w:val="22"/>
-    <w:lvlOverride w:ilvl="0">
-      <w:startOverride w:val="1"/>
-    </w:lvlOverride>
-  </w:num>
-  <w:num w:numId="50" w16cid:durableId="818420679">
-    <w:abstractNumId w:val="30"/>
-  </w:num>
-  <w:num w:numId="51" w16cid:durableId="1158034980">
-    <w:abstractNumId w:val="21"/>
     <w:lvlOverride w:ilvl="0">
       <w:lvl w:ilvl="0">
         <w:start w:val="1"/>
@@ -14696,11 +12882,8 @@
       </w:lvl>
     </w:lvlOverride>
   </w:num>
-  <w:num w:numId="52" w16cid:durableId="950166045">
-    <w:abstractNumId w:val="19"/>
-  </w:num>
-  <w:num w:numId="53" w16cid:durableId="845680412">
-    <w:abstractNumId w:val="21"/>
+  <w:num w:numId="26" w16cid:durableId="845680412">
+    <w:abstractNumId w:val="16"/>
     <w:lvlOverride w:ilvl="0">
       <w:lvl w:ilvl="0">
         <w:start w:val="1"/>
@@ -14855,12 +13038,12 @@
       </w:lvl>
     </w:lvlOverride>
   </w:num>
-  <w:numIdMacAtCleanup w:val="22"/>
+  <w:numIdMacAtCleanup w:val="26"/>
 </w:numbering>
 </file>
 
 <file path=word/styles.xml><?xml version="1.0" encoding="utf-8"?>
-<w:styles xmlns:mc="http://schemas.openxmlformats.org/markup-compatibility/2006" xmlns:r="http://schemas.openxmlformats.org/officeDocument/2006/relationships" xmlns:w="http://schemas.openxmlformats.org/wordprocessingml/2006/main" xmlns:w14="http://schemas.microsoft.com/office/word/2010/wordml" xmlns:w15="http://schemas.microsoft.com/office/word/2012/wordml" xmlns:w16cex="http://schemas.microsoft.com/office/word/2018/wordml/cex" xmlns:w16cid="http://schemas.microsoft.com/office/word/2016/wordml/cid" xmlns:w16="http://schemas.microsoft.com/office/word/2018/wordml" xmlns:w16du="http://schemas.microsoft.com/office/word/2023/wordml/word16du" xmlns:w16sdtdh="http://schemas.microsoft.com/office/word/2020/wordml/sdtdatahash" xmlns:w16se="http://schemas.microsoft.com/office/word/2015/wordml/symex" mc:Ignorable="w14 w15 w16se w16cid w16 w16cex w16sdtdh w16du">
+<w:styles xmlns:mc="http://schemas.openxmlformats.org/markup-compatibility/2006" xmlns:r="http://schemas.openxmlformats.org/officeDocument/2006/relationships" xmlns:w="http://schemas.openxmlformats.org/wordprocessingml/2006/main" xmlns:w14="http://schemas.microsoft.com/office/word/2010/wordml" xmlns:w15="http://schemas.microsoft.com/office/word/2012/wordml" xmlns:w16cex="http://schemas.microsoft.com/office/word/2018/wordml/cex" xmlns:w16cid="http://schemas.microsoft.com/office/word/2016/wordml/cid" xmlns:w16="http://schemas.microsoft.com/office/word/2018/wordml" xmlns:w16du="http://schemas.microsoft.com/office/word/2023/wordml/word16du" xmlns:w16sdtdh="http://schemas.microsoft.com/office/word/2020/wordml/sdtdatahash" xmlns:w16sdtfl="http://schemas.microsoft.com/office/word/2024/wordml/sdtformatlock" xmlns:w16se="http://schemas.microsoft.com/office/word/2015/wordml/symex" mc:Ignorable="w14 w15 w16se w16cid w16 w16cex w16sdtdh w16sdtfl w16du">
   <w:docDefaults>
     <w:rPrDefault>
       <w:rPr>
@@ -15598,7 +13781,7 @@
     <w:rsid w:val="00301D86"/>
     <w:pPr>
       <w:numPr>
-        <w:numId w:val="5"/>
+        <w:numId w:val="3"/>
       </w:numPr>
     </w:pPr>
     <w:rPr>
@@ -15625,7 +13808,7 @@
       <w:pageBreakBefore/>
       <w:framePr w:w="9123" w:wrap="around"/>
       <w:numPr>
-        <w:numId w:val="34"/>
+        <w:numId w:val="20"/>
       </w:numPr>
       <w:outlineLvl w:val="0"/>
     </w:pPr>
@@ -15644,7 +13827,7 @@
     <w:pPr>
       <w:numPr>
         <w:ilvl w:val="1"/>
-        <w:numId w:val="34"/>
+        <w:numId w:val="20"/>
       </w:numPr>
       <w:spacing w:before="360" w:after="120"/>
       <w:ind w:left="734" w:hanging="734"/>
@@ -15666,7 +13849,7 @@
     <w:pPr>
       <w:numPr>
         <w:ilvl w:val="2"/>
-        <w:numId w:val="34"/>
+        <w:numId w:val="20"/>
       </w:numPr>
       <w:spacing w:before="240" w:after="120"/>
       <w:ind w:left="0" w:firstLine="0"/>
@@ -15698,7 +13881,7 @@
     <w:rsid w:val="00CF53D7"/>
     <w:pPr>
       <w:numPr>
-        <w:numId w:val="3"/>
+        <w:numId w:val="1"/>
       </w:numPr>
     </w:pPr>
   </w:style>
@@ -16064,7 +14247,7 @@
     <w:rsid w:val="00CF53D7"/>
     <w:pPr>
       <w:numPr>
-        <w:numId w:val="9"/>
+        <w:numId w:val="4"/>
       </w:numPr>
     </w:pPr>
   </w:style>
@@ -16077,7 +14260,7 @@
     <w:rsid w:val="00CF53D7"/>
     <w:pPr>
       <w:numPr>
-        <w:numId w:val="10"/>
+        <w:numId w:val="5"/>
       </w:numPr>
     </w:pPr>
   </w:style>
@@ -16195,7 +14378,7 @@
     <w:rsid w:val="00CF53D7"/>
     <w:pPr>
       <w:numPr>
-        <w:numId w:val="11"/>
+        <w:numId w:val="6"/>
       </w:numPr>
     </w:pPr>
   </w:style>
@@ -21871,13 +20054,138 @@
     <w:rsid w:val="00CF53D7"/>
     <w:pPr>
       <w:numPr>
+        <w:numId w:val="7"/>
+      </w:numPr>
+      <w:contextualSpacing/>
+    </w:pPr>
+  </w:style>
+  <w:style w:type="paragraph" w:styleId="ListBullet2">
+    <w:name w:val="List Bullet 2"/>
+    <w:basedOn w:val="Normal"/>
+    <w:uiPriority w:val="99"/>
+    <w:semiHidden/>
+    <w:rsid w:val="00CF53D7"/>
+    <w:pPr>
+      <w:numPr>
+        <w:numId w:val="8"/>
+      </w:numPr>
+      <w:contextualSpacing/>
+    </w:pPr>
+  </w:style>
+  <w:style w:type="paragraph" w:styleId="ListBullet3">
+    <w:name w:val="List Bullet 3"/>
+    <w:basedOn w:val="Normal"/>
+    <w:uiPriority w:val="99"/>
+    <w:semiHidden/>
+    <w:rsid w:val="00CF53D7"/>
+    <w:pPr>
+      <w:numPr>
+        <w:numId w:val="9"/>
+      </w:numPr>
+      <w:contextualSpacing/>
+    </w:pPr>
+  </w:style>
+  <w:style w:type="paragraph" w:styleId="ListBullet4">
+    <w:name w:val="List Bullet 4"/>
+    <w:basedOn w:val="Normal"/>
+    <w:uiPriority w:val="99"/>
+    <w:semiHidden/>
+    <w:rsid w:val="00CF53D7"/>
+    <w:pPr>
+      <w:numPr>
+        <w:numId w:val="10"/>
+      </w:numPr>
+      <w:contextualSpacing/>
+    </w:pPr>
+  </w:style>
+  <w:style w:type="paragraph" w:styleId="ListBullet5">
+    <w:name w:val="List Bullet 5"/>
+    <w:basedOn w:val="Normal"/>
+    <w:uiPriority w:val="99"/>
+    <w:semiHidden/>
+    <w:rsid w:val="00CF53D7"/>
+    <w:pPr>
+      <w:numPr>
+        <w:numId w:val="11"/>
+      </w:numPr>
+      <w:contextualSpacing/>
+    </w:pPr>
+  </w:style>
+  <w:style w:type="paragraph" w:styleId="ListContinue">
+    <w:name w:val="List Continue"/>
+    <w:basedOn w:val="Normal"/>
+    <w:uiPriority w:val="99"/>
+    <w:semiHidden/>
+    <w:rsid w:val="00CF53D7"/>
+    <w:pPr>
+      <w:spacing w:after="120"/>
+      <w:ind w:left="283"/>
+      <w:contextualSpacing/>
+    </w:pPr>
+  </w:style>
+  <w:style w:type="paragraph" w:styleId="ListContinue2">
+    <w:name w:val="List Continue 2"/>
+    <w:basedOn w:val="Normal"/>
+    <w:uiPriority w:val="99"/>
+    <w:semiHidden/>
+    <w:rsid w:val="00CF53D7"/>
+    <w:pPr>
+      <w:spacing w:after="120"/>
+      <w:ind w:left="566"/>
+      <w:contextualSpacing/>
+    </w:pPr>
+  </w:style>
+  <w:style w:type="paragraph" w:styleId="ListContinue3">
+    <w:name w:val="List Continue 3"/>
+    <w:basedOn w:val="Normal"/>
+    <w:uiPriority w:val="99"/>
+    <w:semiHidden/>
+    <w:rsid w:val="00CF53D7"/>
+    <w:pPr>
+      <w:spacing w:after="120"/>
+      <w:ind w:left="849"/>
+      <w:contextualSpacing/>
+    </w:pPr>
+  </w:style>
+  <w:style w:type="paragraph" w:styleId="ListContinue4">
+    <w:name w:val="List Continue 4"/>
+    <w:basedOn w:val="Normal"/>
+    <w:uiPriority w:val="99"/>
+    <w:semiHidden/>
+    <w:rsid w:val="00CF53D7"/>
+    <w:pPr>
+      <w:spacing w:after="120"/>
+      <w:ind w:left="1132"/>
+      <w:contextualSpacing/>
+    </w:pPr>
+  </w:style>
+  <w:style w:type="paragraph" w:styleId="ListContinue5">
+    <w:name w:val="List Continue 5"/>
+    <w:basedOn w:val="Normal"/>
+    <w:uiPriority w:val="99"/>
+    <w:semiHidden/>
+    <w:rsid w:val="00CF53D7"/>
+    <w:pPr>
+      <w:spacing w:after="120"/>
+      <w:ind w:left="1415"/>
+      <w:contextualSpacing/>
+    </w:pPr>
+  </w:style>
+  <w:style w:type="paragraph" w:styleId="ListNumber">
+    <w:name w:val="List Number"/>
+    <w:basedOn w:val="Normal"/>
+    <w:uiPriority w:val="99"/>
+    <w:semiHidden/>
+    <w:rsid w:val="00CF53D7"/>
+    <w:pPr>
+      <w:numPr>
         <w:numId w:val="12"/>
       </w:numPr>
       <w:contextualSpacing/>
     </w:pPr>
   </w:style>
-  <w:style w:type="paragraph" w:styleId="ListBullet2">
-    <w:name w:val="List Bullet 2"/>
+  <w:style w:type="paragraph" w:styleId="ListNumber2">
+    <w:name w:val="List Number 2"/>
     <w:basedOn w:val="Normal"/>
     <w:uiPriority w:val="99"/>
     <w:semiHidden/>
@@ -21889,8 +20197,8 @@
       <w:contextualSpacing/>
     </w:pPr>
   </w:style>
-  <w:style w:type="paragraph" w:styleId="ListBullet3">
-    <w:name w:val="List Bullet 3"/>
+  <w:style w:type="paragraph" w:styleId="ListNumber3">
+    <w:name w:val="List Number 3"/>
     <w:basedOn w:val="Normal"/>
     <w:uiPriority w:val="99"/>
     <w:semiHidden/>
@@ -21902,8 +20210,8 @@
       <w:contextualSpacing/>
     </w:pPr>
   </w:style>
-  <w:style w:type="paragraph" w:styleId="ListBullet4">
-    <w:name w:val="List Bullet 4"/>
+  <w:style w:type="paragraph" w:styleId="ListNumber4">
+    <w:name w:val="List Number 4"/>
     <w:basedOn w:val="Normal"/>
     <w:uiPriority w:val="99"/>
     <w:semiHidden/>
@@ -21915,8 +20223,8 @@
       <w:contextualSpacing/>
     </w:pPr>
   </w:style>
-  <w:style w:type="paragraph" w:styleId="ListBullet5">
-    <w:name w:val="List Bullet 5"/>
+  <w:style w:type="paragraph" w:styleId="ListNumber5">
+    <w:name w:val="List Number 5"/>
     <w:basedOn w:val="Normal"/>
     <w:uiPriority w:val="99"/>
     <w:semiHidden/>
@@ -21924,131 +20232,6 @@
     <w:pPr>
       <w:numPr>
         <w:numId w:val="16"/>
-      </w:numPr>
-      <w:contextualSpacing/>
-    </w:pPr>
-  </w:style>
-  <w:style w:type="paragraph" w:styleId="ListContinue">
-    <w:name w:val="List Continue"/>
-    <w:basedOn w:val="Normal"/>
-    <w:uiPriority w:val="99"/>
-    <w:semiHidden/>
-    <w:rsid w:val="00CF53D7"/>
-    <w:pPr>
-      <w:spacing w:after="120"/>
-      <w:ind w:left="283"/>
-      <w:contextualSpacing/>
-    </w:pPr>
-  </w:style>
-  <w:style w:type="paragraph" w:styleId="ListContinue2">
-    <w:name w:val="List Continue 2"/>
-    <w:basedOn w:val="Normal"/>
-    <w:uiPriority w:val="99"/>
-    <w:semiHidden/>
-    <w:rsid w:val="00CF53D7"/>
-    <w:pPr>
-      <w:spacing w:after="120"/>
-      <w:ind w:left="566"/>
-      <w:contextualSpacing/>
-    </w:pPr>
-  </w:style>
-  <w:style w:type="paragraph" w:styleId="ListContinue3">
-    <w:name w:val="List Continue 3"/>
-    <w:basedOn w:val="Normal"/>
-    <w:uiPriority w:val="99"/>
-    <w:semiHidden/>
-    <w:rsid w:val="00CF53D7"/>
-    <w:pPr>
-      <w:spacing w:after="120"/>
-      <w:ind w:left="849"/>
-      <w:contextualSpacing/>
-    </w:pPr>
-  </w:style>
-  <w:style w:type="paragraph" w:styleId="ListContinue4">
-    <w:name w:val="List Continue 4"/>
-    <w:basedOn w:val="Normal"/>
-    <w:uiPriority w:val="99"/>
-    <w:semiHidden/>
-    <w:rsid w:val="00CF53D7"/>
-    <w:pPr>
-      <w:spacing w:after="120"/>
-      <w:ind w:left="1132"/>
-      <w:contextualSpacing/>
-    </w:pPr>
-  </w:style>
-  <w:style w:type="paragraph" w:styleId="ListContinue5">
-    <w:name w:val="List Continue 5"/>
-    <w:basedOn w:val="Normal"/>
-    <w:uiPriority w:val="99"/>
-    <w:semiHidden/>
-    <w:rsid w:val="00CF53D7"/>
-    <w:pPr>
-      <w:spacing w:after="120"/>
-      <w:ind w:left="1415"/>
-      <w:contextualSpacing/>
-    </w:pPr>
-  </w:style>
-  <w:style w:type="paragraph" w:styleId="ListNumber">
-    <w:name w:val="List Number"/>
-    <w:basedOn w:val="Normal"/>
-    <w:uiPriority w:val="99"/>
-    <w:semiHidden/>
-    <w:rsid w:val="00CF53D7"/>
-    <w:pPr>
-      <w:numPr>
-        <w:numId w:val="17"/>
-      </w:numPr>
-      <w:contextualSpacing/>
-    </w:pPr>
-  </w:style>
-  <w:style w:type="paragraph" w:styleId="ListNumber2">
-    <w:name w:val="List Number 2"/>
-    <w:basedOn w:val="Normal"/>
-    <w:uiPriority w:val="99"/>
-    <w:semiHidden/>
-    <w:rsid w:val="00CF53D7"/>
-    <w:pPr>
-      <w:numPr>
-        <w:numId w:val="18"/>
-      </w:numPr>
-      <w:contextualSpacing/>
-    </w:pPr>
-  </w:style>
-  <w:style w:type="paragraph" w:styleId="ListNumber3">
-    <w:name w:val="List Number 3"/>
-    <w:basedOn w:val="Normal"/>
-    <w:uiPriority w:val="99"/>
-    <w:semiHidden/>
-    <w:rsid w:val="00CF53D7"/>
-    <w:pPr>
-      <w:numPr>
-        <w:numId w:val="19"/>
-      </w:numPr>
-      <w:contextualSpacing/>
-    </w:pPr>
-  </w:style>
-  <w:style w:type="paragraph" w:styleId="ListNumber4">
-    <w:name w:val="List Number 4"/>
-    <w:basedOn w:val="Normal"/>
-    <w:uiPriority w:val="99"/>
-    <w:semiHidden/>
-    <w:rsid w:val="00CF53D7"/>
-    <w:pPr>
-      <w:numPr>
-        <w:numId w:val="20"/>
-      </w:numPr>
-      <w:contextualSpacing/>
-    </w:pPr>
-  </w:style>
-  <w:style w:type="paragraph" w:styleId="ListNumber5">
-    <w:name w:val="List Number 5"/>
-    <w:basedOn w:val="Normal"/>
-    <w:uiPriority w:val="99"/>
-    <w:semiHidden/>
-    <w:rsid w:val="00CF53D7"/>
-    <w:pPr>
-      <w:numPr>
-        <w:numId w:val="21"/>
       </w:numPr>
       <w:contextualSpacing/>
     </w:pPr>
@@ -30865,7 +29048,7 @@
     <w:rsid w:val="00B62C81"/>
     <w:pPr>
       <w:numPr>
-        <w:numId w:val="4"/>
+        <w:numId w:val="2"/>
       </w:numPr>
     </w:pPr>
   </w:style>
@@ -30896,7 +29079,7 @@
     <w:rsid w:val="00301D86"/>
     <w:pPr>
       <w:numPr>
-        <w:numId w:val="24"/>
+        <w:numId w:val="17"/>
       </w:numPr>
     </w:pPr>
     <w:rPr>
@@ -30913,7 +29096,7 @@
     <w:pPr>
       <w:numPr>
         <w:ilvl w:val="1"/>
-        <w:numId w:val="25"/>
+        <w:numId w:val="18"/>
       </w:numPr>
       <w:spacing w:before="120" w:after="120" w:line="240" w:lineRule="auto"/>
       <w:ind w:left="850" w:hanging="425"/>
@@ -30936,7 +29119,7 @@
     <w:pPr>
       <w:numPr>
         <w:ilvl w:val="2"/>
-        <w:numId w:val="25"/>
+        <w:numId w:val="18"/>
       </w:numPr>
       <w:spacing w:before="120" w:after="120" w:line="240" w:lineRule="auto"/>
       <w:ind w:left="1503" w:hanging="652"/>
@@ -30956,7 +29139,7 @@
     <w:rsid w:val="004673D9"/>
     <w:pPr>
       <w:numPr>
-        <w:numId w:val="28"/>
+        <w:numId w:val="19"/>
       </w:numPr>
       <w:tabs>
         <w:tab w:val="left" w:pos="680"/>
@@ -31137,7 +29320,7 @@
     <w:rsid w:val="001F720B"/>
     <w:pPr>
       <w:numPr>
-        <w:numId w:val="41"/>
+        <w:numId w:val="22"/>
       </w:numPr>
     </w:pPr>
   </w:style>
@@ -31309,7 +29492,7 @@
     <w:rsid w:val="00046957"/>
     <w:pPr>
       <w:numPr>
-        <w:numId w:val="44"/>
+        <w:numId w:val="23"/>
       </w:numPr>
       <w:ind w:left="360"/>
     </w:pPr>
@@ -31320,7 +29503,7 @@
     <w:rsid w:val="00E47880"/>
     <w:pPr>
       <w:numPr>
-        <w:numId w:val="45"/>
+        <w:numId w:val="24"/>
       </w:numPr>
       <w:tabs>
         <w:tab w:val="left" w:pos="1080"/>
@@ -31394,9 +29577,6 @@
         <w:insideV w:val="single" w:sz="4" w:space="0" w:color="51534A"/>
       </w:tblBorders>
     </w:tblPr>
-    <w:tcPr>
-      <w:shd w:val="clear" w:color="auto" w:fill="auto"/>
-    </w:tcPr>
     <w:tblStylePr w:type="firstRow">
       <w:rPr>
         <w:rFonts w:asciiTheme="minorHAnsi" w:hAnsiTheme="minorHAnsi"/>

</xml_diff>